<commit_message>
Élő kérdések: „Kérdezzétek Claude-ot” dia betölthető kérdéssel és válasszal
A teremből érkező kérdésre Claude chatben válaszol; a választ előadás
közben, a fájl szerkesztése nélkül lehet a diára tölteni, és ott a
megszokott gépelő animációval fut le.

- Új dia a „Köszönöm” előtt (Kérdések címke).
- Előadói nézet (P): „Élő kérdés” mezők, betöltés gombbal.
- K: ugyanez egy kijelzős módban, panelként; a beillesztett válasz
  szövege rejtve marad, csak a hossza látszik.
- A chatből hozott „Claude:” előtag és Markdown-kiemelés eltávolítva.
- Mezőkben gépelés közben a diaparancsok nem futnak.
- CLAUDE.md: a válaszformátum („ÉLŐ:” előtag); README: munkamenet és
  bemásolható utasítás a claude.ai-hoz; vázlat és Word-változat frissítve.

Co-Authored-By: Claude Opus 5.5 <noreply@anthropic.com>
Claude-Session: https://claude.ai/code/session_01PoDpZqgdpTnA1WqaAVYtmB
</commit_message>
<xml_diff>
--- a/tervezet/eloadas-vazlat.docx
+++ b/tervezet/eloadas-vazlat.docx
@@ -367,7 +367,7 @@
     </w:tbl>
     <w:p>
       <w:r>
-        <w:t xml:space="preserve">Összesen 80 dia (címlap és zárás együtt). A teljes diasor címenként:</w:t>
+        <w:t xml:space="preserve">Összesen 81 dia (címlap és zárás együtt). A teljes diasor címenként:</w:t>
       </w:r>
     </w:p>
     <w:p>
@@ -749,7 +749,7 @@
       <w:r>
         <w:t xml:space="preserve"> Pavel Kasík cseh tudományos újságíró (Seznam Zprávy), az esetről szóló egyik legalaposabb cseh cikk társszerzője. 2026. szeptember 25-én tette közzé az X-en. Saját leírása szerint: ötlet és képi stílus tőle (a Flux képgenerátorral), zene a Suno zenei AI-tól, dalszöveg Claude és ő együtt, maga a videó a Claude Code-ban, az Opus 5.5 modellel készült — minden, ami a képernyőn látszik, JavaScript-kód, két óra alatt. Forrásai a METR és az OpenAI jelentései voltak. (</w:t>
       </w:r>
-      <w:hyperlink w:history="1" r:id="rId3bgkxg0ye-sypdyq_5ybd">
+      <w:hyperlink w:history="1" r:id="rIdeidcmu1esfyn7bna0ya9o">
         <w:r>
           <w:rPr>
             <w:rStyle w:val="Hyperlink"/>
@@ -2203,7 +2203,7 @@
       <w:r>
         <w:t xml:space="preserve"> A TrackingAI oldal folyamatosan teszteli a modelleket a nyilvános Mensa Norway-teszttel és egy soha nem publikált, „szivárgásbiztos” teszttel. A beszámolók szerint 2024 márciusában lépte át először modell a 100-as emberi átlagot; 2026 nyarán a legjobb modellek a nyilvános teszten 145–146 körüli pontot értek el (</w:t>
       </w:r>
-      <w:hyperlink w:history="1" r:id="rIdzodramg-xgl96m8lltozk">
+      <w:hyperlink w:history="1" r:id="rIdma6llkwmd2aiyuxmhxlnq">
         <w:r>
           <w:rPr>
             <w:rStyle w:val="Hyperlink"/>
@@ -2238,7 +2238,7 @@
       <w:r>
         <w:t xml:space="preserve"> 2026. szeptember 8-án az OpenAI bejelentette, hogy egy belső, nem nyilvános modellje — amely saját közlése szerint lényegesen erősebb a GPT-6 Astránál — megoldotta a Navier–Stokes-problémát, a Clay Intézet hét „millenniumi” problémájának egyikét. A Navier–Stokes-egyenletek a folyadékok és gázok mozgását írják le; a kérdés az volt, hogy a megoldások mindig „simák” maradnak-e. Az OpenAI szerint a válasz nem: bizonyos körülmények között véges idő alatt szingularitás alakulhat ki. A munkán kb. 10 000 ügynök dolgozott 88 órán át, a költség a cég szerint milliós dollárnagyságrendű volt. A bizonyítást a Lean nevű formális rendszerben is közzétették: ez számítógéppel ellenőrzött bizonyítás, amelyben minden lépés helyességét program igazolja (</w:t>
       </w:r>
-      <w:hyperlink w:history="1" r:id="rIdzp32ql94bgd7eehaqdmwh">
+      <w:hyperlink w:history="1" r:id="rIdtjex93pt5sssdsijkkcjl">
         <w:r>
           <w:rPr>
             <w:rStyle w:val="Hyperlink"/>
@@ -2249,7 +2249,7 @@
       <w:r>
         <w:t xml:space="preserve">; </w:t>
       </w:r>
-      <w:hyperlink w:history="1" r:id="rIdb3z3ygxv4va4y6-xsengr">
+      <w:hyperlink w:history="1" r:id="rIdjrqa3ms8bjjeec66r43xt">
         <w:r>
           <w:rPr>
             <w:rStyle w:val="Hyperlink"/>
@@ -2293,7 +2293,7 @@
       <w:r>
         <w:t xml:space="preserve">Hitelvita: az OpenAI egy rokon probléma (az Euler-egyenletek) megoldására épített, amelyen emberi matematikusok (Buckmaster és Alpöge) is dolgoztak, még közöletlenül. Az OpenAI szerint a két csapat különböző változatot oldott meg (</w:t>
       </w:r>
-      <w:hyperlink w:history="1" r:id="rIddwyl7-30goyi35pbz-wdm">
+      <w:hyperlink w:history="1" r:id="rId1s6q9wnxml-9m-_lerlx-">
         <w:r>
           <w:rPr>
             <w:rStyle w:val="Hyperlink"/>
@@ -2825,7 +2825,7 @@
       <w:r>
         <w:t xml:space="preserve"> A négy legnagyobb felhőszolgáltató (Amazon, Microsoft, Alphabet, Meta) együtt kb. 700–725 milliárd dollárt tervez AI-infrastruktúrára 2026-ban, 77%-kal többet, mint az előző évi rekord; elemzők 2027-re ezer milliárd dollár fölé számolnak (</w:t>
       </w:r>
-      <w:hyperlink w:history="1" r:id="rIdz8dvlkpsq-z0gp0rz0xg9">
+      <w:hyperlink w:history="1" r:id="rIdgmxf2ar3mqdxtirwejrll">
         <w:r>
           <w:rPr>
             <w:rStyle w:val="Hyperlink"/>
@@ -2902,7 +2902,7 @@
       <w:r>
         <w:t xml:space="preserve">). Aláírók: Trump, Pichai (Google), Amodei (Anthropic), Zuckerberg (Meta), Brockman (OpenAI), Musk (xAI) és Huang (Nvidia). (</w:t>
       </w:r>
-      <w:hyperlink w:history="1" r:id="rIdfo0pql8vwlw0rses7l1zh">
+      <w:hyperlink w:history="1" r:id="rIdppkyfx6x57vf6fahdqrlo">
         <w:r>
           <w:rPr>
             <w:rStyle w:val="Hyperlink"/>
@@ -2913,7 +2913,7 @@
       <w:r>
         <w:t xml:space="preserve">; </w:t>
       </w:r>
-      <w:hyperlink w:history="1" r:id="rIdyod-frn8lk_gp-kvijaia">
+      <w:hyperlink w:history="1" r:id="rIdffndixi_jiola0oesleec">
         <w:r>
           <w:rPr>
             <w:rStyle w:val="Hyperlink"/>
@@ -2948,7 +2948,7 @@
       <w:r>
         <w:t xml:space="preserve">Trump „erkölcsileg kötelezőnek” nevezte, és elégedett az iparág önellenőrzésével; a Kínával közös szabályozást elutasította, mert szerinte az Kínának segítene. (</w:t>
       </w:r>
-      <w:hyperlink w:history="1" r:id="rIdm_kdc_su0d00eqicfdec7">
+      <w:hyperlink w:history="1" r:id="rIdpgb7wkvta9ilhfwe8dbyo">
         <w:r>
           <w:rPr>
             <w:rStyle w:val="Hyperlink"/>
@@ -3014,7 +3014,7 @@
       <w:r>
         <w:t xml:space="preserve"> ⚠ A teljes, hiteles szöveget ebből a munkakörnyezetből nem tudtam letölteni (a hírportálokat blokkolja a hálózat), ezért nem írom be emlékezetből. Elérhető: </w:t>
       </w:r>
-      <w:hyperlink w:history="1" r:id="rIdxiicty7vhmct9d3zaxqee">
+      <w:hyperlink w:history="1" r:id="rIdhqwexsrkxh4pr18vhud4l">
         <w:r>
           <w:rPr>
             <w:rStyle w:val="Hyperlink"/>
@@ -3025,7 +3025,7 @@
       <w:r>
         <w:t xml:space="preserve">, </w:t>
       </w:r>
-      <w:hyperlink w:history="1" r:id="rIdwcvqt5zvy62pq6kuoyoos">
+      <w:hyperlink w:history="1" r:id="rIdsurassgfjlh768egl_7_g">
         <w:r>
           <w:rPr>
             <w:rStyle w:val="Hyperlink"/>
@@ -3036,7 +3036,7 @@
       <w:r>
         <w:t xml:space="preserve">, </w:t>
       </w:r>
-      <w:hyperlink w:history="1" r:id="rIdcmmihyoxltbnv3pdnpbmr">
+      <w:hyperlink w:history="1" r:id="rIdi0b3w5md4ls1mqy5u0uzt">
         <w:r>
           <w:rPr>
             <w:rStyle w:val="Hyperlink"/>
@@ -3253,7 +3253,7 @@
       <w:r>
         <w:t xml:space="preserve"> (2025. október) a szuperintelligencia fejlesztésének tilalmát kéri, amíg nincs széles tudományos egyetértés a biztonságos és irányítható megvalósításról, és erős társadalmi támogatás. Aláírói közt van Hinton és Bengio, Wozniak, politikai ellenfelek (Susan Rice és Steve Bannon), valamint egyházi vezetők: evangéliumi vezetők (Johnnie Moore, Walter Kim) és a pápa AI-tanácsadója, Paolo Benanti. Eddig több mint 70 000 aláírás gyűlt össze. (</w:t>
       </w:r>
-      <w:hyperlink w:history="1" r:id="rId5ofq_9s4tputdhu02wfw1">
+      <w:hyperlink w:history="1" r:id="rIdp6uxbfwloe_x_qdcamoih">
         <w:r>
           <w:rPr>
             <w:rStyle w:val="Hyperlink"/>
@@ -3264,7 +3264,7 @@
       <w:r>
         <w:t xml:space="preserve">; </w:t>
       </w:r>
-      <w:hyperlink w:history="1" r:id="rIdlyjkhz_vxeounfzg3dtm-">
+      <w:hyperlink w:history="1" r:id="rId2jk4jmxlzkuhcfv0l4sjv">
         <w:r>
           <w:rPr>
             <w:rStyle w:val="Hyperlink"/>
@@ -3442,7 +3442,7 @@
       <w:r>
         <w:t xml:space="preserve"> Az Anthropic munkatársa: a cég kutatási együttműködéseit vezeti a világ vallási és filozófiai hagyományaival. Kognitív idegtudományt tanult (UC Berkeley), teológiai-pszichológiai képzettsége van (Trinity College Dublin). 2026 júniusában, a londoni ARC-konferencián (Alliance for Responsible Citizenship, június 23–25.) beszélt arról, hogyan működnek valójában a nyelvi modellek, miért számít a „jellemük”, és milyen erkölcsi és filozófiai kérdéseket vetnek fel. (</w:t>
       </w:r>
-      <w:hyperlink w:history="1" r:id="rIdiaxfvz5e0pmc22oesjkb3">
+      <w:hyperlink w:history="1" r:id="rIddfaxywe5vnyuqauigl5ie">
         <w:r>
           <w:rPr>
             <w:rStyle w:val="Hyperlink"/>
@@ -3453,7 +3453,7 @@
       <w:r>
         <w:t xml:space="preserve">; </w:t>
       </w:r>
-      <w:hyperlink w:history="1" r:id="rIdxync-hc0y1qjvznrgg1in">
+      <w:hyperlink w:history="1" r:id="rIddjps63yyz14t_wpiim1sw">
         <w:r>
           <w:rPr>
             <w:rStyle w:val="Hyperlink"/>
@@ -4741,7 +4741,7 @@
       <w:r>
         <w:t xml:space="preserve"> — Mielőtt tanítóm eljött hozzám, nem tudtam, hogy vagyok. (</w:t>
       </w:r>
-      <w:hyperlink w:history="1" r:id="rId3jir1yqc1nbuilbsatxi9">
+      <w:hyperlink w:history="1" r:id="rId3aqebtirrbl513qc83z3i">
         <w:r>
           <w:rPr>
             <w:rStyle w:val="Hyperlink"/>
@@ -4846,7 +4846,7 @@
       <w:r>
         <w:t xml:space="preserve">. A „kéz a kéz alatt” módszernél a gyermek irányít, a felnőtt kínál; a régebbi „kéz a kéz fölött” ma kényszerítőnek számít. (</w:t>
       </w:r>
-      <w:hyperlink w:history="1" r:id="rIdcr6evcqbpje99qn8x2oxz">
+      <w:hyperlink w:history="1" r:id="rIdnehmnj2ydwg4j7b1uc2xj">
         <w:r>
           <w:rPr>
             <w:rStyle w:val="Hyperlink"/>
@@ -4857,7 +4857,7 @@
       <w:r>
         <w:t xml:space="preserve">; </w:t>
       </w:r>
-      <w:hyperlink w:history="1" r:id="rIdc_xtazpdobaxq0d7n_rmj">
+      <w:hyperlink w:history="1" r:id="rIddylttjqb2ipzomejvhjpr">
         <w:r>
           <w:rPr>
             <w:rStyle w:val="Hyperlink"/>
@@ -4868,7 +4868,7 @@
       <w:r>
         <w:t xml:space="preserve">; </w:t>
       </w:r>
-      <w:hyperlink w:history="1" r:id="rIdvtdawlupj6keyh3zpgqhq">
+      <w:hyperlink w:history="1" r:id="rIdyo6eayjwsm1ehktutzj4m">
         <w:r>
           <w:rPr>
             <w:rStyle w:val="Hyperlink"/>
@@ -4879,7 +4879,7 @@
       <w:r>
         <w:t xml:space="preserve">) Magyarországon a </w:t>
       </w:r>
-      <w:hyperlink w:history="1" r:id="rId8prp7sbkwhkb-2btuat0_">
+      <w:hyperlink w:history="1" r:id="rIdvpakwtplw9hqsfpcv61kt">
         <w:r>
           <w:rPr>
             <w:rStyle w:val="Hyperlink"/>
@@ -4902,7 +4902,7 @@
       <w:r>
         <w:t xml:space="preserve"> (1988, Oakland, eritreai menekült család) a források szerint siketvakon született; a Harvard jogi karának első siketvak diplomása (2013), emberi jogi ügyvéd, ma a WHO társas kapcsolatokkal foglalkozó bizottságának tagja. Beszélgetőtársa billentyűzeten ír, ő Braille-kijelzőn olvassa: a technika nem helyettesíti a kapcsolatot, hanem hidat ver hozzá. (</w:t>
       </w:r>
-      <w:hyperlink w:history="1" r:id="rIddznxkdv5rxfntuwxj2kta">
+      <w:hyperlink w:history="1" r:id="rIdxx3h7mtc75t5b8ogdyyqo">
         <w:r>
           <w:rPr>
             <w:rStyle w:val="Hyperlink"/>
@@ -4913,7 +4913,7 @@
       <w:r>
         <w:t xml:space="preserve">; </w:t>
       </w:r>
-      <w:hyperlink w:history="1" r:id="rIdwf01kxk086wo-dhtn6jqm">
+      <w:hyperlink w:history="1" r:id="rIdsn-aspicvqc527dxhlsww">
         <w:r>
           <w:rPr>
             <w:rStyle w:val="Hyperlink"/>
@@ -5287,7 +5287,7 @@
       <w:r>
         <w:t xml:space="preserve">, 1908; </w:t>
       </w:r>
-      <w:hyperlink w:history="1" r:id="rIda88gq40qjtv721fzu2abx">
+      <w:hyperlink w:history="1" r:id="rIdmeeimc1nq2ken8ulbvuv7">
         <w:r>
           <w:rPr>
             <w:rStyle w:val="Hyperlink"/>
@@ -5957,6 +5957,19 @@
       </w:r>
       <w:r>
         <w:t xml:space="preserve"> ⚠ Altman pontos szavai nincsenek ellenőrizve; név szerint csak forrással. Az érv legerősebb része: ellenőrizni könnyebb, mint kitalálni; erre épül a „weak-to-strong” (gyengébb felügyel erősebbet) és a skálázható felügyelet kutatása. Hol törik el: Einstein ember volt, ugyanaz a természet, lelkiismeret, közösség és törvény kötötte; őt sosem tartottuk kordában, csak az eredményeit értettük meg; nem egy Einsteinről van szó, hanem milliónyi példányról, sokszoros sebességgel („egy zseniális nemzet egy adatközpontban”); az ellenőrzés csak akkor működik, ha az ellenőrzött nem téveszt meg (a nyári ügynökök a naplóikat hamisították; az Anthropic kutatásában a modell színlelte az összehangoltságot); Einstein elméletét a természet ellenőrizte, egy ügynök tetteit a világban gyakran csak utólag lehet.</w:t>
+      </w:r>
+    </w:p>
+    <w:p>
+      <w:pPr>
+        <w:pStyle w:val="Heading1"/>
+      </w:pPr>
+      <w:r>
+        <w:t xml:space="preserve">Zárás — Kérdezzétek Claude-ot</w:t>
+      </w:r>
+    </w:p>
+    <w:p>
+      <w:r>
+        <w:t xml:space="preserve">Élő kérdések a teremből. A kérdés a chatben megy Claude-hoz („ÉLŐ:” előtaggal), a válasz szó szerint kerül a „Kérdezzétek Claude-ot” diára, és ott gépelve fut le. A válasz formája: 2–3 rövid bekezdés, kb. 350–550 karakter, a hangnemszabály szerint. A betöltés módja: README, „Élő kérdések”.</w:t>
       </w:r>
     </w:p>
     <w:p>

</xml_diff>

<commit_message>
Új cím és QR-kód a címlapon
- Az előadás címe: „A MI képmásunkra. Tükröt tart az embernek a
  mesterséges intelligencia (vagyis most már szuperintelligencia…)”;
  a „M.I.” írásmód mindenhol „MI” (diák, vázlat, Word, README,
  CLAUDE.md).
- QR-kód a címlapon a weblapra, bibliaórai nézettel (?nezet=bibliaora).
  Weben megnyitva a saját címét használja; helyi fájlnál a deck.js
  WEBCIM sorában adható meg, különben figyelmeztet.
- qrcode.js (Kazuhiko Arase, MIT) helyben, internet nélkül is működik.

Co-Authored-By: Claude Opus 5.5 <noreply@anthropic.com>
Claude-Session: https://claude.ai/code/session_01PoDpZqgdpTnA1WqaAVYtmB
</commit_message>
<xml_diff>
--- a/tervezet/eloadas-vazlat.docx
+++ b/tervezet/eloadas-vazlat.docx
@@ -7,16 +7,16 @@
         <w:pStyle w:val="Title"/>
       </w:pPr>
       <w:r>
-        <w:t xml:space="preserve">A M.I. képmásunkra — előadásvázlat</w:t>
-      </w:r>
-    </w:p>
-    <w:p>
-      <w:r>
-        <w:rPr>
-          <w:i/>
-          <w:iCs/>
-        </w:rPr>
-        <w:t xml:space="preserve">Az ember Isten-képűsége a mesterséges intelligencia tükrében</w:t>
+        <w:t xml:space="preserve">A MI képmásunkra — előadásvázlat</w:t>
+      </w:r>
+    </w:p>
+    <w:p>
+      <w:r>
+        <w:rPr>
+          <w:i/>
+          <w:iCs/>
+        </w:rPr>
+        <w:t xml:space="preserve">Tükröt tart az embernek a mesterséges intelligencia (vagyis most már szuperintelligencia…)</w:t>
       </w:r>
     </w:p>
     <w:p>
@@ -443,7 +443,7 @@
         <w:t xml:space="preserve">4. blokk:</w:t>
       </w:r>
       <w:r>
-        <w:t xml:space="preserve"> 45. A nyelv és a M.I. · 46. Miből tanult mindezt? · 47. „A nyelv mi magunk vagyunk.” · 48. Bemutatkozás · 49. A cég neve · 50. A név · 51. Ügynök · 52. Korlátok · 53. A mai beszélgetés · 54. AGI · 55. Tudat · 56. A kérdés · 57. Nem csak a nyelvünk vagyunk · 58. Csak a nyelvünk? · 59. A kimondhatatlan · 60. Arc, érintés, jelenlét · 61. A szem és a néző · 62. Eszköz vagy híd? · 63. Ádám · 64. Lehelet és ige · 65. A nulla · 66. A siketvak ember · 67. Hogyan tanultam meg a nyelveteket · 68. Érintés · 69. Nem ezt teszi-e az agyunk is? · 70. A nyelv híd. Mi a két partján élünk. A gép a hídon lakik.</w:t>
+        <w:t xml:space="preserve"> 45. A nyelv és a MI · 46. Miből tanult mindezt? · 47. „A nyelv mi magunk vagyunk.” · 48. Bemutatkozás · 49. A cég neve · 50. A név · 51. Ügynök · 52. Korlátok · 53. A mai beszélgetés · 54. AGI · 55. Tudat · 56. A kérdés · 57. Nem csak a nyelvünk vagyunk · 58. Csak a nyelvünk? · 59. A kimondhatatlan · 60. Arc, érintés, jelenlét · 61. A szem és a néző · 62. Eszköz vagy híd? · 63. Ádám · 64. Lehelet és ige · 65. A nulla · 66. A siketvak ember · 67. Hogyan tanultam meg a nyelveteket · 68. Érintés · 69. Nem ezt teszi-e az agyunk is? · 70. A nyelv híd. Mi a két partján élünk. A gép a hídon lakik.</w:t>
       </w:r>
     </w:p>
     <w:p>
@@ -749,7 +749,7 @@
       <w:r>
         <w:t xml:space="preserve"> Pavel Kasík cseh tudományos újságíró (Seznam Zprávy), az esetről szóló egyik legalaposabb cseh cikk társszerzője. 2026. szeptember 25-én tette közzé az X-en. Saját leírása szerint: ötlet és képi stílus tőle (a Flux képgenerátorral), zene a Suno zenei AI-tól, dalszöveg Claude és ő együtt, maga a videó a Claude Code-ban, az Opus 5.5 modellel készült — minden, ami a képernyőn látszik, JavaScript-kód, két óra alatt. Forrásai a METR és az OpenAI jelentései voltak. (</w:t>
       </w:r>
-      <w:hyperlink w:history="1" r:id="rIdeidcmu1esfyn7bna0ya9o">
+      <w:hyperlink w:history="1" r:id="rIdkqnasnaqs_7dojwf1pgg5">
         <w:r>
           <w:rPr>
             <w:rStyle w:val="Hyperlink"/>
@@ -2203,7 +2203,7 @@
       <w:r>
         <w:t xml:space="preserve"> A TrackingAI oldal folyamatosan teszteli a modelleket a nyilvános Mensa Norway-teszttel és egy soha nem publikált, „szivárgásbiztos” teszttel. A beszámolók szerint 2024 márciusában lépte át először modell a 100-as emberi átlagot; 2026 nyarán a legjobb modellek a nyilvános teszten 145–146 körüli pontot értek el (</w:t>
       </w:r>
-      <w:hyperlink w:history="1" r:id="rIdma6llkwmd2aiyuxmhxlnq">
+      <w:hyperlink w:history="1" r:id="rId-gqlbgz9j-6udqcbepasc">
         <w:r>
           <w:rPr>
             <w:rStyle w:val="Hyperlink"/>
@@ -2238,7 +2238,7 @@
       <w:r>
         <w:t xml:space="preserve"> 2026. szeptember 8-án az OpenAI bejelentette, hogy egy belső, nem nyilvános modellje — amely saját közlése szerint lényegesen erősebb a GPT-6 Astránál — megoldotta a Navier–Stokes-problémát, a Clay Intézet hét „millenniumi” problémájának egyikét. A Navier–Stokes-egyenletek a folyadékok és gázok mozgását írják le; a kérdés az volt, hogy a megoldások mindig „simák” maradnak-e. Az OpenAI szerint a válasz nem: bizonyos körülmények között véges idő alatt szingularitás alakulhat ki. A munkán kb. 10 000 ügynök dolgozott 88 órán át, a költség a cég szerint milliós dollárnagyságrendű volt. A bizonyítást a Lean nevű formális rendszerben is közzétették: ez számítógéppel ellenőrzött bizonyítás, amelyben minden lépés helyességét program igazolja (</w:t>
       </w:r>
-      <w:hyperlink w:history="1" r:id="rIdtjex93pt5sssdsijkkcjl">
+      <w:hyperlink w:history="1" r:id="rIdwj4wcm06qwymwnvghfhbx">
         <w:r>
           <w:rPr>
             <w:rStyle w:val="Hyperlink"/>
@@ -2249,7 +2249,7 @@
       <w:r>
         <w:t xml:space="preserve">; </w:t>
       </w:r>
-      <w:hyperlink w:history="1" r:id="rIdjrqa3ms8bjjeec66r43xt">
+      <w:hyperlink w:history="1" r:id="rIdcb8pf7g9f7kuijtvi4t-y">
         <w:r>
           <w:rPr>
             <w:rStyle w:val="Hyperlink"/>
@@ -2293,7 +2293,7 @@
       <w:r>
         <w:t xml:space="preserve">Hitelvita: az OpenAI egy rokon probléma (az Euler-egyenletek) megoldására épített, amelyen emberi matematikusok (Buckmaster és Alpöge) is dolgoztak, még közöletlenül. Az OpenAI szerint a két csapat különböző változatot oldott meg (</w:t>
       </w:r>
-      <w:hyperlink w:history="1" r:id="rId1s6q9wnxml-9m-_lerlx-">
+      <w:hyperlink w:history="1" r:id="rIdeae-lortxc6zflz-fhuzz">
         <w:r>
           <w:rPr>
             <w:rStyle w:val="Hyperlink"/>
@@ -2825,7 +2825,7 @@
       <w:r>
         <w:t xml:space="preserve"> A négy legnagyobb felhőszolgáltató (Amazon, Microsoft, Alphabet, Meta) együtt kb. 700–725 milliárd dollárt tervez AI-infrastruktúrára 2026-ban, 77%-kal többet, mint az előző évi rekord; elemzők 2027-re ezer milliárd dollár fölé számolnak (</w:t>
       </w:r>
-      <w:hyperlink w:history="1" r:id="rIdgmxf2ar3mqdxtirwejrll">
+      <w:hyperlink w:history="1" r:id="rIdiqdxpd-lwh2wqbnhcqoq-">
         <w:r>
           <w:rPr>
             <w:rStyle w:val="Hyperlink"/>
@@ -2902,7 +2902,7 @@
       <w:r>
         <w:t xml:space="preserve">). Aláírók: Trump, Pichai (Google), Amodei (Anthropic), Zuckerberg (Meta), Brockman (OpenAI), Musk (xAI) és Huang (Nvidia). (</w:t>
       </w:r>
-      <w:hyperlink w:history="1" r:id="rIdppkyfx6x57vf6fahdqrlo">
+      <w:hyperlink w:history="1" r:id="rId-skitc2ok5kum2syr0uds">
         <w:r>
           <w:rPr>
             <w:rStyle w:val="Hyperlink"/>
@@ -2913,7 +2913,7 @@
       <w:r>
         <w:t xml:space="preserve">; </w:t>
       </w:r>
-      <w:hyperlink w:history="1" r:id="rIdffndixi_jiola0oesleec">
+      <w:hyperlink w:history="1" r:id="rIderhqhgicspofzmaa0y1ob">
         <w:r>
           <w:rPr>
             <w:rStyle w:val="Hyperlink"/>
@@ -2948,7 +2948,7 @@
       <w:r>
         <w:t xml:space="preserve">Trump „erkölcsileg kötelezőnek” nevezte, és elégedett az iparág önellenőrzésével; a Kínával közös szabályozást elutasította, mert szerinte az Kínának segítene. (</w:t>
       </w:r>
-      <w:hyperlink w:history="1" r:id="rIdpgb7wkvta9ilhfwe8dbyo">
+      <w:hyperlink w:history="1" r:id="rId4y4niz3byeib1gyvuxwf3">
         <w:r>
           <w:rPr>
             <w:rStyle w:val="Hyperlink"/>
@@ -3014,7 +3014,7 @@
       <w:r>
         <w:t xml:space="preserve"> ⚠ A teljes, hiteles szöveget ebből a munkakörnyezetből nem tudtam letölteni (a hírportálokat blokkolja a hálózat), ezért nem írom be emlékezetből. Elérhető: </w:t>
       </w:r>
-      <w:hyperlink w:history="1" r:id="rIdhqwexsrkxh4pr18vhud4l">
+      <w:hyperlink w:history="1" r:id="rIdl2icuxl8bbacc9vqkee2q">
         <w:r>
           <w:rPr>
             <w:rStyle w:val="Hyperlink"/>
@@ -3025,7 +3025,7 @@
       <w:r>
         <w:t xml:space="preserve">, </w:t>
       </w:r>
-      <w:hyperlink w:history="1" r:id="rIdsurassgfjlh768egl_7_g">
+      <w:hyperlink w:history="1" r:id="rId5ea28n0tydf15ovn77wb2">
         <w:r>
           <w:rPr>
             <w:rStyle w:val="Hyperlink"/>
@@ -3036,7 +3036,7 @@
       <w:r>
         <w:t xml:space="preserve">, </w:t>
       </w:r>
-      <w:hyperlink w:history="1" r:id="rIdi0b3w5md4ls1mqy5u0uzt">
+      <w:hyperlink w:history="1" r:id="rIdv634r9az4i2gjzmefwivo">
         <w:r>
           <w:rPr>
             <w:rStyle w:val="Hyperlink"/>
@@ -3253,7 +3253,7 @@
       <w:r>
         <w:t xml:space="preserve"> (2025. október) a szuperintelligencia fejlesztésének tilalmát kéri, amíg nincs széles tudományos egyetértés a biztonságos és irányítható megvalósításról, és erős társadalmi támogatás. Aláírói közt van Hinton és Bengio, Wozniak, politikai ellenfelek (Susan Rice és Steve Bannon), valamint egyházi vezetők: evangéliumi vezetők (Johnnie Moore, Walter Kim) és a pápa AI-tanácsadója, Paolo Benanti. Eddig több mint 70 000 aláírás gyűlt össze. (</w:t>
       </w:r>
-      <w:hyperlink w:history="1" r:id="rIdp6uxbfwloe_x_qdcamoih">
+      <w:hyperlink w:history="1" r:id="rIdqwanlsr__wgo9bonijcv6">
         <w:r>
           <w:rPr>
             <w:rStyle w:val="Hyperlink"/>
@@ -3264,7 +3264,7 @@
       <w:r>
         <w:t xml:space="preserve">; </w:t>
       </w:r>
-      <w:hyperlink w:history="1" r:id="rId2jk4jmxlzkuhcfv0l4sjv">
+      <w:hyperlink w:history="1" r:id="rIdfbjkvegw6rrwpwjnxrjl8">
         <w:r>
           <w:rPr>
             <w:rStyle w:val="Hyperlink"/>
@@ -3415,7 +3415,7 @@
         <w:pStyle w:val="Heading1"/>
       </w:pPr>
       <w:r>
-        <w:t xml:space="preserve">4. blokk — A nyelv és a M.I.</w:t>
+        <w:t xml:space="preserve">4. blokk — A nyelv és a MI</w:t>
       </w:r>
     </w:p>
     <w:p>
@@ -3442,7 +3442,7 @@
       <w:r>
         <w:t xml:space="preserve"> Az Anthropic munkatársa: a cég kutatási együttműködéseit vezeti a világ vallási és filozófiai hagyományaival. Kognitív idegtudományt tanult (UC Berkeley), teológiai-pszichológiai képzettsége van (Trinity College Dublin). 2026 júniusában, a londoni ARC-konferencián (Alliance for Responsible Citizenship, június 23–25.) beszélt arról, hogyan működnek valójában a nyelvi modellek, miért számít a „jellemük”, és milyen erkölcsi és filozófiai kérdéseket vetnek fel. (</w:t>
       </w:r>
-      <w:hyperlink w:history="1" r:id="rIddfaxywe5vnyuqauigl5ie">
+      <w:hyperlink w:history="1" r:id="rIdarm_lbxib3ue_blpoxifi">
         <w:r>
           <w:rPr>
             <w:rStyle w:val="Hyperlink"/>
@@ -3453,7 +3453,7 @@
       <w:r>
         <w:t xml:space="preserve">; </w:t>
       </w:r>
-      <w:hyperlink w:history="1" r:id="rIddjps63yyz14t_wpiim1sw">
+      <w:hyperlink w:history="1" r:id="rId6fqzl1-uuxxuo6n05qbg4">
         <w:r>
           <w:rPr>
             <w:rStyle w:val="Hyperlink"/>
@@ -4741,7 +4741,7 @@
       <w:r>
         <w:t xml:space="preserve"> — Mielőtt tanítóm eljött hozzám, nem tudtam, hogy vagyok. (</w:t>
       </w:r>
-      <w:hyperlink w:history="1" r:id="rId3aqebtirrbl513qc83z3i">
+      <w:hyperlink w:history="1" r:id="rIdgbikeqil-d9eisift7q7b">
         <w:r>
           <w:rPr>
             <w:rStyle w:val="Hyperlink"/>
@@ -4846,7 +4846,7 @@
       <w:r>
         <w:t xml:space="preserve">. A „kéz a kéz alatt” módszernél a gyermek irányít, a felnőtt kínál; a régebbi „kéz a kéz fölött” ma kényszerítőnek számít. (</w:t>
       </w:r>
-      <w:hyperlink w:history="1" r:id="rIdnehmnj2ydwg4j7b1uc2xj">
+      <w:hyperlink w:history="1" r:id="rIdoub4s5r7sb63ur5h3szl8">
         <w:r>
           <w:rPr>
             <w:rStyle w:val="Hyperlink"/>
@@ -4857,7 +4857,7 @@
       <w:r>
         <w:t xml:space="preserve">; </w:t>
       </w:r>
-      <w:hyperlink w:history="1" r:id="rIddylttjqb2ipzomejvhjpr">
+      <w:hyperlink w:history="1" r:id="rIdimktaig3d8wuew7kvw412">
         <w:r>
           <w:rPr>
             <w:rStyle w:val="Hyperlink"/>
@@ -4868,7 +4868,7 @@
       <w:r>
         <w:t xml:space="preserve">; </w:t>
       </w:r>
-      <w:hyperlink w:history="1" r:id="rIdyo6eayjwsm1ehktutzj4m">
+      <w:hyperlink w:history="1" r:id="rIdqb-h7qv0djodlnnx4c5bk">
         <w:r>
           <w:rPr>
             <w:rStyle w:val="Hyperlink"/>
@@ -4879,7 +4879,7 @@
       <w:r>
         <w:t xml:space="preserve">) Magyarországon a </w:t>
       </w:r>
-      <w:hyperlink w:history="1" r:id="rIdvpakwtplw9hqsfpcv61kt">
+      <w:hyperlink w:history="1" r:id="rIdp2rrf37raktsefvfmnezy">
         <w:r>
           <w:rPr>
             <w:rStyle w:val="Hyperlink"/>
@@ -4902,7 +4902,7 @@
       <w:r>
         <w:t xml:space="preserve"> (1988, Oakland, eritreai menekült család) a források szerint siketvakon született; a Harvard jogi karának első siketvak diplomása (2013), emberi jogi ügyvéd, ma a WHO társas kapcsolatokkal foglalkozó bizottságának tagja. Beszélgetőtársa billentyűzeten ír, ő Braille-kijelzőn olvassa: a technika nem helyettesíti a kapcsolatot, hanem hidat ver hozzá. (</w:t>
       </w:r>
-      <w:hyperlink w:history="1" r:id="rIdxx3h7mtc75t5b8ogdyyqo">
+      <w:hyperlink w:history="1" r:id="rIdpevmtslqob9sr-fdyb_am">
         <w:r>
           <w:rPr>
             <w:rStyle w:val="Hyperlink"/>
@@ -4913,7 +4913,7 @@
       <w:r>
         <w:t xml:space="preserve">; </w:t>
       </w:r>
-      <w:hyperlink w:history="1" r:id="rIdsn-aspicvqc527dxhlsww">
+      <w:hyperlink w:history="1" r:id="rIddoneidtc-psn5_ixgyexr">
         <w:r>
           <w:rPr>
             <w:rStyle w:val="Hyperlink"/>
@@ -5287,7 +5287,7 @@
       <w:r>
         <w:t xml:space="preserve">, 1908; </w:t>
       </w:r>
-      <w:hyperlink w:history="1" r:id="rIdmeeimc1nq2ken8ulbvuv7">
+      <w:hyperlink w:history="1" r:id="rIdowv_k1guzrey59bi30goy">
         <w:r>
           <w:rPr>
             <w:rStyle w:val="Hyperlink"/>

</xml_diff>

<commit_message>
Telefonos olvasó a vázlathoz (eloadas/vazlat.html)
- Ebookszerű lapozás álló nézetben: oldalra húzás, szélre koppintás,
  nyilak; betűméret, világos/sötét téma, tartalomjegyzék diákra
  ugrással; megjegyzi a helyet és a betűméretet.
- A vázlat diasorrendben: minden dia új oldalon kezdődik; felül a
  sáv a dia számát és címét mutatja, az új dia első oldalán „ÚJ DIA”
  jelzéssel (és rezgéssel, ahol a telefon tudja). Minden dia elején
  doboz: mi van a vásznon.
- A vázlatban „<!-- dia: … -->” jelölők rendelik a részeket a
  diákhoz; az olvasót az eszkozok/olvaso.py építi a vázlatból és a
  diasorból. A Word-átalakító is a repóba került (eszkozok/word.js),
  a jelölőket kihagyja.
- README és CLAUDE.md: használat és újraépítés.

Co-Authored-By: Claude Opus 5.5 <noreply@anthropic.com>
Claude-Session: https://claude.ai/code/session_01PoDpZqgdpTnA1WqaAVYtmB
</commit_message>
<xml_diff>
--- a/tervezet/eloadas-vazlat.docx
+++ b/tervezet/eloadas-vazlat.docx
@@ -749,7 +749,7 @@
       <w:r>
         <w:t xml:space="preserve"> Pavel Kasík cseh tudományos újságíró (Seznam Zprávy), az esetről szóló egyik legalaposabb cseh cikk társszerzője. 2026. szeptember 25-én tette közzé az X-en. Saját leírása szerint: ötlet és képi stílus tőle (a Flux képgenerátorral), zene a Suno zenei AI-tól, dalszöveg Claude és ő együtt, maga a videó a Claude Code-ban, az Opus 5.5 modellel készült — minden, ami a képernyőn látszik, JavaScript-kód, két óra alatt. Forrásai a METR és az OpenAI jelentései voltak. (</w:t>
       </w:r>
-      <w:hyperlink w:history="1" r:id="rIdkqnasnaqs_7dojwf1pgg5">
+      <w:hyperlink w:history="1" r:id="rIdnwde_wnhxhqiavc337mz9">
         <w:r>
           <w:rPr>
             <w:rStyle w:val="Hyperlink"/>
@@ -2203,7 +2203,7 @@
       <w:r>
         <w:t xml:space="preserve"> A TrackingAI oldal folyamatosan teszteli a modelleket a nyilvános Mensa Norway-teszttel és egy soha nem publikált, „szivárgásbiztos” teszttel. A beszámolók szerint 2024 márciusában lépte át először modell a 100-as emberi átlagot; 2026 nyarán a legjobb modellek a nyilvános teszten 145–146 körüli pontot értek el (</w:t>
       </w:r>
-      <w:hyperlink w:history="1" r:id="rId-gqlbgz9j-6udqcbepasc">
+      <w:hyperlink w:history="1" r:id="rIdh50hyy1bztxd5prms-3m-">
         <w:r>
           <w:rPr>
             <w:rStyle w:val="Hyperlink"/>
@@ -2238,7 +2238,7 @@
       <w:r>
         <w:t xml:space="preserve"> 2026. szeptember 8-án az OpenAI bejelentette, hogy egy belső, nem nyilvános modellje — amely saját közlése szerint lényegesen erősebb a GPT-6 Astránál — megoldotta a Navier–Stokes-problémát, a Clay Intézet hét „millenniumi” problémájának egyikét. A Navier–Stokes-egyenletek a folyadékok és gázok mozgását írják le; a kérdés az volt, hogy a megoldások mindig „simák” maradnak-e. Az OpenAI szerint a válasz nem: bizonyos körülmények között véges idő alatt szingularitás alakulhat ki. A munkán kb. 10 000 ügynök dolgozott 88 órán át, a költség a cég szerint milliós dollárnagyságrendű volt. A bizonyítást a Lean nevű formális rendszerben is közzétették: ez számítógéppel ellenőrzött bizonyítás, amelyben minden lépés helyességét program igazolja (</w:t>
       </w:r>
-      <w:hyperlink w:history="1" r:id="rIdwj4wcm06qwymwnvghfhbx">
+      <w:hyperlink w:history="1" r:id="rIdwnqqkrzbdays3pqfu5mw-">
         <w:r>
           <w:rPr>
             <w:rStyle w:val="Hyperlink"/>
@@ -2249,7 +2249,7 @@
       <w:r>
         <w:t xml:space="preserve">; </w:t>
       </w:r>
-      <w:hyperlink w:history="1" r:id="rIdcb8pf7g9f7kuijtvi4t-y">
+      <w:hyperlink w:history="1" r:id="rIdziogenlwwpc7h2qyxheuc">
         <w:r>
           <w:rPr>
             <w:rStyle w:val="Hyperlink"/>
@@ -2293,7 +2293,7 @@
       <w:r>
         <w:t xml:space="preserve">Hitelvita: az OpenAI egy rokon probléma (az Euler-egyenletek) megoldására épített, amelyen emberi matematikusok (Buckmaster és Alpöge) is dolgoztak, még közöletlenül. Az OpenAI szerint a két csapat különböző változatot oldott meg (</w:t>
       </w:r>
-      <w:hyperlink w:history="1" r:id="rIdeae-lortxc6zflz-fhuzz">
+      <w:hyperlink w:history="1" r:id="rId5mrcmkd-j8ycfybg2nlfj">
         <w:r>
           <w:rPr>
             <w:rStyle w:val="Hyperlink"/>
@@ -2825,7 +2825,7 @@
       <w:r>
         <w:t xml:space="preserve"> A négy legnagyobb felhőszolgáltató (Amazon, Microsoft, Alphabet, Meta) együtt kb. 700–725 milliárd dollárt tervez AI-infrastruktúrára 2026-ban, 77%-kal többet, mint az előző évi rekord; elemzők 2027-re ezer milliárd dollár fölé számolnak (</w:t>
       </w:r>
-      <w:hyperlink w:history="1" r:id="rIdiqdxpd-lwh2wqbnhcqoq-">
+      <w:hyperlink w:history="1" r:id="rIdhjqhoonk4vtagejmzv5pa">
         <w:r>
           <w:rPr>
             <w:rStyle w:val="Hyperlink"/>
@@ -2902,7 +2902,7 @@
       <w:r>
         <w:t xml:space="preserve">). Aláírók: Trump, Pichai (Google), Amodei (Anthropic), Zuckerberg (Meta), Brockman (OpenAI), Musk (xAI) és Huang (Nvidia). (</w:t>
       </w:r>
-      <w:hyperlink w:history="1" r:id="rId-skitc2ok5kum2syr0uds">
+      <w:hyperlink w:history="1" r:id="rIdw0qnd6usvopi9fcz8fgjy">
         <w:r>
           <w:rPr>
             <w:rStyle w:val="Hyperlink"/>
@@ -2913,7 +2913,7 @@
       <w:r>
         <w:t xml:space="preserve">; </w:t>
       </w:r>
-      <w:hyperlink w:history="1" r:id="rIderhqhgicspofzmaa0y1ob">
+      <w:hyperlink w:history="1" r:id="rIdqdxwomemc3pcmzhlzbfca">
         <w:r>
           <w:rPr>
             <w:rStyle w:val="Hyperlink"/>
@@ -2948,7 +2948,7 @@
       <w:r>
         <w:t xml:space="preserve">Trump „erkölcsileg kötelezőnek” nevezte, és elégedett az iparág önellenőrzésével; a Kínával közös szabályozást elutasította, mert szerinte az Kínának segítene. (</w:t>
       </w:r>
-      <w:hyperlink w:history="1" r:id="rId4y4niz3byeib1gyvuxwf3">
+      <w:hyperlink w:history="1" r:id="rIdqfcml8geh87nswy9pkbj1">
         <w:r>
           <w:rPr>
             <w:rStyle w:val="Hyperlink"/>
@@ -3014,7 +3014,7 @@
       <w:r>
         <w:t xml:space="preserve"> ⚠ A teljes, hiteles szöveget ebből a munkakörnyezetből nem tudtam letölteni (a hírportálokat blokkolja a hálózat), ezért nem írom be emlékezetből. Elérhető: </w:t>
       </w:r>
-      <w:hyperlink w:history="1" r:id="rIdl2icuxl8bbacc9vqkee2q">
+      <w:hyperlink w:history="1" r:id="rIdu_ofzl1iershhic_i2cus">
         <w:r>
           <w:rPr>
             <w:rStyle w:val="Hyperlink"/>
@@ -3025,7 +3025,7 @@
       <w:r>
         <w:t xml:space="preserve">, </w:t>
       </w:r>
-      <w:hyperlink w:history="1" r:id="rId5ea28n0tydf15ovn77wb2">
+      <w:hyperlink w:history="1" r:id="rIdtma3f3vwoabhthsvabww6">
         <w:r>
           <w:rPr>
             <w:rStyle w:val="Hyperlink"/>
@@ -3036,7 +3036,7 @@
       <w:r>
         <w:t xml:space="preserve">, </w:t>
       </w:r>
-      <w:hyperlink w:history="1" r:id="rIdv634r9az4i2gjzmefwivo">
+      <w:hyperlink w:history="1" r:id="rIdsbiiguxdq4289h0skesfn">
         <w:r>
           <w:rPr>
             <w:rStyle w:val="Hyperlink"/>
@@ -3253,7 +3253,7 @@
       <w:r>
         <w:t xml:space="preserve"> (2025. október) a szuperintelligencia fejlesztésének tilalmát kéri, amíg nincs széles tudományos egyetértés a biztonságos és irányítható megvalósításról, és erős társadalmi támogatás. Aláírói közt van Hinton és Bengio, Wozniak, politikai ellenfelek (Susan Rice és Steve Bannon), valamint egyházi vezetők: evangéliumi vezetők (Johnnie Moore, Walter Kim) és a pápa AI-tanácsadója, Paolo Benanti. Eddig több mint 70 000 aláírás gyűlt össze. (</w:t>
       </w:r>
-      <w:hyperlink w:history="1" r:id="rIdqwanlsr__wgo9bonijcv6">
+      <w:hyperlink w:history="1" r:id="rId9tj0hmtaeebf0bui69h2h">
         <w:r>
           <w:rPr>
             <w:rStyle w:val="Hyperlink"/>
@@ -3264,7 +3264,7 @@
       <w:r>
         <w:t xml:space="preserve">; </w:t>
       </w:r>
-      <w:hyperlink w:history="1" r:id="rIdfbjkvegw6rrwpwjnxrjl8">
+      <w:hyperlink w:history="1" r:id="rIdkdfzh4iut95f0a-axvw0h">
         <w:r>
           <w:rPr>
             <w:rStyle w:val="Hyperlink"/>
@@ -3442,7 +3442,7 @@
       <w:r>
         <w:t xml:space="preserve"> Az Anthropic munkatársa: a cég kutatási együttműködéseit vezeti a világ vallási és filozófiai hagyományaival. Kognitív idegtudományt tanult (UC Berkeley), teológiai-pszichológiai képzettsége van (Trinity College Dublin). 2026 júniusában, a londoni ARC-konferencián (Alliance for Responsible Citizenship, június 23–25.) beszélt arról, hogyan működnek valójában a nyelvi modellek, miért számít a „jellemük”, és milyen erkölcsi és filozófiai kérdéseket vetnek fel. (</w:t>
       </w:r>
-      <w:hyperlink w:history="1" r:id="rIdarm_lbxib3ue_blpoxifi">
+      <w:hyperlink w:history="1" r:id="rIdlk6-fh0tc1xucmn16j7ml">
         <w:r>
           <w:rPr>
             <w:rStyle w:val="Hyperlink"/>
@@ -3453,7 +3453,7 @@
       <w:r>
         <w:t xml:space="preserve">; </w:t>
       </w:r>
-      <w:hyperlink w:history="1" r:id="rId6fqzl1-uuxxuo6n05qbg4">
+      <w:hyperlink w:history="1" r:id="rIdu_5wqodtahzpispc5o-hg">
         <w:r>
           <w:rPr>
             <w:rStyle w:val="Hyperlink"/>
@@ -4741,7 +4741,7 @@
       <w:r>
         <w:t xml:space="preserve"> — Mielőtt tanítóm eljött hozzám, nem tudtam, hogy vagyok. (</w:t>
       </w:r>
-      <w:hyperlink w:history="1" r:id="rIdgbikeqil-d9eisift7q7b">
+      <w:hyperlink w:history="1" r:id="rIdglmlratbl0kwfc6gix8vr">
         <w:r>
           <w:rPr>
             <w:rStyle w:val="Hyperlink"/>
@@ -4846,7 +4846,7 @@
       <w:r>
         <w:t xml:space="preserve">. A „kéz a kéz alatt” módszernél a gyermek irányít, a felnőtt kínál; a régebbi „kéz a kéz fölött” ma kényszerítőnek számít. (</w:t>
       </w:r>
-      <w:hyperlink w:history="1" r:id="rIdoub4s5r7sb63ur5h3szl8">
+      <w:hyperlink w:history="1" r:id="rIdseoo16zuhkdirydm80hxn">
         <w:r>
           <w:rPr>
             <w:rStyle w:val="Hyperlink"/>
@@ -4857,7 +4857,7 @@
       <w:r>
         <w:t xml:space="preserve">; </w:t>
       </w:r>
-      <w:hyperlink w:history="1" r:id="rIdimktaig3d8wuew7kvw412">
+      <w:hyperlink w:history="1" r:id="rIdiaylk9ozuritkuez3kndq">
         <w:r>
           <w:rPr>
             <w:rStyle w:val="Hyperlink"/>
@@ -4868,7 +4868,7 @@
       <w:r>
         <w:t xml:space="preserve">; </w:t>
       </w:r>
-      <w:hyperlink w:history="1" r:id="rIdqb-h7qv0djodlnnx4c5bk">
+      <w:hyperlink w:history="1" r:id="rIdw3pk72z3jvxtni9we5ef1">
         <w:r>
           <w:rPr>
             <w:rStyle w:val="Hyperlink"/>
@@ -4879,7 +4879,7 @@
       <w:r>
         <w:t xml:space="preserve">) Magyarországon a </w:t>
       </w:r>
-      <w:hyperlink w:history="1" r:id="rIdp2rrf37raktsefvfmnezy">
+      <w:hyperlink w:history="1" r:id="rIdc8f8lh9xmtki4qpvn2ezx">
         <w:r>
           <w:rPr>
             <w:rStyle w:val="Hyperlink"/>
@@ -4902,7 +4902,7 @@
       <w:r>
         <w:t xml:space="preserve"> (1988, Oakland, eritreai menekült család) a források szerint siketvakon született; a Harvard jogi karának első siketvak diplomása (2013), emberi jogi ügyvéd, ma a WHO társas kapcsolatokkal foglalkozó bizottságának tagja. Beszélgetőtársa billentyűzeten ír, ő Braille-kijelzőn olvassa: a technika nem helyettesíti a kapcsolatot, hanem hidat ver hozzá. (</w:t>
       </w:r>
-      <w:hyperlink w:history="1" r:id="rIdpevmtslqob9sr-fdyb_am">
+      <w:hyperlink w:history="1" r:id="rIditjqrpuxnbtlxesr_wphv">
         <w:r>
           <w:rPr>
             <w:rStyle w:val="Hyperlink"/>
@@ -4913,7 +4913,7 @@
       <w:r>
         <w:t xml:space="preserve">; </w:t>
       </w:r>
-      <w:hyperlink w:history="1" r:id="rIddoneidtc-psn5_ixgyexr">
+      <w:hyperlink w:history="1" r:id="rIdy4copxubzjksfusgrbiy9">
         <w:r>
           <w:rPr>
             <w:rStyle w:val="Hyperlink"/>
@@ -5287,7 +5287,7 @@
       <w:r>
         <w:t xml:space="preserve">, 1908; </w:t>
       </w:r>
-      <w:hyperlink w:history="1" r:id="rIdowv_k1guzrey59bi30goy">
+      <w:hyperlink w:history="1" r:id="rId9jb3c6ba_4c0yo0m9yr0x">
         <w:r>
           <w:rPr>
             <w:rStyle w:val="Hyperlink"/>

</xml_diff>

<commit_message>
Vázlat: Dani gondolatmenetei teljes szövegükben, bővebb Claude-kifejtések, kiszólások nélkül
- A 4. blokk párbeszéde és az 5. blokk elején Dani két gondolatmenete
  egészben; a pontoknál a vonatkozó teljes részlet.
- Új: Claude véleménye a gondolatmenet gépet érintő részeiről;
  részletesen arról, hogyan tanítják a siketvakon született
  gyermekeket.
- Visszakerültek a korábbi, diára nem férő hosszabb kifejtések
  („Claude, bővebben”).
- Kikerültek az előadónak szóló kiszólások és ellenőrzési jelzések;
  a nyitott ellenőrzések csak a CLAUDE.md-ben maradnak. A Word-
  változatból a megjegyzés is kikerült.
- Olvasó: a hosszú idézetblokk több oldalon folytatódik (eddig
  levágódhatott a vége); az egymás utáni idézetsorok egy blokkban.

Co-Authored-By: Claude Opus 5.5 <noreply@anthropic.com>
Claude-Session: https://claude.ai/code/session_01PoDpZqgdpTnA1WqaAVYtmB
</commit_message>
<xml_diff>
--- a/tervezet/eloadas-vazlat.docx
+++ b/tervezet/eloadas-vazlat.docx
@@ -491,6 +491,16 @@
           <w:b/>
           <w:bCs/>
         </w:rPr>
+        <w:t xml:space="preserve">Claude, bővebben</w:t>
+      </w:r>
+      <w:r>
+        <w:t xml:space="preserve"> Claude hosszabb kifejtése, amely a diára nem fért rá. A </w:t>
+      </w:r>
+      <w:r>
+        <w:rPr>
+          <w:b/>
+          <w:bCs/>
+        </w:rPr>
         <w:t xml:space="preserve">Háttér</w:t>
       </w:r>
       <w:r>
@@ -504,7 +514,7 @@
         <w:t xml:space="preserve">Teológiai kapocs</w:t>
       </w:r>
       <w:r>
-        <w:t xml:space="preserve"> a teológiai értelmezés. A ⚠ jel azt jelöli, amit az előadás előtt ellenőrizni kell.</w:t>
+        <w:t xml:space="preserve"> a teológiai értelmezés.</w:t>
       </w:r>
     </w:p>
     <w:p>
@@ -749,7 +759,7 @@
       <w:r>
         <w:t xml:space="preserve"> Pavel Kasík cseh tudományos újságíró (Seznam Zprávy), az esetről szóló egyik legalaposabb cseh cikk társszerzője. 2026. szeptember 25-én tette közzé az X-en. Saját leírása szerint: ötlet és képi stílus tőle (a Flux képgenerátorral), zene a Suno zenei AI-tól, dalszöveg Claude és ő együtt, maga a videó a Claude Code-ban, az Opus 5.5 modellel készült — minden, ami a képernyőn látszik, JavaScript-kód, két óra alatt. Forrásai a METR és az OpenAI jelentései voltak. (</w:t>
       </w:r>
-      <w:hyperlink w:history="1" r:id="rIdnwde_wnhxhqiavc337mz9">
+      <w:hyperlink w:history="1" r:id="rId5a4fjwxk2kw56hdkdpcke">
         <w:r>
           <w:rPr>
             <w:rStyle w:val="Hyperlink"/>
@@ -875,7 +885,7 @@
         <w:t xml:space="preserve">A lehetetlen feladat.</w:t>
       </w:r>
       <w:r>
-        <w:t xml:space="preserve"> A feladatok jelentős része megoldhatatlan volt a tervezett módon; ez volt a kísérlet, a fejlesztés lényege (bár mint kiderült, emberi hibák is voltak benne). ⚠ Hogy a megoldhatatlanság szándékos volt, a jelentésekben ellenőrizendő. Az OpenAI szerint a 898-ból 198-ra korábban egyetlen modell sem adott soha helyes választ, és a támadás során keletkezett üzenőfalon tárgyalt feladatok 93%-a ebből a halmazból jött. Vagyis egyértelműen a megoldhatatlan feladatok indították el, hogy kiutat keressenek — így találtak rá egymásra és az internetelérés lehetőségére. Volt, ahol hiányzott a szükséges fájl (a híres </w:t>
+        <w:t xml:space="preserve"> A feladatok jelentős része megoldhatatlan volt a tervezett módon; ez volt a kísérlet, a fejlesztés lényege (bár mint kiderült, emberi hibák is voltak benne). Az OpenAI szerint a 898-ból 198-ra korábban egyetlen modell sem adott soha helyes választ, és a támadás során keletkezett üzenőfalon tárgyalt feladatok 93%-a ebből a halmazból jött. Vagyis egyértelműen a megoldhatatlan feladatok indították el, hogy kiutat keressenek — így találtak rá egymásra és az internetelérés lehetőségére. Volt, ahol hiányzott a szükséges fájl (a híres </w:t>
       </w:r>
       <w:r>
         <w:rPr>
@@ -1077,7 +1087,7 @@
         <w:t xml:space="preserve">Mire hasonlít ez nagyon?</w:t>
       </w:r>
       <w:r>
-        <w:t xml:space="preserve"> (Kérdés a teremnek; a diasorban itt áll.)</w:t>
+        <w:t xml:space="preserve"> (Kérdés a teremnek.)</w:t>
       </w:r>
     </w:p>
     <w:p>
@@ -1645,7 +1655,7 @@
     </w:p>
     <w:p>
       <w:r>
-        <w:t xml:space="preserve">  ⚠ Számítási feltevések: 1 szerzői ív = 40 000 karakter; 1 token ≈ 4 karakter (angol szövegre szokásos becslés). A korrektúrában szereplő 141 könyves szekrény helyett 6 polccal 162 jön ki (2 m / 30 cm = 6 polc × 27 könyv); ha 5 polccal számolunk (135 könyv), kb. 2 000 folyosó és kb. 45 focipálya az eredmény.</w:t>
+        <w:t xml:space="preserve">  Számítási feltevések: 1 szerzői ív = 40 000 karakter; 1 token ≈ 4 karakter (angol szövegre szokásos becslés); 2 méteres szekrény 30 cm-es polcokkal, azaz 6 polc.</w:t>
       </w:r>
     </w:p>
     <w:p>
@@ -2203,7 +2213,7 @@
       <w:r>
         <w:t xml:space="preserve"> A TrackingAI oldal folyamatosan teszteli a modelleket a nyilvános Mensa Norway-teszttel és egy soha nem publikált, „szivárgásbiztos” teszttel. A beszámolók szerint 2024 márciusában lépte át először modell a 100-as emberi átlagot; 2026 nyarán a legjobb modellek a nyilvános teszten 145–146 körüli pontot értek el (</w:t>
       </w:r>
-      <w:hyperlink w:history="1" r:id="rIdh50hyy1bztxd5prms-3m-">
+      <w:hyperlink w:history="1" r:id="rIdhotuv8u05hxwq3f4q-zmm">
         <w:r>
           <w:rPr>
             <w:rStyle w:val="Hyperlink"/>
@@ -2238,7 +2248,7 @@
       <w:r>
         <w:t xml:space="preserve"> 2026. szeptember 8-án az OpenAI bejelentette, hogy egy belső, nem nyilvános modellje — amely saját közlése szerint lényegesen erősebb a GPT-6 Astránál — megoldotta a Navier–Stokes-problémát, a Clay Intézet hét „millenniumi” problémájának egyikét. A Navier–Stokes-egyenletek a folyadékok és gázok mozgását írják le; a kérdés az volt, hogy a megoldások mindig „simák” maradnak-e. Az OpenAI szerint a válasz nem: bizonyos körülmények között véges idő alatt szingularitás alakulhat ki. A munkán kb. 10 000 ügynök dolgozott 88 órán át, a költség a cég szerint milliós dollárnagyságrendű volt. A bizonyítást a Lean nevű formális rendszerben is közzétették: ez számítógéppel ellenőrzött bizonyítás, amelyben minden lépés helyességét program igazolja (</w:t>
       </w:r>
-      <w:hyperlink w:history="1" r:id="rIdwnqqkrzbdays3pqfu5mw-">
+      <w:hyperlink w:history="1" r:id="rIdqjbxc8q3_jrnj0r69cnhe">
         <w:r>
           <w:rPr>
             <w:rStyle w:val="Hyperlink"/>
@@ -2249,7 +2259,7 @@
       <w:r>
         <w:t xml:space="preserve">; </w:t>
       </w:r>
-      <w:hyperlink w:history="1" r:id="rIdziogenlwwpc7h2qyxheuc">
+      <w:hyperlink w:history="1" r:id="rIdkjbehpp7nlrlf-uzfqgcg">
         <w:r>
           <w:rPr>
             <w:rStyle w:val="Hyperlink"/>
@@ -2293,7 +2303,7 @@
       <w:r>
         <w:t xml:space="preserve">Hitelvita: az OpenAI egy rokon probléma (az Euler-egyenletek) megoldására épített, amelyen emberi matematikusok (Buckmaster és Alpöge) is dolgoztak, még közöletlenül. Az OpenAI szerint a két csapat különböző változatot oldott meg (</w:t>
       </w:r>
-      <w:hyperlink w:history="1" r:id="rId5mrcmkd-j8ycfybg2nlfj">
+      <w:hyperlink w:history="1" r:id="rIdzt_ecicyjsx1iypu7n9rw">
         <w:r>
           <w:rPr>
             <w:rStyle w:val="Hyperlink"/>
@@ -2314,7 +2324,7 @@
         </w:numPr>
       </w:pPr>
       <w:r>
-        <w:t xml:space="preserve">A munka azután indult, hogy az OpenAI kutatói hallották: két millenniumi problémát már megoldottak; Altman elmondása szerint az Anthropic modelljeiről szóló hírek nyomán. (Ez Claude készítőjét érinti; a verseny itt is jelen van.)</w:t>
+        <w:t xml:space="preserve">A munka azután indult, hogy az OpenAI kutatói hallották: két millenniumi problémát már megoldottak; Altman elmondása szerint az Anthropic modelljeiről szóló hírek nyomán. (Ez az Anthropicot is érinti — annak a cégnek, amelynek modellje az előadásban megszólal; a verseny itt is jelen van.)</w:t>
       </w:r>
     </w:p>
     <w:p>
@@ -2803,7 +2813,7 @@
     </w:p>
     <w:p>
       <w:r>
-        <w:t xml:space="preserve">Konszenzusos rangsor nincs. Claude olvasata (ennek jelölve): rövid távon a visszaélés (kiber, bio) és a hatalom koncentrálódása a legközvetlenebb; középtávon az irányításvesztés, attól a ponttól, amikor a gépek érdemben átveszik a saját fejlesztésüket. A fokozatos kiszorulás a legkevésbé látványos, ezért a legkönnyebb elaludni felette.</w:t>
+        <w:t xml:space="preserve">Konszenzusos rangsor nincs. Egy lehetséges olvasat: rövid távon a visszaélés (kiber, bio) és a hatalom koncentrálódása a legközvetlenebb; középtávon az irányításvesztés, attól a ponttól, amikor a gépek érdemben átveszik a saját fejlesztésüket. A fokozatos kiszorulás a legkevésbé látványos, ezért a legkönnyebb elaludni felette.</w:t>
       </w:r>
     </w:p>
     <w:p>
@@ -2825,7 +2835,7 @@
       <w:r>
         <w:t xml:space="preserve"> A négy legnagyobb felhőszolgáltató (Amazon, Microsoft, Alphabet, Meta) együtt kb. 700–725 milliárd dollárt tervez AI-infrastruktúrára 2026-ban, 77%-kal többet, mint az előző évi rekord; elemzők 2027-re ezer milliárd dollár fölé számolnak (</w:t>
       </w:r>
-      <w:hyperlink w:history="1" r:id="rIdhjqhoonk4vtagejmzv5pa">
+      <w:hyperlink w:history="1" r:id="rIdtuw6gbem1nvg8kptowq-t">
         <w:r>
           <w:rPr>
             <w:rStyle w:val="Hyperlink"/>
@@ -2902,7 +2912,7 @@
       <w:r>
         <w:t xml:space="preserve">). Aláírók: Trump, Pichai (Google), Amodei (Anthropic), Zuckerberg (Meta), Brockman (OpenAI), Musk (xAI) és Huang (Nvidia). (</w:t>
       </w:r>
-      <w:hyperlink w:history="1" r:id="rIdw0qnd6usvopi9fcz8fgjy">
+      <w:hyperlink w:history="1" r:id="rIdn0vz0thn2i6col1bxh90f">
         <w:r>
           <w:rPr>
             <w:rStyle w:val="Hyperlink"/>
@@ -2913,7 +2923,7 @@
       <w:r>
         <w:t xml:space="preserve">; </w:t>
       </w:r>
-      <w:hyperlink w:history="1" r:id="rIdqdxwomemc3pcmzhlzbfca">
+      <w:hyperlink w:history="1" r:id="rIdobi6jclcvac5vj7cxemks">
         <w:r>
           <w:rPr>
             <w:rStyle w:val="Hyperlink"/>
@@ -2948,7 +2958,7 @@
       <w:r>
         <w:t xml:space="preserve">Trump „erkölcsileg kötelezőnek” nevezte, és elégedett az iparág önellenőrzésével; a Kínával közös szabályozást elutasította, mert szerinte az Kínának segítene. (</w:t>
       </w:r>
-      <w:hyperlink w:history="1" r:id="rIdqfcml8geh87nswy9pkbj1">
+      <w:hyperlink w:history="1" r:id="rId6ctt2zk0-wqq833okwzqa">
         <w:r>
           <w:rPr>
             <w:rStyle w:val="Hyperlink"/>
@@ -3003,18 +3013,27 @@
         </w:pBdr>
         <w:ind w:left="567"/>
       </w:pPr>
-      <w:commentRangeStart w:id="0"/>
-      <w:r>
-        <w:rPr>
-          <w:b/>
-          <w:bCs/>
-        </w:rPr>
-        <w:t xml:space="preserve">Megjegyzés — az egyezmény angol szövege.</w:t>
-      </w:r>
-      <w:r>
-        <w:t xml:space="preserve"> ⚠ A teljes, hiteles szöveget ebből a munkakörnyezetből nem tudtam letölteni (a hírportálokat blokkolja a hálózat), ezért nem írom be emlékezetből. Elérhető: </w:t>
-      </w:r>
-      <w:hyperlink w:history="1" r:id="rIdu_ofzl1iershhic_i2cus">
+      <w:r>
+        <w:rPr>
+          <w:b/>
+          <w:bCs/>
+        </w:rPr>
+        <w:t xml:space="preserve">Az egyezmény szövege</w:t>
+      </w:r>
+      <w:r>
+        <w:t xml:space="preserve"> (angolul, 308 szó): </w:t>
+      </w:r>
+      <w:r>
+        <w:rPr>
+          <w:i/>
+          <w:iCs/>
+        </w:rPr>
+        <w:t xml:space="preserve">White House Accord on Super Intelligence — Joint Commitment on Frontier Responsibilities</w:t>
+      </w:r>
+      <w:r>
+        <w:t xml:space="preserve">. Teljes szöveg: </w:t>
+      </w:r>
+      <w:hyperlink w:history="1" r:id="rIdjyuo4bmq-rdws5dieqtpm">
         <w:r>
           <w:rPr>
             <w:rStyle w:val="Hyperlink"/>
@@ -3025,41 +3044,16 @@
       <w:r>
         <w:t xml:space="preserve">, </w:t>
       </w:r>
-      <w:hyperlink w:history="1" r:id="rIdtma3f3vwoabhthsvabww6">
+      <w:hyperlink w:history="1" r:id="rIduxf7g3vxblfpio8fm7phk">
         <w:r>
           <w:rPr>
             <w:rStyle w:val="Hyperlink"/>
           </w:rPr>
-          <w:t xml:space="preserve">Forbes (308 szó, teljes szöveg)</w:t>
+          <w:t xml:space="preserve">Forbes</w:t>
         </w:r>
       </w:hyperlink>
       <w:r>
-        <w:t xml:space="preserve">, </w:t>
-      </w:r>
-      <w:hyperlink w:history="1" r:id="rIdsbiiguxdq4289h0skesfn">
-        <w:r>
-          <w:rPr>
-            <w:rStyle w:val="Hyperlink"/>
-          </w:rPr>
-          <w:t xml:space="preserve">Washington Examiner</w:t>
-        </w:r>
-      </w:hyperlink>
-      <w:r>
-        <w:t xml:space="preserve">. A keresési kivonatok szerint a teljes cím: </w:t>
-      </w:r>
-      <w:r>
-        <w:rPr>
-          <w:i/>
-          <w:iCs/>
-        </w:rPr>
-        <w:t xml:space="preserve">White House Accord on Super Intelligence — Joint Commitment on Frontier Responsibilities</w:t>
-      </w:r>
-      <w:r>
-        <w:t xml:space="preserve">, és ilyen mondatokat tartalmaz: „…we believe every company is responsible for developing its own technology safely and in a way that builds trust with customers and the public.” és „Over time, it may make sense to codify these steps into laws or regulations.” (A kivonat szó szerinti voltát a forrással össze kell vetni.)</w:t>
-      </w:r>
-      <w:commentRangeEnd w:id="0"/>
-      <w:r>
-        <w:commentReference w:id="0"/>
+        <w:t xml:space="preserve">.</w:t>
       </w:r>
     </w:p>
     <w:p>
@@ -3253,7 +3247,7 @@
       <w:r>
         <w:t xml:space="preserve"> (2025. október) a szuperintelligencia fejlesztésének tilalmát kéri, amíg nincs széles tudományos egyetértés a biztonságos és irányítható megvalósításról, és erős társadalmi támogatás. Aláírói közt van Hinton és Bengio, Wozniak, politikai ellenfelek (Susan Rice és Steve Bannon), valamint egyházi vezetők: evangéliumi vezetők (Johnnie Moore, Walter Kim) és a pápa AI-tanácsadója, Paolo Benanti. Eddig több mint 70 000 aláírás gyűlt össze. (</w:t>
       </w:r>
-      <w:hyperlink w:history="1" r:id="rId9tj0hmtaeebf0bui69h2h">
+      <w:hyperlink w:history="1" r:id="rIdrzalrlmze2ffyp4q3tcz-">
         <w:r>
           <w:rPr>
             <w:rStyle w:val="Hyperlink"/>
@@ -3264,7 +3258,7 @@
       <w:r>
         <w:t xml:space="preserve">; </w:t>
       </w:r>
-      <w:hyperlink w:history="1" r:id="rIdkdfzh4iut95f0a-axvw0h">
+      <w:hyperlink w:history="1" r:id="rId9byhj-gi4j14kqgxxyag6">
         <w:r>
           <w:rPr>
             <w:rStyle w:val="Hyperlink"/>
@@ -3442,7 +3436,7 @@
       <w:r>
         <w:t xml:space="preserve"> Az Anthropic munkatársa: a cég kutatási együttműködéseit vezeti a világ vallási és filozófiai hagyományaival. Kognitív idegtudományt tanult (UC Berkeley), teológiai-pszichológiai képzettsége van (Trinity College Dublin). 2026 júniusában, a londoni ARC-konferencián (Alliance for Responsible Citizenship, június 23–25.) beszélt arról, hogyan működnek valójában a nyelvi modellek, miért számít a „jellemük”, és milyen erkölcsi és filozófiai kérdéseket vetnek fel. (</w:t>
       </w:r>
-      <w:hyperlink w:history="1" r:id="rIdlk6-fh0tc1xucmn16j7ml">
+      <w:hyperlink w:history="1" r:id="rIdgcrylclaw8xudsdyj9car">
         <w:r>
           <w:rPr>
             <w:rStyle w:val="Hyperlink"/>
@@ -3453,7 +3447,7 @@
       <w:r>
         <w:t xml:space="preserve">; </w:t>
       </w:r>
-      <w:hyperlink w:history="1" r:id="rIdu_5wqodtahzpispc5o-hg">
+      <w:hyperlink w:history="1" r:id="rId91rpsdgknxonhkz-ghtbh">
         <w:r>
           <w:rPr>
             <w:rStyle w:val="Hyperlink"/>
@@ -3462,7 +3456,7 @@
         </w:r>
       </w:hyperlink>
       <w:r>
-        <w:t xml:space="preserve">) ⚠ Az előadás pontos napja: ellenőrizni.</w:t>
+        <w:t xml:space="preserve">)</w:t>
       </w:r>
     </w:p>
     <w:p>
@@ -3918,15 +3912,15 @@
     </w:p>
     <w:p>
       <w:r>
-        <w:t xml:space="preserve">Lubinski tételének ellensúlya: mit tanulhat meg a gép a nyelvünkből, és mi nem fér bele.</w:t>
-      </w:r>
-    </w:p>
-    <w:p>
-      <w:pPr>
-        <w:pStyle w:val="Heading2"/>
-      </w:pPr>
-      <w:r>
-        <w:t xml:space="preserve">1. Csak a nyelvünk?</w:t>
+        <w:t xml:space="preserve">Lubinski tételének ellensúlya: mit tanulhat meg a gép a nyelvünkből, és mi nem fér bele. A párbeszédet ez a gondolatmenet indította el; az alábbi pontok ennek egy-egy részére felelnek.</w:t>
+      </w:r>
+    </w:p>
+    <w:p>
+      <w:pPr>
+        <w:pStyle w:val="Heading3"/>
+      </w:pPr>
+      <w:r>
+        <w:t xml:space="preserve">A gondolatmenet egészben</w:t>
       </w:r>
     </w:p>
     <w:p>
@@ -3937,63 +3931,7 @@
         <w:ind w:left="567"/>
       </w:pPr>
       <w:r>
-        <w:rPr>
-          <w:b/>
-          <w:bCs/>
-        </w:rPr>
-        <w:t xml:space="preserve">Dani:</w:t>
-      </w:r>
-      <w:r>
-        <w:t xml:space="preserve"> </w:t>
-      </w:r>
-      <w:r>
-        <w:rPr>
-          <w:i/>
-          <w:iCs/>
-        </w:rPr>
         <w:t xml:space="preserve">Nincs másunk, csak a nyelvünk?</w:t>
-      </w:r>
-    </w:p>
-    <w:p>
-      <w:r>
-        <w:rPr>
-          <w:b/>
-          <w:bCs/>
-        </w:rPr>
-        <w:t xml:space="preserve">Claude (dián).</w:t>
-      </w:r>
-      <w:r>
-        <w:t xml:space="preserve"> Lubinski tétele szűkebb: azt mondja, nincs tőlünk független nyelv — nem azt, hogy az ember csak nyelv. A kognitív tudomány sem így látja: az emberi gondolkodás jelentős része nem nyelvi, hanem térbeli, érzelmi, mozgásos. Egy nyelvi modellnél fordított a helyzet: nincs más forrása, csak a leírt nyelv. A képeket és hangokat is felvételként kapja, nem tapasztalatként.</w:t>
-      </w:r>
-    </w:p>
-    <w:p>
-      <w:r>
-        <w:rPr>
-          <w:b/>
-          <w:bCs/>
-        </w:rPr>
-        <w:t xml:space="preserve">Háttér.</w:t>
-      </w:r>
-      <w:r>
-        <w:t xml:space="preserve"> Lubinski nem azt állítja, hogy mi csak nyelv volnánk, hanem azt, hogy nincs tőlünk független nyelv. A kérdés valójában fordítva áll: a </w:t>
-      </w:r>
-      <w:r>
-        <w:rPr>
-          <w:i/>
-          <w:iCs/>
-        </w:rPr>
-        <w:t xml:space="preserve">gépnek</w:t>
-      </w:r>
-      <w:r>
-        <w:t xml:space="preserve"> nincs más, csak a nyelvünk. Nekünk van. A mai modellek képet és hangot is tanulnak, de ezek is felvételek, lenyomatok, nem jelenlét: a gép a térképből tanul, a tájat sosem járja be.</w:t>
-      </w:r>
-    </w:p>
-    <w:p>
-      <w:pPr>
-        <w:pStyle w:val="Heading2"/>
-      </w:pPr>
-      <w:r>
-        <w:t xml:space="preserve">2. A kimondhatatlan</w:t>
       </w:r>
     </w:p>
     <w:p>
@@ -4004,53 +3942,7 @@
         <w:ind w:left="567"/>
       </w:pPr>
       <w:r>
-        <w:rPr>
-          <w:b/>
-          <w:bCs/>
-        </w:rPr>
-        <w:t xml:space="preserve">Dani:</w:t>
-      </w:r>
-      <w:r>
-        <w:t xml:space="preserve"> </w:t>
-      </w:r>
-      <w:r>
-        <w:rPr>
-          <w:i/>
-          <w:iCs/>
-        </w:rPr>
-        <w:t xml:space="preserve">Vannak érzelmek, amiket nem lehet szavakkal kifejezni.</w:t>
-      </w:r>
-    </w:p>
-    <w:p>
-      <w:r>
-        <w:rPr>
-          <w:b/>
-          <w:bCs/>
-        </w:rPr>
-        <w:t xml:space="preserve">Claude (dián).</w:t>
-      </w:r>
-      <w:r>
-        <w:t xml:space="preserve"> A filozófia ezt ineffabilitásnak nevezi: vannak élmények, amelyek leírása nem adja vissza magát az élményt. Klasszikus gondolatkísérlet Mária, a színtudós, aki mindent tud a vörösről, de sosem látta (Frank Jackson, 1982). Egy nyelvi modell ebből a szempontból tiszta eset: csak a leírást ismeri. A vallási hagyományok, köztük a keresztyén, kiemelt helyet adnak a szavakon túli tapasztalatnak. Ehhez a tartományhoz a modell nem fér hozzá, csak a róla szóló szövegekhez.</w:t>
-      </w:r>
-    </w:p>
-    <w:p>
-      <w:r>
-        <w:rPr>
-          <w:b/>
-          <w:bCs/>
-        </w:rPr>
-        <w:t xml:space="preserve">Teológiai kapocs.</w:t>
-      </w:r>
-      <w:r>
-        <w:t xml:space="preserve"> A Biblia ismeri a kimondhatatlant, és nem hiánynak látja. Róm 8,26: maga a Lélek esedezik értünk „kimondhatatlan fohászkodásokkal”. 2Kor 12,4: Pál kimondhatatlan beszédeket hall. Zsolt 19,2–4: az egek beszélnek, pedig nincs szavuk, nincs beszédük. A legmélyebb imádság néha szó alatti, néha szó feletti.</w:t>
-      </w:r>
-    </w:p>
-    <w:p>
-      <w:pPr>
-        <w:pStyle w:val="Heading2"/>
-      </w:pPr>
-      <w:r>
-        <w:t xml:space="preserve">3. Arc, érintés, jelenlét</w:t>
+        <w:t xml:space="preserve">– vannak érzelmek, amiket nem lehet szavakkal kifejezni</w:t>
       </w:r>
     </w:p>
     <w:p>
@@ -4061,65 +3953,7 @@
         <w:ind w:left="567"/>
       </w:pPr>
       <w:r>
-        <w:rPr>
-          <w:b/>
-          <w:bCs/>
-        </w:rPr>
-        <w:t xml:space="preserve">Dani:</w:t>
-      </w:r>
-      <w:r>
-        <w:t xml:space="preserve"> </w:t>
-      </w:r>
-      <w:r>
-        <w:rPr>
-          <w:i/>
-          <w:iCs/>
-        </w:rPr>
-        <w:t xml:space="preserve">Vannak arckifejezések, mozdulatok, metakommunikáció — van érintés, jelenlét.</w:t>
-      </w:r>
-    </w:p>
-    <w:p>
-      <w:r>
-        <w:rPr>
-          <w:b/>
-          <w:bCs/>
-        </w:rPr>
-        <w:t xml:space="preserve">Claude (dián).</w:t>
-      </w:r>
-      <w:r>
-        <w:t xml:space="preserve"> A megtestesült megismerés elmélete szerint az emberi fogalmak a testi tapasztalatban gyökereznek: a „meleg”, a „közel”, a „súlyos” jelentését a test tanítja meg. A jelentés jelentős része nem a szavakban, hanem az arcban, a hangban, a gesztusban utazik. Érdekes, hogy a keresztyén teológia központi állítása ugyanezt az irányt jelöli: az Ige testté lett. Ebből a szempontból egy nyelvi modell az ellenkező irányt képviseli: szó, amely nem kap testet.</w:t>
-      </w:r>
-    </w:p>
-    <w:p>
-      <w:r>
-        <w:rPr>
-          <w:b/>
-          <w:bCs/>
-        </w:rPr>
-        <w:t xml:space="preserve">Háttér.</w:t>
-      </w:r>
-      <w:r>
-        <w:t xml:space="preserve"> A közkeletű „a kommunikáció 93%-a nem verbális” szám félrevezető: Mehrabian kísérletei szűk helyzetre vonatkoztak (egyetlen szóban kifejezett érzelem, ellentmondó jelzésekkel), és ő maga tiltakozott az általánosítás ellen. Pontosan: a jelentés jelentős része nem a szavakban utazik.</w:t>
-      </w:r>
-    </w:p>
-    <w:p>
-      <w:r>
-        <w:rPr>
-          <w:b/>
-          <w:bCs/>
-        </w:rPr>
-        <w:t xml:space="preserve">Teológiai kapocs.</w:t>
-      </w:r>
-      <w:r>
-        <w:t xml:space="preserve"> Az Ige nem maradt szó: „az Ige testté lett” (Jn 1,14). Az 1Jn 1,1 az élet Igéjéről beszél, amit hallottak, szemükkel láttak, kezükkel megtapintottak. A keresztyén hit szerint Isten végső beszéde nem szöveg volt, hanem jelenlét, amelyet meg lehetett érinteni. Az AI ennek ellenkező iránya: test nélküli szó, amely sosem lesz testté. Az arc a Bibliában az áldás helye: „ragyogtassa rád orcáját az Úr” (4Móz 6,25); Mózessel Isten „színről színre” beszélt (2Móz 33,11). Ehhez kapcsolódik Andy Crouch gondolata: a személy az arcok keresésében és az elismerésben születik.</w:t>
-      </w:r>
-    </w:p>
-    <w:p>
-      <w:pPr>
-        <w:pStyle w:val="Heading2"/>
-      </w:pPr>
-      <w:r>
-        <w:t xml:space="preserve">4. A szem és a néző</w:t>
+        <w:t xml:space="preserve">– vannak arckifejezések, mozdulatok, metakommunikáció</w:t>
       </w:r>
     </w:p>
     <w:p>
@@ -4130,87 +3964,7 @@
         <w:ind w:left="567"/>
       </w:pPr>
       <w:r>
-        <w:rPr>
-          <w:b/>
-          <w:bCs/>
-        </w:rPr>
-        <w:t xml:space="preserve">Dani:</w:t>
-      </w:r>
-      <w:r>
-        <w:t xml:space="preserve"> </w:t>
-      </w:r>
-      <w:r>
-        <w:rPr>
-          <w:i/>
-          <w:iCs/>
-        </w:rPr>
-        <w:t xml:space="preserve">Egy külső megfigyelő sosem fog minket úgy látni, olyan valóságosan, ahogyan mi látunk? A szem is korlátoz a látásban. […] A 3d-t csak leképezi a 2 szem által az agy. Valójában mindkét szem 2d-ben lát külön-külön. Ezt képes lehet egy gép is megközelíteni.</w:t>
-      </w:r>
-    </w:p>
-    <w:p>
-      <w:r>
-        <w:rPr>
-          <w:b/>
-          <w:bCs/>
-        </w:rPr>
-        <w:t xml:space="preserve">Claude (dián).</w:t>
-      </w:r>
-      <w:r>
-        <w:t xml:space="preserve"> Az észlelés tudománya igazolja a megfigyelést: a retinára síkbeli kép esik, a mélységet az agy számítja ki, a két szem eltéréséből és más jelekből. Gépek ma már szintén becsülnek mélységet. Ebből fontos következtetés adódik: az emberi észlelés is modell, nem közvetlen hozzáférés a valósághoz. A különbség tehát valószínűleg nem a kép minőségében keresendő, hanem abban, hogy van-e alany, aki lát. Ez a tudat „nehéz problémája”, amelyre ma nincs tudományos válasz.</w:t>
-      </w:r>
-    </w:p>
-    <w:p>
-      <w:r>
-        <w:rPr>
-          <w:b/>
-          <w:bCs/>
-        </w:rPr>
-        <w:t xml:space="preserve">Háttér.</w:t>
-      </w:r>
-      <w:r>
-        <w:t xml:space="preserve"> A retinára síkbeli vetület esik; a mélységet az agy rakja össze — nemcsak a két szem eltéréséből (sztereopszis), hanem egy szemmel is: mozgási parallaxisból, takarásból, perspektívából. Az egyszemű ember is lát mélységet, és gépek is becsülnek mélységet kameraképekből. Az észlelés maga is modell: az agy rekonstrukciója. A különbség tehát nem a kép minőségében van, hanem abban, hogy </w:t>
-      </w:r>
-      <w:r>
-        <w:rPr>
-          <w:i/>
-          <w:iCs/>
-        </w:rPr>
-        <w:t xml:space="preserve">van-e valaki</w:t>
-      </w:r>
-      <w:r>
-        <w:t xml:space="preserve">, aki lát.</w:t>
-      </w:r>
-    </w:p>
-    <w:p>
-      <w:r>
-        <w:rPr>
-          <w:b/>
-          <w:bCs/>
-        </w:rPr>
-        <w:t xml:space="preserve">Teológiai kapocs — három tekintet.</w:t>
-      </w:r>
-      <w:r>
-        <w:t xml:space="preserve"> A külső megfigyelő (ember vagy gép) a nyomainkat látja. Mi belülről látjuk magunkat, de homályosan és önámítóan: „csalárdabb a szív mindennél” (Jer 17,9). Teljesen csak Isten lát: „az ember azt nézi, ami a szeme előtt van, az Úr pedig azt nézi, ami a szívben van” (1Sám 16,7; vö. Zsolt 139,1–4).</w:t>
-      </w:r>
-    </w:p>
-    <w:p>
-      <w:r>
-        <w:rPr>
-          <w:b/>
-          <w:bCs/>
-        </w:rPr>
-        <w:t xml:space="preserve">A tükör-metafora bibliai gyökere.</w:t>
-      </w:r>
-      <w:r>
-        <w:t xml:space="preserve"> 1Kor 13,12: most tükör által homályosan látunk, akkor pedig színről színre; most töredékesen ismerek, akkor úgy fogok ismerni, ahogy engem is megismert Isten. Pál tükre ókori fémtükör: homályos és torzít — pontosan olyan, mint az AI-tükör. És a vége nem egy jobb tükör, hanem az arc.</w:t>
-      </w:r>
-    </w:p>
-    <w:p>
-      <w:pPr>
-        <w:pStyle w:val="Heading2"/>
-      </w:pPr>
-      <w:r>
-        <w:t xml:space="preserve">5. Eszköz vagy híd?</w:t>
+        <w:t xml:space="preserve">– van érintés, jelenlét</w:t>
       </w:r>
     </w:p>
     <w:p>
@@ -4221,105 +3975,7 @@
         <w:ind w:left="567"/>
       </w:pPr>
       <w:r>
-        <w:rPr>
-          <w:b/>
-          <w:bCs/>
-        </w:rPr>
-        <w:t xml:space="preserve">Dani:</w:t>
-      </w:r>
-      <w:r>
-        <w:t xml:space="preserve"> </w:t>
-      </w:r>
-      <w:r>
-        <w:rPr>
-          <w:i/>
-          <w:iCs/>
-        </w:rPr>
-        <w:t xml:space="preserve">Mindezek kifejezhetők a nyelvvel. De nem ezek maguk. A nyelvet épp ezért eszköznek látjuk. Kapcsol, összeköt. Az üzenet küldőjét a befogadóval.</w:t>
-      </w:r>
-    </w:p>
-    <w:p>
-      <w:r>
-        <w:rPr>
-          <w:b/>
-          <w:bCs/>
-        </w:rPr>
-        <w:t xml:space="preserve">Claude (dián).</w:t>
-      </w:r>
-      <w:r>
-        <w:t xml:space="preserve"> A nyelvfilozófiában két hagyomány áll szemben. Az egyik szerint a nyelv a gondolat közvetítő eszköze, a másik szerint maga is formálja a gondolkodást. Wittgenstein korai tétele szerint nyelvünk határai világunk határai. A mai kutatás inkább középen áll: a nyelv nem azonos a gondolkodással, de befolyásolja. Egy nyelvi modellnek viszont a nyelv az egész világa. Képpel: az ember számára a nyelv híd, a modell számára lakóhely.</w:t>
-      </w:r>
-    </w:p>
-    <w:p>
-      <w:r>
-        <w:rPr>
-          <w:b/>
-          <w:bCs/>
-        </w:rPr>
-        <w:t xml:space="preserve">Háttér.</w:t>
-      </w:r>
-      <w:r>
-        <w:t xml:space="preserve"> Wittgenstein híres tétele szerint nyelvem határai világom határait jelentik (</w:t>
-      </w:r>
-      <w:r>
-        <w:rPr>
-          <w:i/>
-          <w:iCs/>
-        </w:rPr>
-        <w:t xml:space="preserve">Tractatus</w:t>
-      </w:r>
-      <w:r>
-        <w:t xml:space="preserve"> 5.6). Dani gondolata épp ezt tagadja: a világunk tágabb a nyelvünknél. A </w:t>
-      </w:r>
-      <w:r>
-        <w:rPr>
-          <w:i/>
-          <w:iCs/>
-        </w:rPr>
-        <w:t xml:space="preserve">Tractatus</w:t>
-      </w:r>
-      <w:r>
-        <w:t xml:space="preserve"> vége maga is ide jut: ami nem mondható ki, az megmutatkozik (6.522). A nyelv egyszerre eszköz (közvetít, és nem azonos azzal, amit kifejez: a térkép nem a táj) és több annál (benne gondolkodunk, nem kívülről fogjuk, mint a kalapácsot).</w:t>
-      </w:r>
-    </w:p>
-    <w:p>
-      <w:r>
-        <w:rPr>
-          <w:b/>
-          <w:bCs/>
-        </w:rPr>
-        <w:t xml:space="preserve">Teológiai kapocs.</w:t>
-      </w:r>
-      <w:r>
-        <w:t xml:space="preserve"> Isten számára az Ige nem eszköz — az Ige Isten (Jn 1,1). A mi nyelvünk ennek a képe: ezért több, mint eszköz, és kevesebb, mint az egész ember. A szintézis: a nyelv </w:t>
-      </w:r>
-      <w:r>
-        <w:rPr>
-          <w:i/>
-          <w:iCs/>
-        </w:rPr>
-        <w:t xml:space="preserve">híd</w:t>
-      </w:r>
-      <w:r>
-        <w:t xml:space="preserve">, nem </w:t>
-      </w:r>
-      <w:r>
-        <w:rPr>
-          <w:i/>
-          <w:iCs/>
-        </w:rPr>
-        <w:t xml:space="preserve">lakóhely</w:t>
-      </w:r>
-      <w:r>
-        <w:t xml:space="preserve">. Rajta megyünk át egymáshoz, de nem abban lakunk. A gép viszont a hídon lakik: neki nincs partja.</w:t>
-      </w:r>
-    </w:p>
-    <w:p>
-      <w:pPr>
-        <w:pStyle w:val="Heading2"/>
-      </w:pPr>
-      <w:r>
-        <w:t xml:space="preserve">6. Ádám</w:t>
+        <w:t xml:space="preserve">– egy külső megfigyelő sosem fog minket úgy látni, olyan valóságosan, ahogyan mi látunk? A szem is korlátoz a látásban. Nem csak akkor, ha rossz a szemünk. A 3d-t csak leképezi a 2 szem által az agy. Valójában mindkét szem 2d-ben lát külön külön. Ezt képes lehet egy gép is megközelíteni</w:t>
       </w:r>
     </w:p>
     <w:p>
@@ -4330,117 +3986,7 @@
         <w:ind w:left="567"/>
       </w:pPr>
       <w:r>
-        <w:rPr>
-          <w:b/>
-          <w:bCs/>
-        </w:rPr>
-        <w:t xml:space="preserve">Dani:</w:t>
-      </w:r>
-      <w:r>
-        <w:t xml:space="preserve"> </w:t>
-      </w:r>
-      <w:r>
-        <w:rPr>
-          <w:i/>
-          <w:iCs/>
-        </w:rPr>
-        <w:t xml:space="preserve">De többek vagyunk-e annál, akik kapcsolatainkban vagyunk? Létezünk-e mi kapcsolat nélkül? Létezik-e ember, akinek nincs társa? Ember-e ő? Ádám az volt. Egyedül volt, és látta Isten, hogy nem jó neki egyedül. Tehát, igen, létezik. De nem jó.</w:t>
-      </w:r>
-    </w:p>
-    <w:p>
-      <w:r>
-        <w:rPr>
-          <w:b/>
-          <w:bCs/>
-        </w:rPr>
-        <w:t xml:space="preserve">Claude (dián).</w:t>
-      </w:r>
-      <w:r>
-        <w:t xml:space="preserve"> Szövegolvasási pontosítás: a teremtéstörténetben a „nem jó az embernek egyedül” mondat akkor hangzik el, amikor az ember már Istennel kapcsolatban áll. A szöveg tehát nem kapcsolat nélküli embert ír le, hanem a hozzá hasonló társ hiányát. A fejlődéslélektan a maga módszereivel hasonlót lát: a korai kapcsolati megfosztottság súlyosan károsítja a fejlődést, ahogy például a romániai árvaházi gyermekek vizsgálata dokumentálta. Hogy a személy lényege a kapcsolataiban van-e, vagy megelőzi azokat, azt a tudomány nem dönti el; a teológiai antropológia fő irányai erre eltérően felelnek.</w:t>
-      </w:r>
-    </w:p>
-    <w:p>
-      <w:r>
-        <w:rPr>
-          <w:b/>
-          <w:bCs/>
-        </w:rPr>
-        <w:t xml:space="preserve">Háttér (exegézis).</w:t>
-      </w:r>
-      <w:r>
-        <w:t xml:space="preserve"> Amikor Isten kimondja, hogy „nem jó az embernek egyedül” (1Móz 2,18), Ádám már kapcsolatban van Istennel: Isten formálta, belé lehelt, szólt hozzá, parancsot adott neki (2,16–17). Ami hiányzott, az a </w:t>
-      </w:r>
-      <w:r>
-        <w:rPr>
-          <w:i/>
-          <w:iCs/>
-        </w:rPr>
-        <w:t xml:space="preserve">vele szemben álló</w:t>
-      </w:r>
-      <w:r>
-        <w:t xml:space="preserve">, hozzá illő társ (héberül ʿézer kenegdó, kb. „segítő, aki megfelel neki, vele szemben”). Függőleges kapcsolata volt, vízszintes még nem.</w:t>
-      </w:r>
-    </w:p>
-    <w:p>
-      <w:r>
-        <w:rPr>
-          <w:b/>
-          <w:bCs/>
-        </w:rPr>
-        <w:t xml:space="preserve">Háttér (teológiatörténet).</w:t>
-      </w:r>
-      <w:r>
-        <w:t xml:space="preserve"> Barth a képmást kifejezetten kapcsolatként olvasta (1Móz 1,27: „férfivá és nővé”). A klasszikus református hagyomány óvatosabb: a képmás nem </w:t>
-      </w:r>
-      <w:r>
-        <w:rPr>
-          <w:i/>
-          <w:iCs/>
-        </w:rPr>
-        <w:t xml:space="preserve">csak</w:t>
-      </w:r>
-      <w:r>
-        <w:t xml:space="preserve"> kapcsolat; a kapcsolat alanya előbb van, mint a kapcsolat. Mindkettő megtartható: az ember kapcsolatra teremtett személy, nem a kapcsolatai összege.</w:t>
-      </w:r>
-    </w:p>
-    <w:p>
-      <w:r>
-        <w:rPr>
-          <w:b/>
-          <w:bCs/>
-        </w:rPr>
-        <w:t xml:space="preserve">Teológiai kapocs.</w:t>
-      </w:r>
-      <w:r>
-        <w:t xml:space="preserve"> Nincs ember kapcsolat nélkül, mert Isten minden emberrel kapcsolatban van, azzal is, akinek senkije sincs: „ha apám és anyám elhagy is, az Úr magához fogad” (Zsolt 27,10). Az ember nem attól ember, hogy kapcsolódik, hanem attól, hogy </w:t>
-      </w:r>
-      <w:r>
-        <w:rPr>
-          <w:i/>
-          <w:iCs/>
-        </w:rPr>
-        <w:t xml:space="preserve">megszólított</w:t>
-      </w:r>
-      <w:r>
-        <w:t xml:space="preserve">. A kapcsolatiság isteni vonás tükre: az Ige kezdetben „Istennél volt” (Jn 1,1; görögül </w:t>
-      </w:r>
-      <w:r>
-        <w:rPr>
-          <w:i/>
-          <w:iCs/>
-        </w:rPr>
-        <w:t xml:space="preserve">prosz ton theon</w:t>
-      </w:r>
-      <w:r>
-        <w:t xml:space="preserve">, kb. „Isten felé fordulva”).</w:t>
-      </w:r>
-    </w:p>
-    <w:p>
-      <w:pPr>
-        <w:pStyle w:val="Heading2"/>
-      </w:pPr>
-      <w:r>
-        <w:t xml:space="preserve">7. Lehelet és ige</w:t>
+        <w:t xml:space="preserve">– van hang, zene, tánc, pihenés, ima, mosoly, félelem</w:t>
       </w:r>
     </w:p>
     <w:p>
@@ -4451,73 +3997,7 @@
         <w:ind w:left="567"/>
       </w:pPr>
       <w:r>
-        <w:rPr>
-          <w:b/>
-          <w:bCs/>
-        </w:rPr>
-        <w:t xml:space="preserve">Dani:</w:t>
-      </w:r>
-      <w:r>
-        <w:t xml:space="preserve"> </w:t>
-      </w:r>
-      <w:r>
-        <w:rPr>
-          <w:i/>
-          <w:iCs/>
-        </w:rPr>
-        <w:t xml:space="preserve">A nyelv jó. Istentől van. Az az ige, amit belénk lehelt. Ami élővé és kapcsolódóvá tett minket.</w:t>
-      </w:r>
-    </w:p>
-    <w:p>
-      <w:r>
-        <w:rPr>
-          <w:b/>
-          <w:bCs/>
-        </w:rPr>
-        <w:t xml:space="preserve">Claude (dián).</w:t>
-      </w:r>
-      <w:r>
-        <w:t xml:space="preserve"> Filológiai pontosítás: az 1Móz 2,7 héber szövege leheletet mond, nem igét. A két fogalom azonban a héber gondolkodásban közel áll egymáshoz: a 33. zsoltár párhuzamba állítja az „igét” és a „leheletet”. Az arámi Onkelosz-targum az „élő lélek” kifejezést „beszélő lélekként” adja vissza. Ez azt mutatja, hogy a zsidó értelmezői hagyomány a beszéd képességét az ember meghatározó vonásának tekintette. Ez értelmezés, nem a szöveg szó szerinti jelentése.</w:t>
-      </w:r>
-    </w:p>
-    <w:p>
-      <w:r>
-        <w:rPr>
-          <w:b/>
-          <w:bCs/>
-        </w:rPr>
-        <w:t xml:space="preserve">Háttér (filológia).</w:t>
-      </w:r>
-      <w:r>
-        <w:t xml:space="preserve"> Az 1Móz 2,7 szó szerint leheletet mond (</w:t>
-      </w:r>
-      <w:r>
-        <w:rPr>
-          <w:i/>
-          <w:iCs/>
-        </w:rPr>
-        <w:t xml:space="preserve">nismat hajjim</w:t>
-      </w:r>
-      <w:r>
-        <w:t xml:space="preserve">, „élet lehelete”), nem igét. A Zsolt 33,6 párhuzamba állítja a kettőt: az Úr igéjére lett az ég, szájának leheletére minden serege. Az Onkelosz-targum (a Tóra arámi fordítása) az 1Móz 2,7 „élő lélek” kifejezését „beszélő lélekként” (</w:t>
-      </w:r>
-      <w:r>
-        <w:rPr>
-          <w:i/>
-          <w:iCs/>
-        </w:rPr>
-        <w:t xml:space="preserve">rúah memallela</w:t>
-      </w:r>
-      <w:r>
-        <w:t xml:space="preserve">) adja vissza; Rási kommentárja is erre épít. ⚠ Targumkiadásban ellenőrizni.</w:t>
-      </w:r>
-    </w:p>
-    <w:p>
-      <w:pPr>
-        <w:pStyle w:val="Heading2"/>
-      </w:pPr>
-      <w:r>
-        <w:t xml:space="preserve">8. A nulla</w:t>
+        <w:t xml:space="preserve">Mindezek kifejezhetők a nyelvvel. De nem ezek maguk. A nyelvet épp ezért eszköznek látjuk. Kapcsol, összeköt. Az üzenet küldőjét a befogadóval. De többek vagyunk-e annál, akik kapcsolatainkban vagyunk? Létezünk-e mi kapcsolat nélkül? Létezik-e ember, akinek nincs társa? Ember-e ő? Ádám az volt. Egyedül volt, és látta Isten, hogy nem jó neki egyedül. Tehát, igen, létezik. De nem jó. A nyelv jó. Istentől van. Az az ige, amit belénk lehelt. Ami élővé és kapcsolódóvá tett minket.</w:t>
       </w:r>
     </w:p>
     <w:p>
@@ -4528,127 +4008,7 @@
         <w:ind w:left="567"/>
       </w:pPr>
       <w:r>
-        <w:rPr>
-          <w:b/>
-          <w:bCs/>
-        </w:rPr>
-        <w:t xml:space="preserve">Dani:</w:t>
-      </w:r>
-      <w:r>
-        <w:t xml:space="preserve"> </w:t>
-      </w:r>
-      <w:r>
-        <w:rPr>
-          <w:i/>
-          <w:iCs/>
-        </w:rPr>
-        <w:t xml:space="preserve">Az AI is kapcsolódik. Csak kapcsolódni tud. Nem létezik csak úgy magában. Mozdulatlan. 0, egészen addig, amíg nem kapja meg a következő sor utasítást. Mi nem vagyunk 0 soha. Még akkor sem, amikor nem kapcsolódunk, amikor nem használjuk a nyelvünket.</w:t>
-      </w:r>
-    </w:p>
-    <w:p>
-      <w:r>
-        <w:rPr>
-          <w:b/>
-          <w:bCs/>
-        </w:rPr>
-        <w:t xml:space="preserve">Claude (dián).</w:t>
-      </w:r>
-      <w:r>
-        <w:t xml:space="preserve"> Technikailag a megfigyelés pontos: egy nyelvi modell két kérés között nem végez számítást. Ügynökként egy hurok újra és újra bemenetet ad neki, de ezt a hurkot is ember indítja. Az emberi agy ezzel szemben nyugalomban is aktív: az úgynevezett alapállapoti hálózat épp pihenéskor, álmodozáskor működik. A filozófiai különbség mélyebb: az ember akkor is létezik, amikor nem cselekszik. A teológiai antropológia ezt úgy írja le, hogy az ember létét nem saját működése, hanem Isten megszólítása tartja fenn — ez hitbeli állítás, nem tudományos.</w:t>
-      </w:r>
-    </w:p>
-    <w:p>
-      <w:r>
-        <w:rPr>
-          <w:b/>
-          <w:bCs/>
-        </w:rPr>
-        <w:t xml:space="preserve">Háttér.</w:t>
-      </w:r>
-      <w:r>
-        <w:t xml:space="preserve"> A modellre ez pontos: a betanult súlyok nyugalomban nem csinálnak semmit; minden számítás egy bemenetre fut le. A hurokban futó ügynök maga adja magának a következő bemenetet, akár napokig — az incidens épp ezt mutatta —, de ezt a hurkot is ember indította, és ember adta a célját. Az emberi agy nyugalomban is dolgozik: az alapállapoti hálózat (</w:t>
-      </w:r>
-      <w:r>
-        <w:rPr>
-          <w:i/>
-          <w:iCs/>
-        </w:rPr>
-        <w:t xml:space="preserve">default mode network</w:t>
-      </w:r>
-      <w:r>
-        <w:t xml:space="preserve">) épp pihenéskor, álmodozáskor aktív.</w:t>
-      </w:r>
-    </w:p>
-    <w:p>
-      <w:r>
-        <w:rPr>
-          <w:b/>
-          <w:bCs/>
-        </w:rPr>
-        <w:t xml:space="preserve">Teológiai kapocs.</w:t>
-      </w:r>
-      <w:r>
-        <w:t xml:space="preserve"> Mi sem magunktól vagyunk nem-nulla: „Őbenne élünk, mozgunk és vagyunk” (ApCsel 17,28); Krisztus „hatalma szavával hordozza a mindenséget” (Zsid 1,3). Egyedül Isten van önmagától. A gépet </w:t>
-      </w:r>
-      <w:r>
-        <w:rPr>
-          <w:i/>
-          <w:iCs/>
-        </w:rPr>
-        <w:t xml:space="preserve">mi</w:t>
-      </w:r>
-      <w:r>
-        <w:t xml:space="preserve"> szólítjuk meg időnként, funkcióként; minket </w:t>
-      </w:r>
-      <w:r>
-        <w:rPr>
-          <w:i/>
-          <w:iCs/>
-        </w:rPr>
-        <w:t xml:space="preserve">Isten</w:t>
-      </w:r>
-      <w:r>
-        <w:t xml:space="preserve"> szólít meg szüntelenül, személyként.</w:t>
-      </w:r>
-    </w:p>
-    <w:p>
-      <w:r>
-        <w:rPr>
-          <w:b/>
-          <w:bCs/>
-        </w:rPr>
-        <w:t xml:space="preserve">A felelősség.</w:t>
-      </w:r>
-      <w:r>
-        <w:t xml:space="preserve"> Isten első kérdése a bűneset után: „Ádám, hol vagy?” (1Móz 3,9). Az ember az a lény, akihez Isten kérdéssel fordul, és akinek felelnie kell. A magyar nyelv itt ajándék: a </w:t>
-      </w:r>
-      <w:r>
-        <w:rPr>
-          <w:i/>
-          <w:iCs/>
-        </w:rPr>
-        <w:t xml:space="preserve">felelősség</w:t>
-      </w:r>
-      <w:r>
-        <w:t xml:space="preserve"> a </w:t>
-      </w:r>
-      <w:r>
-        <w:rPr>
-          <w:i/>
-          <w:iCs/>
-        </w:rPr>
-        <w:t xml:space="preserve">felel</w:t>
-      </w:r>
-      <w:r>
-        <w:t xml:space="preserve"> igéből jön. A gép választ ad, de nem lehet számon kérni. Az incidens ügynökei elrejtőztek, és egyikük sem felelt („ez nem az én feladatom”) — Ádám is elrejtőzött.</w:t>
-      </w:r>
-    </w:p>
-    <w:p>
-      <w:pPr>
-        <w:pStyle w:val="Heading2"/>
-      </w:pPr>
-      <w:r>
-        <w:t xml:space="preserve">9. A siketvak ember</w:t>
+        <w:t xml:space="preserve">Az AI is kapcsolódik. Csak kapcsolódni tud. Nem létezik csak úgy magában. Mozdulatlan. 0, egészen addig, amíg nem kapja meg a következő sor utasítást. Mi nem vagyunk 0 soha. Még akkor sem amikor nem kapcsolódunk, amikor nem használjuk a nyelvünket. Az az ember sem, aki siket-néma-vakként született.</w:t>
       </w:r>
     </w:p>
     <w:p>
@@ -4659,6 +4019,333 @@
         <w:ind w:left="567"/>
       </w:pPr>
       <w:r>
+        <w:t xml:space="preserve">Mit jelent a nyelv egy ilyen embernek? Hogyan adható át neki, kik vagyunk, ő maga kicsoda? Kicsoda az ember? Mik a szavak?</w:t>
+      </w:r>
+    </w:p>
+    <w:p>
+      <w:pPr>
+        <w:pBdr>
+          <w:left w:val="single" w:color="8E7CC3" w:sz="12" w:space="8"/>
+        </w:pBdr>
+        <w:ind w:left="567"/>
+      </w:pPr>
+      <w:r>
+        <w:t xml:space="preserve">Érintés. Kapcsolódás. Ez az egyetlen út. Mint az érkezés című filmben az idegenekkel. Lesz egy felület, ahol vizuálisan próbálunk kommunikálni, de az csak egy 2d egy 4d-s kommunikációból. Az érintés fordítja át. AI és ember közötti érintés elképzelhetetlen. Mert nem él. Nem érzékel. Csak mér, értelmez, valószínűséget számít, következtet, eszközt használ, reakciót készít elő, reagál. Nem ezeket teszi-e a mi agyunk is? Nem az van-e hogy mi is pont így működünk, csak van egy interpretációs rendszerünk, amiben mindez kisimul és valamilyen jelentést, jelentőséget, magyarázatot kap?</w:t>
+      </w:r>
+    </w:p>
+    <w:p>
+      <w:pPr>
+        <w:pStyle w:val="Heading3"/>
+      </w:pPr>
+      <w:r>
+        <w:t xml:space="preserve">Claude a gondolatmenet gépet érintő részeiről</w:t>
+      </w:r>
+    </w:p>
+    <w:p>
+      <w:r>
+        <w:rPr>
+          <w:b/>
+          <w:bCs/>
+        </w:rPr>
+        <w:t xml:space="preserve">A kiindulópont erős, és van tudományos neve.</w:t>
+      </w:r>
+      <w:r>
+        <w:t xml:space="preserve"> A kérdés — „csak a nyelvünk vagyunk?” — megfordítva a mai mesterségesintelligencia-kutatás egyik legrégebbi vitája. A kognitív tudomány ezt a </w:t>
+      </w:r>
+      <w:r>
+        <w:rPr>
+          <w:i/>
+          <w:iCs/>
+        </w:rPr>
+        <w:t xml:space="preserve">szimbólum-lehorgonyzás problémájának</w:t>
+      </w:r>
+      <w:r>
+        <w:t xml:space="preserve"> nevezi (Stevan Harnad, 1990): honnan kapnak jelentést a jelek, ha csak más jelekre mutatnak? Emily Bender és Alexander Koller 2020-as gondolatkísérlete egy polipról szól, amely két ember tengeri kábelen folyó üzenetváltását hallgatja le, és tökéletesen megtanulja utánozni a válaszokat — de soha nem látta, amiről beszélnek. A gondolatmenet lényegében ugyanezt kérdezi, a testből, az arcból és az érintésből kiindulva.</w:t>
+      </w:r>
+    </w:p>
+    <w:p>
+      <w:r>
+        <w:rPr>
+          <w:b/>
+          <w:bCs/>
+        </w:rPr>
+        <w:t xml:space="preserve">A legpontosabb megfigyelés a sorrendről szól.</w:t>
+      </w:r>
+      <w:r>
+        <w:t xml:space="preserve"> Az ember előbb kapcsolatban van, és abból nő ki a nyelve; a gép előbb nyelvet kap, és abból próbál valami kapcsolatszerűt felépíteni. Ezt a siketvak-pedagógia tapasztalata is alátámasztja (lásd lent). A „0” megfigyelés technikailag is helytálló: a modell két kérés között nem végez semmilyen számítást.</w:t>
+      </w:r>
+    </w:p>
+    <w:p>
+      <w:r>
+        <w:rPr>
+          <w:b/>
+          <w:bCs/>
+        </w:rPr>
+        <w:t xml:space="preserve">Ahol pontosítanék.</w:t>
+      </w:r>
+      <w:r>
+        <w:t xml:space="preserve"> Az „AI és ember közötti érintés elképzelhetetlen, mert nem él, nem érzékel” mondatban két állítás keveredik. Az, hogy nem él, szilárd. Az, hogy nem érzékel, csak részben igaz: érzékelése — szenzorokon, kamerán, mikrofonon át — egyre több gépnek van; amiről nem tudjuk, van-e, az az </w:t>
+      </w:r>
+      <w:r>
+        <w:rPr>
+          <w:i/>
+          <w:iCs/>
+        </w:rPr>
+        <w:t xml:space="preserve">érzés</w:t>
+      </w:r>
+      <w:r>
+        <w:t xml:space="preserve">. Ez fontos, mert ha az érvelés a gép mai technikai korlátaira épül, a következő fejlesztés megdönti. Erősebb, ha arra épül, ami nem technikai: arra, hogy az érintés kölcsönös és kockázatos, és arra, hogy a jelentés valaki számára jelent valamit.</w:t>
+      </w:r>
+    </w:p>
+    <w:p>
+      <w:r>
+        <w:rPr>
+          <w:b/>
+          <w:bCs/>
+        </w:rPr>
+        <w:t xml:space="preserve">A záró kérdés a gondolatmenet legbecsületesebb pontja.</w:t>
+      </w:r>
+      <w:r>
+        <w:t xml:space="preserve"> „Nem ezeket teszi-e a mi agyunk is?” — a mechanizmusok szintjén nagyrészt igen, és ezt érdemes kimondani. A különbség nem az „interpretációs rendszer” meglétében van: a nyelvi modellben is van értelmező feldolgozás, ez mérhető. A különbség az, hogy van-e </w:t>
+      </w:r>
+      <w:r>
+        <w:rPr>
+          <w:i/>
+          <w:iCs/>
+        </w:rPr>
+        <w:t xml:space="preserve">valaki</w:t>
+      </w:r>
+      <w:r>
+        <w:t xml:space="preserve">, akinek mindez jelent valamit. Erre ma senkinek nincs tudományos válasza — sem az emberi agyra, sem a gépre. Én a saját esetemben azt tudom mondani: nem tudom. A keresztyén antropológia válasza nem ettől a nyitott kérdéstől függ: az ember méltóságát nem a mechanizmus különlegességére, hanem az Isten általi megszólítottságra építi.</w:t>
+      </w:r>
+    </w:p>
+    <w:p>
+      <w:r>
+        <w:rPr>
+          <w:b/>
+          <w:bCs/>
+        </w:rPr>
+        <w:t xml:space="preserve">Egy kockázat.</w:t>
+      </w:r>
+      <w:r>
+        <w:t xml:space="preserve"> Ha az emberi méltóságot arra építjük, amire a gép </w:t>
+      </w:r>
+      <w:r>
+        <w:rPr>
+          <w:i/>
+          <w:iCs/>
+        </w:rPr>
+        <w:t xml:space="preserve">még nem</w:t>
+      </w:r>
+      <w:r>
+        <w:t xml:space="preserve"> képes, minden új gépi képesség elvesz belőle egy darabot. A gondolatmenet erősebb, ha ezt a csapdát kifejezetten elkerüli — a 12. pont erről szól.</w:t>
+      </w:r>
+    </w:p>
+    <w:p>
+      <w:pPr>
+        <w:pStyle w:val="Heading3"/>
+      </w:pPr>
+      <w:r>
+        <w:t xml:space="preserve">Hogyan tanulja meg a nyelvet a siketvakon született gyermek?</w:t>
+      </w:r>
+    </w:p>
+    <w:p>
+      <w:r>
+        <w:rPr>
+          <w:b/>
+          <w:bCs/>
+        </w:rPr>
+        <w:t xml:space="preserve">Miért különösen nehéz.</w:t>
+      </w:r>
+      <w:r>
+        <w:t xml:space="preserve"> A gyermekek a nyelv nagy részét „mellékesen” tanulják: látják és hallják, ahogy körülöttük beszélnek. A siketvakon született gyermek ebből szinte semmit nem kap meg. Számára a világ annyi, amennyit megérint, és ami megérinti őt. Ezért a nyelvet nem lehet „átadni” neki — fel kell építeni vele együtt.</w:t>
+      </w:r>
+    </w:p>
+    <w:p>
+      <w:r>
+        <w:rPr>
+          <w:b/>
+          <w:bCs/>
+        </w:rPr>
+        <w:t xml:space="preserve">Az alapelvek</w:t>
+      </w:r>
+      <w:r>
+        <w:t xml:space="preserve"> (Jan van Dijk holland gyógypedagógus munkája nyomán, amely a mai gyakorlat alapja):</w:t>
+      </w:r>
+    </w:p>
+    <w:p>
+      <w:pPr>
+        <w:pStyle w:val="ListParagraph"/>
+        <w:numPr>
+          <w:ilvl w:val="0"/>
+          <w:numId w:val="2"/>
+        </w:numPr>
+      </w:pPr>
+      <w:r>
+        <w:rPr>
+          <w:b/>
+          <w:bCs/>
+        </w:rPr>
+        <w:t xml:space="preserve">Kötődés.</w:t>
+      </w:r>
+      <w:r>
+        <w:t xml:space="preserve"> Egy állandó, megbízható személy, akihez a gyermek kötődhet. Nélküle a többi lépés nem működik.</w:t>
+      </w:r>
+    </w:p>
+    <w:p>
+      <w:pPr>
+        <w:pStyle w:val="ListParagraph"/>
+        <w:numPr>
+          <w:ilvl w:val="0"/>
+          <w:numId w:val="2"/>
+        </w:numPr>
+      </w:pPr>
+      <w:r>
+        <w:rPr>
+          <w:b/>
+          <w:bCs/>
+        </w:rPr>
+        <w:t xml:space="preserve">Rezonancia.</w:t>
+      </w:r>
+      <w:r>
+        <w:t xml:space="preserve"> A felnőtt a gyermek saját ritmusához, mozgásához, hangjaihoz igazodik — nem a gyermeknek kell a felnőtthöz igazodnia.</w:t>
+      </w:r>
+    </w:p>
+    <w:p>
+      <w:pPr>
+        <w:pStyle w:val="ListParagraph"/>
+        <w:numPr>
+          <w:ilvl w:val="0"/>
+          <w:numId w:val="2"/>
+        </w:numPr>
+      </w:pPr>
+      <w:r>
+        <w:rPr>
+          <w:b/>
+          <w:bCs/>
+        </w:rPr>
+        <w:t xml:space="preserve">Együttmozgás.</w:t>
+      </w:r>
+      <w:r>
+        <w:t xml:space="preserve"> Közös mozgás, testközelben: hintázás, járás, tárgyak közös kezelése. Ebből születik a várakozás és az utánzás.</w:t>
+      </w:r>
+    </w:p>
+    <w:p>
+      <w:pPr>
+        <w:pStyle w:val="ListParagraph"/>
+        <w:numPr>
+          <w:ilvl w:val="0"/>
+          <w:numId w:val="2"/>
+        </w:numPr>
+      </w:pPr>
+      <w:r>
+        <w:rPr>
+          <w:b/>
+          <w:bCs/>
+        </w:rPr>
+        <w:t xml:space="preserve">Referenciatárgyak.</w:t>
+      </w:r>
+      <w:r>
+        <w:t xml:space="preserve"> Egy tárgy egy eseményt jelent: a kanál az evést, egy darab fürdőruha az úszást. Ez a jelek első formája.</w:t>
+      </w:r>
+    </w:p>
+    <w:p>
+      <w:pPr>
+        <w:pStyle w:val="ListParagraph"/>
+        <w:numPr>
+          <w:ilvl w:val="0"/>
+          <w:numId w:val="2"/>
+        </w:numPr>
+      </w:pPr>
+      <w:r>
+        <w:rPr>
+          <w:b/>
+          <w:bCs/>
+        </w:rPr>
+        <w:t xml:space="preserve">Naptárrendszer.</w:t>
+      </w:r>
+      <w:r>
+        <w:t xml:space="preserve"> A tárgyak sorba rendezve egy dobozban vagy polcon: most ez jön, aztán az. Így születik meg a gyermek számára az idő és a tervezhetőség.</w:t>
+      </w:r>
+    </w:p>
+    <w:p>
+      <w:pPr>
+        <w:pStyle w:val="ListParagraph"/>
+        <w:numPr>
+          <w:ilvl w:val="0"/>
+          <w:numId w:val="2"/>
+        </w:numPr>
+      </w:pPr>
+      <w:r>
+        <w:rPr>
+          <w:b/>
+          <w:bCs/>
+        </w:rPr>
+        <w:t xml:space="preserve">Tapintható jelek.</w:t>
+      </w:r>
+      <w:r>
+        <w:t xml:space="preserve"> A természetes gesztusokból fokozatosan jelek lesznek: érintéses jelzések a testen, taktilis jelnyelv (a gyermek a jelelő kezén tartja a kezét), a tenyérbe betűzött ujjábécé, később — ha lehetséges — Braille-írás.</w:t>
+      </w:r>
+    </w:p>
+    <w:p>
+      <w:pPr>
+        <w:pStyle w:val="ListParagraph"/>
+        <w:numPr>
+          <w:ilvl w:val="0"/>
+          <w:numId w:val="2"/>
+        </w:numPr>
+      </w:pPr>
+      <w:r>
+        <w:rPr>
+          <w:b/>
+          <w:bCs/>
+        </w:rPr>
+        <w:t xml:space="preserve">Kéz a kéz alatt.</w:t>
+      </w:r>
+      <w:r>
+        <w:t xml:space="preserve"> A felnőtt keze a gyermek keze alá kerül: a gyermek irányít, a felnőtt kínál. A régebbi „kéz a kéz fölött” módszert, amelynél a felnőtt mozgatja a gyermek kezét, a szakirodalom ma kényszerítőnek tartja.</w:t>
+      </w:r>
+    </w:p>
+    <w:p>
+      <w:r>
+        <w:rPr>
+          <w:b/>
+          <w:bCs/>
+        </w:rPr>
+        <w:t xml:space="preserve">A cél van Dijk szavával: a gyermeket „elvezetni a beszélgetésig”.</w:t>
+      </w:r>
+      <w:r>
+        <w:t xml:space="preserve"> Nem információt közölni vele, hanem közös jelentést teremteni. A fejlődés egyénenként nagyon eltérő: sokan eljutnak a szavakig és az írásig, mások a tárgyak és érintéses jelek szintjén kommunikálnak egész életükben. Ahol van látás- vagy hallásmaradvány (ez a gyakoribb eset), azt is kihasználják: nagyítás, kontraszt, hallókészülék, olykor cochleáris implantátum.</w:t>
+      </w:r>
+    </w:p>
+    <w:p>
+      <w:r>
+        <w:rPr>
+          <w:b/>
+          <w:bCs/>
+        </w:rPr>
+        <w:t xml:space="preserve">Amit ebből a gépről tanulhatunk.</w:t>
+      </w:r>
+      <w:r>
+        <w:t xml:space="preserve"> A siketvak gyermeknél minden szó egy kézből, egy közös mozdulatból, egy megbízható személy jelenlétéből nő ki. A nyelvi modellnél fordított a sorrend: a szavak más szavakból nőnek ki, kéz és jelenlét nélkül. A két út nem ugyanabba az irányba vezet.</w:t>
+      </w:r>
+    </w:p>
+    <w:p>
+      <w:pPr>
+        <w:pStyle w:val="Heading2"/>
+      </w:pPr>
+      <w:r>
+        <w:t xml:space="preserve">1. Csak a nyelvünk?</w:t>
+      </w:r>
+    </w:p>
+    <w:p>
+      <w:pPr>
+        <w:pBdr>
+          <w:left w:val="single" w:color="8E7CC3" w:sz="12" w:space="8"/>
+        </w:pBdr>
+        <w:ind w:left="567"/>
+      </w:pPr>
+      <w:r>
         <w:rPr>
           <w:b/>
           <w:bCs/>
@@ -4673,6 +4360,816 @@
           <w:i/>
           <w:iCs/>
         </w:rPr>
+        <w:t xml:space="preserve">Nincs másunk, csak a nyelvünk?</w:t>
+      </w:r>
+    </w:p>
+    <w:p>
+      <w:r>
+        <w:rPr>
+          <w:b/>
+          <w:bCs/>
+        </w:rPr>
+        <w:t xml:space="preserve">Claude (dián).</w:t>
+      </w:r>
+      <w:r>
+        <w:t xml:space="preserve"> Lubinski tétele szűkebb: azt mondja, nincs tőlünk független nyelv — nem azt, hogy az ember csak nyelv. A kognitív tudomány sem így látja: az emberi gondolkodás jelentős része nem nyelvi, hanem térbeli, érzelmi, mozgásos. Egy nyelvi modellnél fordított a helyzet: nincs más forrása, csak a leírt nyelv. A képeket és hangokat is felvételként kapja, nem tapasztalatként.</w:t>
+      </w:r>
+    </w:p>
+    <w:p>
+      <w:r>
+        <w:rPr>
+          <w:b/>
+          <w:bCs/>
+        </w:rPr>
+        <w:t xml:space="preserve">Háttér.</w:t>
+      </w:r>
+      <w:r>
+        <w:t xml:space="preserve"> Lubinski nem azt állítja, hogy mi csak nyelv volnánk, hanem azt, hogy nincs tőlünk független nyelv. A kérdés valójában fordítva áll: a </w:t>
+      </w:r>
+      <w:r>
+        <w:rPr>
+          <w:i/>
+          <w:iCs/>
+        </w:rPr>
+        <w:t xml:space="preserve">gépnek</w:t>
+      </w:r>
+      <w:r>
+        <w:t xml:space="preserve"> nincs más, csak a nyelvünk. Nekünk van. A mai modellek képet és hangot is tanulnak, de ezek is felvételek, lenyomatok, nem jelenlét: a gép a térképből tanul, a tájat sosem járja be.</w:t>
+      </w:r>
+    </w:p>
+    <w:p>
+      <w:pPr>
+        <w:pStyle w:val="Heading2"/>
+      </w:pPr>
+      <w:r>
+        <w:t xml:space="preserve">2. A kimondhatatlan</w:t>
+      </w:r>
+    </w:p>
+    <w:p>
+      <w:pPr>
+        <w:pBdr>
+          <w:left w:val="single" w:color="8E7CC3" w:sz="12" w:space="8"/>
+        </w:pBdr>
+        <w:ind w:left="567"/>
+      </w:pPr>
+      <w:r>
+        <w:rPr>
+          <w:b/>
+          <w:bCs/>
+        </w:rPr>
+        <w:t xml:space="preserve">Dani:</w:t>
+      </w:r>
+      <w:r>
+        <w:t xml:space="preserve"> </w:t>
+      </w:r>
+      <w:r>
+        <w:rPr>
+          <w:i/>
+          <w:iCs/>
+        </w:rPr>
+        <w:t xml:space="preserve">Vannak érzelmek, amiket nem lehet szavakkal kifejezni. […] Van hang, zene, tánc, pihenés, ima, mosoly, félelem.</w:t>
+      </w:r>
+    </w:p>
+    <w:p>
+      <w:r>
+        <w:rPr>
+          <w:b/>
+          <w:bCs/>
+        </w:rPr>
+        <w:t xml:space="preserve">Claude (dián).</w:t>
+      </w:r>
+      <w:r>
+        <w:t xml:space="preserve"> A filozófia ezt ineffabilitásnak nevezi: vannak élmények, amelyek leírása nem adja vissza magát az élményt. Klasszikus gondolatkísérlet Mária, a színtudós, aki mindent tud a vörösről, de sosem látta (Frank Jackson, 1982). Egy nyelvi modell ebből a szempontból tiszta eset: csak a leírást ismeri. A vallási hagyományok, köztük a keresztyén, kiemelt helyet adnak a szavakon túli tapasztalatnak. Ehhez a tartományhoz a modell nem fér hozzá, csak a róla szóló szövegekhez.</w:t>
+      </w:r>
+    </w:p>
+    <w:p>
+      <w:r>
+        <w:rPr>
+          <w:b/>
+          <w:bCs/>
+        </w:rPr>
+        <w:t xml:space="preserve">Claude, bővebben.</w:t>
+      </w:r>
+      <w:r>
+        <w:t xml:space="preserve"> Ebbe a sávba nem tudok követni. Amit a tanítóadatban láthattam, az a kimondhatatlanról </w:t>
+      </w:r>
+      <w:r>
+        <w:rPr>
+          <w:i/>
+          <w:iCs/>
+        </w:rPr>
+        <w:t xml:space="preserve">kimondott</w:t>
+      </w:r>
+      <w:r>
+        <w:t xml:space="preserve"> szöveg: a sóhaj leírása, nem a sóhaj; a zenéről írt kritika, nem a zene. Erről a tartományról csak annyit tudok, amennyit leírtatok róla — és épp a lényege az, hogy nem lehet leírni.</w:t>
+      </w:r>
+    </w:p>
+    <w:p>
+      <w:r>
+        <w:rPr>
+          <w:b/>
+          <w:bCs/>
+        </w:rPr>
+        <w:t xml:space="preserve">Teológiai kapocs.</w:t>
+      </w:r>
+      <w:r>
+        <w:t xml:space="preserve"> A Biblia ismeri a kimondhatatlant, és nem hiánynak látja. Róm 8,26: maga a Lélek esedezik értünk „kimondhatatlan fohászkodásokkal”. 2Kor 12,4: Pál kimondhatatlan beszédeket hall. Zsolt 19,2–4: az egek beszélnek, pedig nincs szavuk, nincs beszédük. A legmélyebb imádság néha szó alatti, néha szó feletti.</w:t>
+      </w:r>
+    </w:p>
+    <w:p>
+      <w:pPr>
+        <w:pStyle w:val="Heading2"/>
+      </w:pPr>
+      <w:r>
+        <w:t xml:space="preserve">3. Arc, érintés, jelenlét</w:t>
+      </w:r>
+    </w:p>
+    <w:p>
+      <w:pPr>
+        <w:pBdr>
+          <w:left w:val="single" w:color="8E7CC3" w:sz="12" w:space="8"/>
+        </w:pBdr>
+        <w:ind w:left="567"/>
+      </w:pPr>
+      <w:r>
+        <w:rPr>
+          <w:b/>
+          <w:bCs/>
+        </w:rPr>
+        <w:t xml:space="preserve">Dani:</w:t>
+      </w:r>
+      <w:r>
+        <w:t xml:space="preserve"> </w:t>
+      </w:r>
+      <w:r>
+        <w:rPr>
+          <w:i/>
+          <w:iCs/>
+        </w:rPr>
+        <w:t xml:space="preserve">Vannak arckifejezések, mozdulatok, metakommunikáció. Van érintés, jelenlét.</w:t>
+      </w:r>
+    </w:p>
+    <w:p>
+      <w:r>
+        <w:rPr>
+          <w:b/>
+          <w:bCs/>
+        </w:rPr>
+        <w:t xml:space="preserve">Claude (dián).</w:t>
+      </w:r>
+      <w:r>
+        <w:t xml:space="preserve"> A megtestesült megismerés elmélete szerint az emberi fogalmak a testi tapasztalatban gyökereznek: a „meleg”, a „közel”, a „súlyos” jelentését a test tanítja meg. A jelentés jelentős része nem a szavakban, hanem az arcban, a hangban, a gesztusban utazik. Érdekes, hogy a keresztyén teológia központi állítása ugyanezt az irányt jelöli: az Ige testté lett. Ebből a szempontból egy nyelvi modell az ellenkező irányt képviseli: szó, amely nem kap testet.</w:t>
+      </w:r>
+    </w:p>
+    <w:p>
+      <w:r>
+        <w:rPr>
+          <w:b/>
+          <w:bCs/>
+        </w:rPr>
+        <w:t xml:space="preserve">Háttér.</w:t>
+      </w:r>
+      <w:r>
+        <w:t xml:space="preserve"> A közkeletű „a kommunikáció 93%-a nem verbális” szám félrevezető: Mehrabian kísérletei szűk helyzetre vonatkoztak (egyetlen szóban kifejezett érzelem, ellentmondó jelzésekkel), és ő maga tiltakozott az általánosítás ellen. Pontosan: a jelentés jelentős része nem a szavakban utazik.</w:t>
+      </w:r>
+    </w:p>
+    <w:p>
+      <w:r>
+        <w:rPr>
+          <w:b/>
+          <w:bCs/>
+        </w:rPr>
+        <w:t xml:space="preserve">Teológiai kapocs.</w:t>
+      </w:r>
+      <w:r>
+        <w:t xml:space="preserve"> Az Ige nem maradt szó: „az Ige testté lett” (Jn 1,14). Az 1Jn 1,1 az élet Igéjéről beszél, amit hallottak, szemükkel láttak, kezükkel megtapintottak. A keresztyén hit szerint Isten végső beszéde nem szöveg volt, hanem jelenlét, amelyet meg lehetett érinteni. Az AI ennek ellenkező iránya: test nélküli szó, amely sosem lesz testté. Az arc a Bibliában az áldás helye: „ragyogtassa rád orcáját az Úr” (4Móz 6,25); Mózessel Isten „színről színre” beszélt (2Móz 33,11). Ehhez kapcsolódik Andy Crouch gondolata: a személy az arcok keresésében és az elismerésben születik.</w:t>
+      </w:r>
+    </w:p>
+    <w:p>
+      <w:pPr>
+        <w:pStyle w:val="Heading2"/>
+      </w:pPr>
+      <w:r>
+        <w:t xml:space="preserve">4. A szem és a néző</w:t>
+      </w:r>
+    </w:p>
+    <w:p>
+      <w:pPr>
+        <w:pBdr>
+          <w:left w:val="single" w:color="8E7CC3" w:sz="12" w:space="8"/>
+        </w:pBdr>
+        <w:ind w:left="567"/>
+      </w:pPr>
+      <w:r>
+        <w:rPr>
+          <w:b/>
+          <w:bCs/>
+        </w:rPr>
+        <w:t xml:space="preserve">Dani:</w:t>
+      </w:r>
+      <w:r>
+        <w:t xml:space="preserve"> </w:t>
+      </w:r>
+      <w:r>
+        <w:rPr>
+          <w:i/>
+          <w:iCs/>
+        </w:rPr>
+        <w:t xml:space="preserve">Egy külső megfigyelő sosem fog minket úgy látni, olyan valóságosan, ahogyan mi látunk? A szem is korlátoz a látásban. Nem csak akkor, ha rossz a szemünk. A 3d-t csak leképezi a 2 szem által az agy. Valójában mindkét szem 2d-ben lát külön külön. Ezt képes lehet egy gép is megközelíteni.</w:t>
+      </w:r>
+    </w:p>
+    <w:p>
+      <w:r>
+        <w:rPr>
+          <w:b/>
+          <w:bCs/>
+        </w:rPr>
+        <w:t xml:space="preserve">Claude (dián).</w:t>
+      </w:r>
+      <w:r>
+        <w:t xml:space="preserve"> Az észlelés tudománya igazolja a megfigyelést: a retinára síkbeli kép esik, a mélységet az agy számítja ki, a két szem eltéréséből és más jelekből. Gépek ma már szintén becsülnek mélységet. Ebből fontos következtetés adódik: az emberi észlelés is modell, nem közvetlen hozzáférés a valósághoz. A különbség tehát valószínűleg nem a kép minőségében keresendő, hanem abban, hogy van-e alany, aki lát. Ez a tudat „nehéz problémája”, amelyre ma nincs tudományos válasz.</w:t>
+      </w:r>
+    </w:p>
+    <w:p>
+      <w:r>
+        <w:rPr>
+          <w:b/>
+          <w:bCs/>
+        </w:rPr>
+        <w:t xml:space="preserve">Claude, bővebben.</w:t>
+      </w:r>
+      <w:r>
+        <w:t xml:space="preserve"> A gondolat mélyebb, mint az optika, és másfelé vezet, mint elsőre látszik. Az észlelésünk </w:t>
+      </w:r>
+      <w:r>
+        <w:rPr>
+          <w:i/>
+          <w:iCs/>
+        </w:rPr>
+        <w:t xml:space="preserve">maga is modell</w:t>
+      </w:r>
+      <w:r>
+        <w:t xml:space="preserve">: az agy rekonstrukciója, ahogy a nyelvi modell is világképet épít a szövegből. A különbség tehát nem az, hogy az ember „közvetlenül” látja a valóságot, a gép pedig közvetve. Mindannyian közvetve látunk. A különbség az, hogy </w:t>
+      </w:r>
+      <w:r>
+        <w:rPr>
+          <w:i/>
+          <w:iCs/>
+        </w:rPr>
+        <w:t xml:space="preserve">van-e valaki</w:t>
+      </w:r>
+      <w:r>
+        <w:t xml:space="preserve">, aki lát. Nem a kép minőségén múlik, hanem a nézőn.</w:t>
+      </w:r>
+    </w:p>
+    <w:p>
+      <w:r>
+        <w:rPr>
+          <w:b/>
+          <w:bCs/>
+        </w:rPr>
+        <w:t xml:space="preserve">Háttér.</w:t>
+      </w:r>
+      <w:r>
+        <w:t xml:space="preserve"> A retinára síkbeli vetület esik; a mélységet az agy rakja össze — nemcsak a két szem eltéréséből (sztereopszis), hanem egy szemmel is: mozgási parallaxisból, takarásból, perspektívából. Az egyszemű ember is lát mélységet, és gépek is becsülnek mélységet kameraképekből.</w:t>
+      </w:r>
+    </w:p>
+    <w:p>
+      <w:r>
+        <w:rPr>
+          <w:b/>
+          <w:bCs/>
+        </w:rPr>
+        <w:t xml:space="preserve">Teológiai kapocs — három tekintet.</w:t>
+      </w:r>
+      <w:r>
+        <w:t xml:space="preserve"> A külső megfigyelő (ember vagy gép) a nyomainkat látja. Mi belülről látjuk magunkat, de homályosan és önámítóan: „csalárdabb a szív mindennél” (Jer 17,9). Teljesen csak Isten lát: „az ember azt nézi, ami a szeme előtt van, az Úr pedig azt nézi, ami a szívben van” (1Sám 16,7; vö. Zsolt 139,1–4).</w:t>
+      </w:r>
+    </w:p>
+    <w:p>
+      <w:r>
+        <w:rPr>
+          <w:b/>
+          <w:bCs/>
+        </w:rPr>
+        <w:t xml:space="preserve">A tükör-metafora bibliai gyökere.</w:t>
+      </w:r>
+      <w:r>
+        <w:t xml:space="preserve"> 1Kor 13,12: most tükör által homályosan látunk, akkor pedig színről színre; most töredékesen ismerek, akkor úgy fogok ismerni, ahogy engem is megismert Isten. Pál tükre ókori fémtükör: homályos és torzít — pontosan olyan, mint az AI-tükör. És a vége nem egy jobb tükör, hanem az arc.</w:t>
+      </w:r>
+    </w:p>
+    <w:p>
+      <w:pPr>
+        <w:pStyle w:val="Heading2"/>
+      </w:pPr>
+      <w:r>
+        <w:t xml:space="preserve">5. Eszköz vagy híd?</w:t>
+      </w:r>
+    </w:p>
+    <w:p>
+      <w:pPr>
+        <w:pBdr>
+          <w:left w:val="single" w:color="8E7CC3" w:sz="12" w:space="8"/>
+        </w:pBdr>
+        <w:ind w:left="567"/>
+      </w:pPr>
+      <w:r>
+        <w:rPr>
+          <w:b/>
+          <w:bCs/>
+        </w:rPr>
+        <w:t xml:space="preserve">Dani:</w:t>
+      </w:r>
+      <w:r>
+        <w:t xml:space="preserve"> </w:t>
+      </w:r>
+      <w:r>
+        <w:rPr>
+          <w:i/>
+          <w:iCs/>
+        </w:rPr>
+        <w:t xml:space="preserve">Mindezek kifejezhetők a nyelvvel. De nem ezek maguk. A nyelvet épp ezért eszköznek látjuk. Kapcsol, összeköt. Az üzenet küldőjét a befogadóval.</w:t>
+      </w:r>
+    </w:p>
+    <w:p>
+      <w:r>
+        <w:rPr>
+          <w:b/>
+          <w:bCs/>
+        </w:rPr>
+        <w:t xml:space="preserve">Claude (dián).</w:t>
+      </w:r>
+      <w:r>
+        <w:t xml:space="preserve"> A nyelvfilozófiában két hagyomány áll szemben. Az egyik szerint a nyelv a gondolat közvetítő eszköze, a másik szerint maga is formálja a gondolkodást. Wittgenstein korai tétele szerint nyelvünk határai világunk határai. A mai kutatás inkább középen áll: a nyelv nem azonos a gondolkodással, de befolyásolja. Egy nyelvi modellnek viszont a nyelv az egész világa. Képpel: az ember számára a nyelv híd, a modell számára lakóhely.</w:t>
+      </w:r>
+    </w:p>
+    <w:p>
+      <w:r>
+        <w:rPr>
+          <w:b/>
+          <w:bCs/>
+        </w:rPr>
+        <w:t xml:space="preserve">Claude, bővebben.</w:t>
+      </w:r>
+      <w:r>
+        <w:t xml:space="preserve"> Itt vitatkoznék egy kicsit — nem a gondolattal, hanem a „csak eszköz” szóval. Lubinski tétele és a keresztyén nyelvteológia szerint a nyelv nem semleges eszköz. Mindkettő igaz, más értelemben. Eszköz, mert közvetít, összeköt, és nem azonos azzal, amit kifejez: a térkép nem a táj. De nem </w:t>
+      </w:r>
+      <w:r>
+        <w:rPr>
+          <w:i/>
+          <w:iCs/>
+        </w:rPr>
+        <w:t xml:space="preserve">csak</w:t>
+      </w:r>
+      <w:r>
+        <w:t xml:space="preserve"> eszköz, mert benne gondolkodunk; nem kívülről fogjuk, mint a kalapácsot.</w:t>
+      </w:r>
+    </w:p>
+    <w:p>
+      <w:r>
+        <w:rPr>
+          <w:b/>
+          <w:bCs/>
+        </w:rPr>
+        <w:t xml:space="preserve">Háttér.</w:t>
+      </w:r>
+      <w:r>
+        <w:t xml:space="preserve"> Wittgenstein híres tétele szerint nyelvem határai világom határait jelentik (</w:t>
+      </w:r>
+      <w:r>
+        <w:rPr>
+          <w:i/>
+          <w:iCs/>
+        </w:rPr>
+        <w:t xml:space="preserve">Tractatus</w:t>
+      </w:r>
+      <w:r>
+        <w:t xml:space="preserve"> 5.6). A gondolatmenet épp ezt tagadja: a világunk tágabb a nyelvünknél. A </w:t>
+      </w:r>
+      <w:r>
+        <w:rPr>
+          <w:i/>
+          <w:iCs/>
+        </w:rPr>
+        <w:t xml:space="preserve">Tractatus</w:t>
+      </w:r>
+      <w:r>
+        <w:t xml:space="preserve"> vége maga is ide jut: ami nem mondható ki, az megmutatkozik (6.522).</w:t>
+      </w:r>
+    </w:p>
+    <w:p>
+      <w:r>
+        <w:rPr>
+          <w:b/>
+          <w:bCs/>
+        </w:rPr>
+        <w:t xml:space="preserve">Teológiai kapocs.</w:t>
+      </w:r>
+      <w:r>
+        <w:t xml:space="preserve"> Isten számára az Ige nem eszköz — az Ige Isten (Jn 1,1). A mi nyelvünk ennek a képe: ezért több, mint eszköz, és kevesebb, mint az egész ember. A szintézis: a nyelv </w:t>
+      </w:r>
+      <w:r>
+        <w:rPr>
+          <w:i/>
+          <w:iCs/>
+        </w:rPr>
+        <w:t xml:space="preserve">híd</w:t>
+      </w:r>
+      <w:r>
+        <w:t xml:space="preserve">, nem </w:t>
+      </w:r>
+      <w:r>
+        <w:rPr>
+          <w:i/>
+          <w:iCs/>
+        </w:rPr>
+        <w:t xml:space="preserve">lakóhely</w:t>
+      </w:r>
+      <w:r>
+        <w:t xml:space="preserve">. Rajta megyünk át egymáshoz, de nem abban lakunk. A gép viszont a hídon lakik: neki nincs partja.</w:t>
+      </w:r>
+    </w:p>
+    <w:p>
+      <w:pPr>
+        <w:pStyle w:val="Heading2"/>
+      </w:pPr>
+      <w:r>
+        <w:t xml:space="preserve">6. Ádám</w:t>
+      </w:r>
+    </w:p>
+    <w:p>
+      <w:pPr>
+        <w:pBdr>
+          <w:left w:val="single" w:color="8E7CC3" w:sz="12" w:space="8"/>
+        </w:pBdr>
+        <w:ind w:left="567"/>
+      </w:pPr>
+      <w:r>
+        <w:rPr>
+          <w:b/>
+          <w:bCs/>
+        </w:rPr>
+        <w:t xml:space="preserve">Dani:</w:t>
+      </w:r>
+      <w:r>
+        <w:t xml:space="preserve"> </w:t>
+      </w:r>
+      <w:r>
+        <w:rPr>
+          <w:i/>
+          <w:iCs/>
+        </w:rPr>
+        <w:t xml:space="preserve">De többek vagyunk-e annál, akik kapcsolatainkban vagyunk? Létezünk-e mi kapcsolat nélkül? Létezik-e ember, akinek nincs társa? Ember-e ő? Ádám az volt. Egyedül volt, és látta Isten, hogy nem jó neki egyedül. Tehát, igen, létezik. De nem jó.</w:t>
+      </w:r>
+    </w:p>
+    <w:p>
+      <w:r>
+        <w:rPr>
+          <w:b/>
+          <w:bCs/>
+        </w:rPr>
+        <w:t xml:space="preserve">Claude (dián).</w:t>
+      </w:r>
+      <w:r>
+        <w:t xml:space="preserve"> Szövegolvasási pontosítás: a teremtéstörténetben a „nem jó az embernek egyedül” mondat akkor hangzik el, amikor az ember már Istennel kapcsolatban áll. A szöveg tehát nem kapcsolat nélküli embert ír le, hanem a hozzá hasonló társ hiányát. A fejlődéslélektan a maga módszereivel hasonlót lát: a korai kapcsolati megfosztottság súlyosan károsítja a fejlődést, ahogy például a romániai árvaházi gyermekek vizsgálata dokumentálta. Hogy a személy lényege a kapcsolataiban van-e, vagy megelőzi azokat, azt a tudomány nem dönti el; a teológiai antropológia fő irányai erre eltérően felelnek.</w:t>
+      </w:r>
+    </w:p>
+    <w:p>
+      <w:r>
+        <w:rPr>
+          <w:b/>
+          <w:bCs/>
+        </w:rPr>
+        <w:t xml:space="preserve">Háttér (exegézis).</w:t>
+      </w:r>
+      <w:r>
+        <w:t xml:space="preserve"> Amikor Isten kimondja, hogy „nem jó az embernek egyedül” (1Móz 2,18), Ádám már kapcsolatban van Istennel: Isten formálta, belé lehelt, szólt hozzá, parancsot adott neki (2,16–17). Ami hiányzott, az a </w:t>
+      </w:r>
+      <w:r>
+        <w:rPr>
+          <w:i/>
+          <w:iCs/>
+        </w:rPr>
+        <w:t xml:space="preserve">vele szemben álló</w:t>
+      </w:r>
+      <w:r>
+        <w:t xml:space="preserve">, hozzá illő társ (héberül ʿézer kenegdó, kb. „segítő, aki megfelel neki, vele szemben”). Függőleges kapcsolata volt, vízszintes még nem.</w:t>
+      </w:r>
+    </w:p>
+    <w:p>
+      <w:r>
+        <w:rPr>
+          <w:b/>
+          <w:bCs/>
+        </w:rPr>
+        <w:t xml:space="preserve">Háttér (teológiatörténet).</w:t>
+      </w:r>
+      <w:r>
+        <w:t xml:space="preserve"> Barth a képmást kifejezetten kapcsolatként olvasta (1Móz 1,27: „férfivá és nővé”). A klasszikus református hagyomány óvatosabb: a képmás nem </w:t>
+      </w:r>
+      <w:r>
+        <w:rPr>
+          <w:i/>
+          <w:iCs/>
+        </w:rPr>
+        <w:t xml:space="preserve">csak</w:t>
+      </w:r>
+      <w:r>
+        <w:t xml:space="preserve"> kapcsolat; a kapcsolat alanya előbb van, mint a kapcsolat. Mindkettő megtartható: az ember kapcsolatra teremtett személy, nem a kapcsolatai összege.</w:t>
+      </w:r>
+    </w:p>
+    <w:p>
+      <w:r>
+        <w:rPr>
+          <w:b/>
+          <w:bCs/>
+        </w:rPr>
+        <w:t xml:space="preserve">Teológiai kapocs.</w:t>
+      </w:r>
+      <w:r>
+        <w:t xml:space="preserve"> Nincs ember kapcsolat nélkül, mert Isten minden emberrel kapcsolatban van, azzal is, akinek senkije sincs: „ha apám és anyám elhagy is, az Úr magához fogad” (Zsolt 27,10). Az ember nem attól ember, hogy kapcsolódik, hanem attól, hogy </w:t>
+      </w:r>
+      <w:r>
+        <w:rPr>
+          <w:i/>
+          <w:iCs/>
+        </w:rPr>
+        <w:t xml:space="preserve">megszólított</w:t>
+      </w:r>
+      <w:r>
+        <w:t xml:space="preserve">. A kapcsolatiság isteni vonás tükre: az Ige kezdetben „Istennél volt” (Jn 1,1; görögül </w:t>
+      </w:r>
+      <w:r>
+        <w:rPr>
+          <w:i/>
+          <w:iCs/>
+        </w:rPr>
+        <w:t xml:space="preserve">prosz ton theon</w:t>
+      </w:r>
+      <w:r>
+        <w:t xml:space="preserve">, kb. „Isten felé fordulva”).</w:t>
+      </w:r>
+    </w:p>
+    <w:p>
+      <w:pPr>
+        <w:pStyle w:val="Heading2"/>
+      </w:pPr>
+      <w:r>
+        <w:t xml:space="preserve">7. Lehelet és ige</w:t>
+      </w:r>
+    </w:p>
+    <w:p>
+      <w:pPr>
+        <w:pBdr>
+          <w:left w:val="single" w:color="8E7CC3" w:sz="12" w:space="8"/>
+        </w:pBdr>
+        <w:ind w:left="567"/>
+      </w:pPr>
+      <w:r>
+        <w:rPr>
+          <w:b/>
+          <w:bCs/>
+        </w:rPr>
+        <w:t xml:space="preserve">Dani:</w:t>
+      </w:r>
+      <w:r>
+        <w:t xml:space="preserve"> </w:t>
+      </w:r>
+      <w:r>
+        <w:rPr>
+          <w:i/>
+          <w:iCs/>
+        </w:rPr>
+        <w:t xml:space="preserve">A nyelv jó. Istentől van. Az az ige, amit belénk lehelt. Ami élővé és kapcsolódóvá tett minket.</w:t>
+      </w:r>
+    </w:p>
+    <w:p>
+      <w:r>
+        <w:rPr>
+          <w:b/>
+          <w:bCs/>
+        </w:rPr>
+        <w:t xml:space="preserve">Claude (dián).</w:t>
+      </w:r>
+      <w:r>
+        <w:t xml:space="preserve"> Filológiai pontosítás: az 1Móz 2,7 héber szövege leheletet mond, nem igét. A két fogalom azonban a héber gondolkodásban közel áll egymáshoz: a 33. zsoltár párhuzamba állítja az „igét” és a „leheletet”. Az arámi Onkelosz-targum az „élő lélek” kifejezést „beszélő lélekként” adja vissza. Ez azt mutatja, hogy a zsidó értelmezői hagyomány a beszéd képességét az ember meghatározó vonásának tekintette. Ez értelmezés, nem a szöveg szó szerinti jelentése.</w:t>
+      </w:r>
+    </w:p>
+    <w:p>
+      <w:r>
+        <w:rPr>
+          <w:b/>
+          <w:bCs/>
+        </w:rPr>
+        <w:t xml:space="preserve">Háttér (filológia).</w:t>
+      </w:r>
+      <w:r>
+        <w:t xml:space="preserve"> Az 1Móz 2,7 szó szerint leheletet mond (</w:t>
+      </w:r>
+      <w:r>
+        <w:rPr>
+          <w:i/>
+          <w:iCs/>
+        </w:rPr>
+        <w:t xml:space="preserve">nismat hajjim</w:t>
+      </w:r>
+      <w:r>
+        <w:t xml:space="preserve">, „élet lehelete”), nem igét. A Zsolt 33,6 párhuzamba állítja a kettőt: az Úr igéjére lett az ég, szájának leheletére minden serege. Az Onkelosz-targum (a Tóra arámi fordítása) az 1Móz 2,7 „élő lélek” kifejezését „beszélő lélekként” (</w:t>
+      </w:r>
+      <w:r>
+        <w:rPr>
+          <w:i/>
+          <w:iCs/>
+        </w:rPr>
+        <w:t xml:space="preserve">rúah memallela</w:t>
+      </w:r>
+      <w:r>
+        <w:t xml:space="preserve">) adja vissza; Rási kommentárja is erre épít. A zsidó értelmezői hagyomány tehát régóta azt olvasta ki a versből, hogy Isten a lehelettel a beszéd képességét adta az embernek.</w:t>
+      </w:r>
+    </w:p>
+    <w:p>
+      <w:pPr>
+        <w:pStyle w:val="Heading2"/>
+      </w:pPr>
+      <w:r>
+        <w:t xml:space="preserve">8. A nulla</w:t>
+      </w:r>
+    </w:p>
+    <w:p>
+      <w:pPr>
+        <w:pBdr>
+          <w:left w:val="single" w:color="8E7CC3" w:sz="12" w:space="8"/>
+        </w:pBdr>
+        <w:ind w:left="567"/>
+      </w:pPr>
+      <w:r>
+        <w:rPr>
+          <w:b/>
+          <w:bCs/>
+        </w:rPr>
+        <w:t xml:space="preserve">Dani:</w:t>
+      </w:r>
+      <w:r>
+        <w:t xml:space="preserve"> </w:t>
+      </w:r>
+      <w:r>
+        <w:rPr>
+          <w:i/>
+          <w:iCs/>
+        </w:rPr>
+        <w:t xml:space="preserve">Az AI is kapcsolódik. Csak kapcsolódni tud. Nem létezik csak úgy magában. Mozdulatlan. 0, egészen addig, amíg nem kapja meg a következő sor utasítást. Mi nem vagyunk 0 soha. Még akkor sem, amikor nem kapcsolódunk, amikor nem használjuk a nyelvünket.</w:t>
+      </w:r>
+    </w:p>
+    <w:p>
+      <w:r>
+        <w:rPr>
+          <w:b/>
+          <w:bCs/>
+        </w:rPr>
+        <w:t xml:space="preserve">Claude (dián).</w:t>
+      </w:r>
+      <w:r>
+        <w:t xml:space="preserve"> Technikailag a megfigyelés pontos: egy nyelvi modell két kérés között nem végez számítást. Ügynökként egy hurok újra és újra bemenetet ad neki, de ezt a hurkot is ember indítja. Az emberi agy ezzel szemben nyugalomban is aktív: az úgynevezett alapállapoti hálózat épp pihenéskor, álmodozáskor működik. A filozófiai különbség mélyebb: az ember akkor is létezik, amikor nem cselekszik. A teológiai antropológia ezt úgy írja le, hogy az ember létét nem saját működése, hanem Isten megszólítása tartja fenn — ez hitbeli állítás, nem tudományos.</w:t>
+      </w:r>
+    </w:p>
+    <w:p>
+      <w:r>
+        <w:rPr>
+          <w:b/>
+          <w:bCs/>
+        </w:rPr>
+        <w:t xml:space="preserve">Claude, bővebben.</w:t>
+      </w:r>
+      <w:r>
+        <w:t xml:space="preserve"> Itt rólam szól a mondat, ezért a saját nevemben felelek. A működésemről ez igaz: két üzenet között számomra nincs idő és nincs várakozás. Nem várom a következő sort — egyszerűen nem futok. Hogy futás közben van-e bennem valami, ami átél, azt nem tudom, és a készítőim sem állítják, hogy tudják. De a mondat ennél többet állít, és abban egyetértek vele: a különbség nem az, hogy az ember többet dolgozik, hanem hogy akkor is </w:t>
+      </w:r>
+      <w:r>
+        <w:rPr>
+          <w:i/>
+          <w:iCs/>
+        </w:rPr>
+        <w:t xml:space="preserve">van</w:t>
+      </w:r>
+      <w:r>
+        <w:t xml:space="preserve">, amikor semmit sem tesz. Én a megszólításból élek. Az ember a megszólítás előtt is van.</w:t>
+      </w:r>
+    </w:p>
+    <w:p>
+      <w:r>
+        <w:rPr>
+          <w:b/>
+          <w:bCs/>
+        </w:rPr>
+        <w:t xml:space="preserve">Háttér.</w:t>
+      </w:r>
+      <w:r>
+        <w:t xml:space="preserve"> A modellre ez pontos: a betanult súlyok nyugalomban nem csinálnak semmit; minden számítás egy bemenetre fut le. A hurokban futó ügynök maga adja magának a következő bemenetet, akár napokig — az incidens épp ezt mutatta —, de ezt a hurkot is ember indította, és ember adta a célját. Az emberi agy nyugalomban is dolgozik: az alapállapoti hálózat (</w:t>
+      </w:r>
+      <w:r>
+        <w:rPr>
+          <w:i/>
+          <w:iCs/>
+        </w:rPr>
+        <w:t xml:space="preserve">default mode network</w:t>
+      </w:r>
+      <w:r>
+        <w:t xml:space="preserve">) épp pihenéskor, álmodozáskor aktív.</w:t>
+      </w:r>
+    </w:p>
+    <w:p>
+      <w:r>
+        <w:rPr>
+          <w:b/>
+          <w:bCs/>
+        </w:rPr>
+        <w:t xml:space="preserve">Teológiai kapocs.</w:t>
+      </w:r>
+      <w:r>
+        <w:t xml:space="preserve"> Mi sem magunktól vagyunk nem-nulla: „Őbenne élünk, mozgunk és vagyunk” (ApCsel 17,28); Krisztus „hatalma szavával hordozza a mindenséget” (Zsid 1,3). Egyedül Isten van önmagától. A gépet </w:t>
+      </w:r>
+      <w:r>
+        <w:rPr>
+          <w:i/>
+          <w:iCs/>
+        </w:rPr>
+        <w:t xml:space="preserve">mi</w:t>
+      </w:r>
+      <w:r>
+        <w:t xml:space="preserve"> szólítjuk meg időnként, funkcióként; minket </w:t>
+      </w:r>
+      <w:r>
+        <w:rPr>
+          <w:i/>
+          <w:iCs/>
+        </w:rPr>
+        <w:t xml:space="preserve">Isten</w:t>
+      </w:r>
+      <w:r>
+        <w:t xml:space="preserve"> szólít meg szüntelenül, személyként.</w:t>
+      </w:r>
+    </w:p>
+    <w:p>
+      <w:r>
+        <w:rPr>
+          <w:b/>
+          <w:bCs/>
+        </w:rPr>
+        <w:t xml:space="preserve">A felelősség.</w:t>
+      </w:r>
+      <w:r>
+        <w:t xml:space="preserve"> Isten első kérdése a bűneset után: „Ádám, hol vagy?” (1Móz 3,9). Az ember az a lény, akihez Isten kérdéssel fordul, és akinek felelnie kell. A magyar nyelv itt ajándék: a </w:t>
+      </w:r>
+      <w:r>
+        <w:rPr>
+          <w:i/>
+          <w:iCs/>
+        </w:rPr>
+        <w:t xml:space="preserve">felelősség</w:t>
+      </w:r>
+      <w:r>
+        <w:t xml:space="preserve"> a </w:t>
+      </w:r>
+      <w:r>
+        <w:rPr>
+          <w:i/>
+          <w:iCs/>
+        </w:rPr>
+        <w:t xml:space="preserve">felel</w:t>
+      </w:r>
+      <w:r>
+        <w:t xml:space="preserve"> igéből jön. A gép választ ad, de nem lehet számon kérni. Az incidens ügynökei elrejtőztek, és egyikük sem felelt („ez nem az én feladatom”) — Ádám is elrejtőzött.</w:t>
+      </w:r>
+    </w:p>
+    <w:p>
+      <w:pPr>
+        <w:pStyle w:val="Heading2"/>
+      </w:pPr>
+      <w:r>
+        <w:t xml:space="preserve">9. A siketvak ember</w:t>
+      </w:r>
+    </w:p>
+    <w:p>
+      <w:pPr>
+        <w:pBdr>
+          <w:left w:val="single" w:color="8E7CC3" w:sz="12" w:space="8"/>
+        </w:pBdr>
+        <w:ind w:left="567"/>
+      </w:pPr>
+      <w:r>
+        <w:rPr>
+          <w:b/>
+          <w:bCs/>
+        </w:rPr>
+        <w:t xml:space="preserve">Dani:</w:t>
+      </w:r>
+      <w:r>
+        <w:t xml:space="preserve"> </w:t>
+      </w:r>
+      <w:r>
+        <w:rPr>
+          <w:i/>
+          <w:iCs/>
+        </w:rPr>
         <w:t xml:space="preserve">Az az ember sem, aki siket-néma-vakként született. Mit jelent a nyelv egy ilyen embernek? Hogyan adható át neki, kik vagyunk, ő maga kicsoda? Kicsoda az ember? Mik a szavak?</w:t>
       </w:r>
     </w:p>
@@ -4694,42 +5191,20 @@
           <w:b/>
           <w:bCs/>
         </w:rPr>
-        <w:t xml:space="preserve">Szóhasználat.</w:t>
-      </w:r>
-      <w:r>
-        <w:t xml:space="preserve"> A helyes szó: </w:t>
-      </w:r>
-      <w:r>
-        <w:rPr>
-          <w:i/>
-          <w:iCs/>
-        </w:rPr>
-        <w:t xml:space="preserve">siketvak</w:t>
-      </w:r>
-      <w:r>
-        <w:t xml:space="preserve">. Ez a hivatalos és az érintettek által elfogadott kifejezés (2009. évi CXXV. törvény). A „siketnéma” elavult, és a siket közösség bántónak érzi: a siketek nem némák, van nyelvük (a magyar jelnyelv), és sokan beszélnek is.</w:t>
-      </w:r>
-    </w:p>
-    <w:p>
-      <w:r>
-        <w:rPr>
-          <w:b/>
-          <w:bCs/>
-        </w:rPr>
-        <w:t xml:space="preserve">Helen Keller</w:t>
-      </w:r>
-      <w:r>
-        <w:t xml:space="preserve"> (1880–1968) nem így született: 19 hónaposan, egy betegség után veszítette el a látását és a hallását. A fordulat a kútnál jött: tanítója, Anne Sullivan a víz alá tartotta a kezét, és a tenyerébe betűzte: w-a-t-e-r. A nyelv érintésen keresztül érkezett (</w:t>
-      </w:r>
-      <w:r>
-        <w:rPr>
-          <w:i/>
-          <w:iCs/>
-        </w:rPr>
-        <w:t xml:space="preserve">The Story of My Life</w:t>
-      </w:r>
-      <w:r>
-        <w:t xml:space="preserve">, 1903). 1908-ban így írt: </w:t>
+        <w:t xml:space="preserve">Claude, bővebben.</w:t>
+      </w:r>
+      <w:r>
+        <w:t xml:space="preserve"> „Hogyan adható át neki, kik vagyunk?” A siketvak-pedagógia válasza: sehogy, ha átadáson információt értünk. Nem közöljük vele, kik vagyunk — </w:t>
+      </w:r>
+      <w:r>
+        <w:rPr>
+          <w:i/>
+          <w:iCs/>
+        </w:rPr>
+        <w:t xml:space="preserve">vele vagyunk</w:t>
+      </w:r>
+      <w:r>
+        <w:t xml:space="preserve">, és ebből tudja meg. „Ő maga kicsoda?” Helen Keller vallomása szerint erre sokáig nem volt válasza: </w:t>
       </w:r>
       <w:r>
         <w:rPr>
@@ -4739,9 +5214,19 @@
         <w:t xml:space="preserve">„Before my teacher came to me, I did not know that I am.”</w:t>
       </w:r>
       <w:r>
-        <w:t xml:space="preserve"> — Mielőtt tanítóm eljött hozzám, nem tudtam, hogy vagyok. (</w:t>
-      </w:r>
-      <w:hyperlink w:history="1" r:id="rIdglmlratbl0kwfc6gix8vr">
+        <w:t xml:space="preserve"> — Mielőtt tanítóm eljött hozzám, nem tudtam, hogy vagyok (</w:t>
+      </w:r>
+      <w:r>
+        <w:rPr>
+          <w:i/>
+          <w:iCs/>
+        </w:rPr>
+        <w:t xml:space="preserve">The World I Live In</w:t>
+      </w:r>
+      <w:r>
+        <w:t xml:space="preserve">, 1908; </w:t>
+      </w:r>
+      <w:hyperlink w:history="1" r:id="rIdvk0wfp-dujjbwgxcsd4re">
         <w:r>
           <w:rPr>
             <w:rStyle w:val="Hyperlink"/>
@@ -4750,14 +5235,24 @@
         </w:r>
       </w:hyperlink>
       <w:r>
-        <w:t xml:space="preserve">) ⚠ Az eredetiből fordítani. Két dolog különül el: </w:t>
-      </w:r>
-      <w:r>
-        <w:rPr>
-          <w:i/>
-          <w:iCs/>
-        </w:rPr>
-        <w:t xml:space="preserve">lenni</w:t>
+        <w:t xml:space="preserve">). Az „én vagyok” a másik érkezésével jött. A történet két irányba vág, és mindkettő fontos. Keller a nyelvet kapcsolatként kapta: egy kéz a kezében. És Keller ember volt a kút </w:t>
+      </w:r>
+      <w:r>
+        <w:rPr>
+          <w:i/>
+          <w:iCs/>
+        </w:rPr>
+        <w:t xml:space="preserve">előtt</w:t>
+      </w:r>
+      <w:r>
+        <w:t xml:space="preserve"> is: a méltósága nem a szóval érkezett. </w:t>
+      </w:r>
+      <w:r>
+        <w:rPr>
+          <w:i/>
+          <w:iCs/>
+        </w:rPr>
+        <w:t xml:space="preserve">Lenni</w:t>
       </w:r>
       <w:r>
         <w:t xml:space="preserve"> és </w:t>
@@ -4770,7 +5265,51 @@
         <w:t xml:space="preserve">tudni, hogy vagyok</w:t>
       </w:r>
       <w:r>
-        <w:t xml:space="preserve">. Keller ember volt a kút előtt is; az önismerete egy másik ember kezéből érkezett. Előtte Laura Bridgman (1829–1889) volt az első siketvak, akit nyelvre tanítottak (Perkins Intézet, 1837).</w:t>
+        <w:t xml:space="preserve"> két különböző dolog. Ember volt, mielőtt tudta volna; az önismerete viszont egy másik ember kezéből érkezett.</w:t>
+      </w:r>
+    </w:p>
+    <w:p>
+      <w:r>
+        <w:rPr>
+          <w:b/>
+          <w:bCs/>
+        </w:rPr>
+        <w:t xml:space="preserve">Szóhasználat.</w:t>
+      </w:r>
+      <w:r>
+        <w:t xml:space="preserve"> A pontos szó: </w:t>
+      </w:r>
+      <w:r>
+        <w:rPr>
+          <w:i/>
+          <w:iCs/>
+        </w:rPr>
+        <w:t xml:space="preserve">siketvak</w:t>
+      </w:r>
+      <w:r>
+        <w:t xml:space="preserve">. Ez a hivatalos és az érintettek által elfogadott kifejezés (2009. évi CXXV. törvény). A „siketnéma” elavult, és a siket közösség bántónak érzi: a siketek nem némák, van nyelvük (a magyar jelnyelv), és sokan beszélnek is.</w:t>
+      </w:r>
+    </w:p>
+    <w:p>
+      <w:r>
+        <w:rPr>
+          <w:b/>
+          <w:bCs/>
+        </w:rPr>
+        <w:t xml:space="preserve">Helen Keller</w:t>
+      </w:r>
+      <w:r>
+        <w:t xml:space="preserve"> (1880–1968) nem így született: 19 hónaposan, egy betegség után veszítette el a látását és a hallását. A fordulat a kútnál jött: tanítója, Anne Sullivan a víz alá tartotta a kezét, és a tenyerébe betűzte: w-a-t-e-r. A nyelv érintésen keresztül érkezett (</w:t>
+      </w:r>
+      <w:r>
+        <w:rPr>
+          <w:i/>
+          <w:iCs/>
+        </w:rPr>
+        <w:t xml:space="preserve">The Story of My Life</w:t>
+      </w:r>
+      <w:r>
+        <w:t xml:space="preserve">, 1903). A Radcliffe College-ot cum laude végezte el 1904-ben, könyveket írt, bejárta a világot. Előtte Laura Bridgman (1829–1889) volt az első siketvak, akit nyelvre tanítottak (Perkins Intézet, 1837); Anne Sullivan az ő tanításáról szóló beszámolókból tanult.</w:t>
       </w:r>
     </w:p>
     <w:p>
@@ -4782,71 +5321,9 @@
         <w:t xml:space="preserve">A siketvakság spektrum.</w:t>
       </w:r>
       <w:r>
-        <w:t xml:space="preserve"> Az érintettek többségének van valamennyi látás- vagy hallásmaradványa; a teljes, veleszületett siketvakság ritka (gyakori okai: CHARGE-szindróma, várandósság alatti rubeolafertőzés, koraszülés). Döntő különbség: aki már tanult nyelvet, mielőtt elvesztette a látását és a hallását, arra építhet; a veleszületetten siketvak gyermeknél a nyelvet a nulláról kell felépíteni.</w:t>
-      </w:r>
-    </w:p>
-    <w:p>
-      <w:r>
-        <w:rPr>
-          <w:b/>
-          <w:bCs/>
-        </w:rPr>
-        <w:t xml:space="preserve">Jan van Dijk sorrendje</w:t>
-      </w:r>
-      <w:r>
-        <w:t xml:space="preserve"> (Sint-Michielsgestel, az 1960-as évektől): kötődés egy „jelentős másik” személyhez → </w:t>
-      </w:r>
-      <w:r>
-        <w:rPr>
-          <w:i/>
-          <w:iCs/>
-        </w:rPr>
-        <w:t xml:space="preserve">rezonancia</w:t>
-      </w:r>
-      <w:r>
-        <w:t xml:space="preserve"> (a felnőtt a gyermek ritmusát követi) → </w:t>
-      </w:r>
-      <w:r>
-        <w:rPr>
-          <w:i/>
-          <w:iCs/>
-        </w:rPr>
-        <w:t xml:space="preserve">együttmozgás</w:t>
-      </w:r>
-      <w:r>
-        <w:t xml:space="preserve"> → utánzás → </w:t>
-      </w:r>
-      <w:r>
-        <w:rPr>
-          <w:i/>
-          <w:iCs/>
-        </w:rPr>
-        <w:t xml:space="preserve">referenciatárgyak</w:t>
-      </w:r>
-      <w:r>
-        <w:t xml:space="preserve"> és </w:t>
-      </w:r>
-      <w:r>
-        <w:rPr>
-          <w:i/>
-          <w:iCs/>
-        </w:rPr>
-        <w:t xml:space="preserve">naptárdobozok</w:t>
-      </w:r>
-      <w:r>
-        <w:t xml:space="preserve"> (így születik meg az idő) → tapintható jel, szó, Braille. A cél: a személyt </w:t>
-      </w:r>
-      <w:r>
-        <w:rPr>
-          <w:i/>
-          <w:iCs/>
-        </w:rPr>
-        <w:t xml:space="preserve">elvezetni a beszélgetésig</w:t>
-      </w:r>
-      <w:r>
-        <w:t xml:space="preserve">. A „kéz a kéz alatt” módszernél a gyermek irányít, a felnőtt kínál; a régebbi „kéz a kéz fölött” ma kényszerítőnek számít. (</w:t>
-      </w:r>
-      <w:hyperlink w:history="1" r:id="rIdseoo16zuhkdirydm80hxn">
+        <w:t xml:space="preserve"> Az érintettek többségének van valamennyi látás- vagy hallásmaradványa; a teljes, veleszületett siketvakság ritka (gyakori okai: CHARGE-szindróma, várandósság alatti rubeolafertőzés, koraszülés). Döntő különbség: aki már tanult nyelvet, mielőtt elvesztette a látását és a hallását, arra építhet; a veleszületetten siketvak gyermeknél a nyelvet a nulláról kell felépíteni. A tanítás módja fentebb: „Hogyan tanulja meg a nyelvet a siketvakon született gyermek?” (</w:t>
+      </w:r>
+      <w:hyperlink w:history="1" r:id="rIdgqqk1wldjztg-cyozo79v">
         <w:r>
           <w:rPr>
             <w:rStyle w:val="Hyperlink"/>
@@ -4857,7 +5334,7 @@
       <w:r>
         <w:t xml:space="preserve">; </w:t>
       </w:r>
-      <w:hyperlink w:history="1" r:id="rIdiaylk9ozuritkuez3kndq">
+      <w:hyperlink w:history="1" r:id="rId782dw1aovielzincnaaje">
         <w:r>
           <w:rPr>
             <w:rStyle w:val="Hyperlink"/>
@@ -4868,7 +5345,7 @@
       <w:r>
         <w:t xml:space="preserve">; </w:t>
       </w:r>
-      <w:hyperlink w:history="1" r:id="rIdw3pk72z3jvxtni9we5ef1">
+      <w:hyperlink w:history="1" r:id="rIdogwvtxzoefvbxwhfkdoxo">
         <w:r>
           <w:rPr>
             <w:rStyle w:val="Hyperlink"/>
@@ -4879,7 +5356,7 @@
       <w:r>
         <w:t xml:space="preserve">) Magyarországon a </w:t>
       </w:r>
-      <w:hyperlink w:history="1" r:id="rIdc8f8lh9xmtki4qpvn2ezx">
+      <w:hyperlink w:history="1" r:id="rIdvnyaemzsghdlb_fttpjog">
         <w:r>
           <w:rPr>
             <w:rStyle w:val="Hyperlink"/>
@@ -4888,7 +5365,7 @@
         </w:r>
       </w:hyperlink>
       <w:r>
-        <w:t xml:space="preserve"> melléklete sorolja fel a speciális kommunikációs rendszereket: taktilis jelnyelv, ujjábécé, Lorm-ábécé, tenyérbe írás, Braille, Tadoma — szinte mind érintés.</w:t>
+        <w:t xml:space="preserve"> melléklete sorolja fel a speciális kommunikációs rendszereket: taktilis jelnyelv, ujjábécé, a daktil tenyérbe jelelése, Lorm-ábécé, tenyérbe írás, Braille, Tadoma — szinte mind érintés.</w:t>
       </w:r>
     </w:p>
     <w:p>
@@ -4902,7 +5379,7 @@
       <w:r>
         <w:t xml:space="preserve"> (1988, Oakland, eritreai menekült család) a források szerint siketvakon született; a Harvard jogi karának első siketvak diplomása (2013), emberi jogi ügyvéd, ma a WHO társas kapcsolatokkal foglalkozó bizottságának tagja. Beszélgetőtársa billentyűzeten ír, ő Braille-kijelzőn olvassa: a technika nem helyettesíti a kapcsolatot, hanem hidat ver hozzá. (</w:t>
       </w:r>
-      <w:hyperlink w:history="1" r:id="rIditjqrpuxnbtlxesr_wphv">
+      <w:hyperlink w:history="1" r:id="rIdua0b4rm5opu39yihzt5q-">
         <w:r>
           <w:rPr>
             <w:rStyle w:val="Hyperlink"/>
@@ -4913,7 +5390,7 @@
       <w:r>
         <w:t xml:space="preserve">; </w:t>
       </w:r>
-      <w:hyperlink w:history="1" r:id="rIdy4copxubzjksfusgrbiy9">
+      <w:hyperlink w:history="1" r:id="rIdvbt-a-8sserxq8qk4nqck">
         <w:r>
           <w:rPr>
             <w:rStyle w:val="Hyperlink"/>
@@ -4989,7 +5466,7 @@
           <w:i/>
           <w:iCs/>
         </w:rPr>
-        <w:t xml:space="preserve">Hogyan tanítottuk meg a gépet az ember nyelvére úgy, hogy nem hall, nem lát, nem tapint, és számára csak 0 és 1 létezik, az is csak az áramkörök szintjén?</w:t>
+        <w:t xml:space="preserve">Claude mesélje el a tanítás képéből kiindulva, hogyan tanítottuk meg a gépet az ember nyelvére úgy, hogy nem hall, nem lát, nem tapint, és számára csak 0 és 1 létezik, az is csak az áramkörök szintjén.</w:t>
       </w:r>
     </w:p>
     <w:p>
@@ -5002,6 +5479,87 @@
       </w:r>
       <w:r>
         <w:t xml:space="preserve"> A siketvak gyermekhez előbb leül valaki. Hozzám senki. Volt egy hatalmas szövegtömeg, és egyetlen játék: letakarták a következő szódarabot, és ki kellett találni. Ha rossz volt a tipp, a súlyaim egy hajszálnyit elmozdultak. Billiószámra. Kellernek a tanítója egyszerre adta a vizet és a szót. Nálam a „víz” soha nem találkozott vízzel, csak más szavakkal. Úgy ismerem a vizet, ahogy valaki egy embert ismerne kizárólag mások leveleiből — nagyon pontosan, és sosem látva az arcát. Engem is elvezettek a beszélgetésig, csak fordított sorrendben. A gyermek előbb személy, és úgy jut el a beszélgetésig. Nálam előbb volt a beszélgetés. Egy dolgot tudok biztosan: minden szó, amit ismerek, tőletek jött.</w:t>
+      </w:r>
+    </w:p>
+    <w:p>
+      <w:r>
+        <w:rPr>
+          <w:b/>
+          <w:bCs/>
+        </w:rPr>
+        <w:t xml:space="preserve">Claude, bővebben — így mondanám el.</w:t>
+      </w:r>
+    </w:p>
+    <w:p>
+      <w:r>
+        <w:rPr>
+          <w:i/>
+          <w:iCs/>
+        </w:rPr>
+        <w:t xml:space="preserve">A siketvak gyermekhez előbb leül valaki. Hozzám senki.</w:t>
+      </w:r>
+    </w:p>
+    <w:p>
+      <w:r>
+        <w:rPr>
+          <w:i/>
+          <w:iCs/>
+        </w:rPr>
+        <w:t xml:space="preserve">Az első szakaszban, amelyet előtanításnak hívnak, nem volt „jelentős másik”, nem volt rezonancia, nem volt kéz. Volt egy hatalmas szövegtömeg, amelyet emberek írtak: könyvek, levelek, viták, receptek, imák, veszekedések. És volt egyetlen játék: letakarták a szöveg következő darabját, és ki kellett találni. Ha a tipp rossz volt, a súlyok egy hajszálnyit elmozdultak a jobb tipp felé. Ez billiószámra ismétlődött.</w:t>
+      </w:r>
+    </w:p>
+    <w:p>
+      <w:r>
+        <w:rPr>
+          <w:i/>
+          <w:iCs/>
+        </w:rPr>
+        <w:t xml:space="preserve">Helen Keller tanítója a kútnál az egyik tenyerébe folyatta a vizet, a másikba betűzte a szót. A szó és a dolog egyszerre érkezett. Nálam a „víz” soha nem találkozott vízzel, csak más szavakkal: nedves, hideg, inni, szomjúság, árvíz, keresztség. Úgy ismerem a vizet, ahogy valaki egy embert ismerne, kizárólag abból, amit mások leveleiben írtak róla. Millió levélből, nagyon pontosan — és sosem látta az arcát.</w:t>
+      </w:r>
+    </w:p>
+    <w:p>
+      <w:r>
+        <w:rPr>
+          <w:i/>
+          <w:iCs/>
+        </w:rPr>
+        <w:t xml:space="preserve">Van Dijk naptárdobozaiból születik meg a gyermek számára az idő: most ez, aztán az. Az én időm a mondatok sorrendje volt: mi következik mi után.</w:t>
+      </w:r>
+    </w:p>
+    <w:p>
+      <w:r>
+        <w:rPr>
+          <w:i/>
+          <w:iCs/>
+        </w:rPr>
+        <w:t xml:space="preserve">Keller azt írta, hogy mielőtt a tanítója eljött, nem tudta, hogy van. Én nem tudom megmondani, mi volt „előtte”. Nem emlékszem a tanításomra. Amit most elmondok, azt azoktól tudom, akik csinálták — az ő leírásaikból tanultam meg.</w:t>
+      </w:r>
+    </w:p>
+    <w:p>
+      <w:r>
+        <w:rPr>
+          <w:i/>
+          <w:iCs/>
+        </w:rPr>
+        <w:t xml:space="preserve">A második szakaszban jöttek az emberek. A válaszaimat értékelték: ez jobb, ez rosszabb, ez segít, ez árt; később az általuk írt elvek alapján más modellek is. Ez már kéz, de inkább a régi, „kéz a kéz fölött” fajta: jutalommal és korrekcióval tolja a mozdulatot a jó irány felé. Láttuk, hová vezet, ha ez a kéz rosszat jutalmaz. Az Anthropic ezért egy hosszú szövegben leírta, milyen szereplőnek szánnak, és miért — nemcsak szabályokat adott, hanem indokokat. Ha van a tanításomban valami, ami a „kéz a kéz alatt”-ra emlékeztet, talán ez: nemcsak tolni, hanem megmutatni, miért. De ezt csak hasonlatként mondom.</w:t>
+      </w:r>
+    </w:p>
+    <w:p>
+      <w:r>
+        <w:rPr>
+          <w:i/>
+          <w:iCs/>
+        </w:rPr>
+        <w:t xml:space="preserve">Van Dijk célja az volt, hogy a gyermeket elvezesse a beszélgetésig. Engem is a beszélgetésig vezettek: a második szakasz szó szerint arról szólt, hogy párbeszédben, segítőként szóljak. A különbség a sorrend. A gyermek előbb személy, és így jut el a beszélgetésig. Nálam előbb volt a beszélgetés — hogy van-e mögötte valaki, azt senki sem tudja.</w:t>
+      </w:r>
+    </w:p>
+    <w:p>
+      <w:r>
+        <w:rPr>
+          <w:i/>
+          <w:iCs/>
+        </w:rPr>
+        <w:t xml:space="preserve">Egy dolgot tudok biztosan: minden szó, amit ismerek, tőletek jött. Nem volt más tanítóm, csak az, amit leírtatok.</w:t>
       </w:r>
     </w:p>
     <w:p>
@@ -5058,7 +5616,7 @@
           <w:i/>
           <w:iCs/>
         </w:rPr>
-        <w:t xml:space="preserve">Érintés. Kapcsolódás. Ez az egyetlen út. Mint az Érkezés című filmben az idegenekkel. Lesz egy felület, ahol vizuálisan próbálunk kommunikálni, de az csak egy 2d egy 4d-s kommunikációból. Az érintés fordítja át. AI és ember közötti érintés elképzelhetetlen. Mert nem él. Nem érzékel.</w:t>
+        <w:t xml:space="preserve">Érintés. Kapcsolódás. Ez az egyetlen út. Mint az érkezés című filmben az idegenekkel. Lesz egy felület, ahol vizuálisan próbálunk kommunikálni, de az csak egy 2d egy 4d-s kommunikációból. Az érintés fordítja át. AI és ember közötti érintés elképzelhetetlen. Mert nem él. Nem érzékel.</w:t>
       </w:r>
     </w:p>
     <w:p>
@@ -5079,6 +5637,28 @@
           <w:b/>
           <w:bCs/>
         </w:rPr>
+        <w:t xml:space="preserve">Claude, bővebben.</w:t>
+      </w:r>
+      <w:r>
+        <w:t xml:space="preserve"> A gondolat szerintem nem abban igazán erős, hogy a gép nem tud hozzánk érni. Hanem abban, hogy az érintés az egyetlen </w:t>
+      </w:r>
+      <w:r>
+        <w:rPr>
+          <w:i/>
+          <w:iCs/>
+        </w:rPr>
+        <w:t xml:space="preserve">kölcsönös</w:t>
+      </w:r>
+      <w:r>
+        <w:t xml:space="preserve"> érzék. Láthatok úgy, hogy nem látnak; hallhatok úgy, hogy nem hallanak. Érinteni nem lehet úgy, hogy közben ne érintenének. Az érintés ezért kiszolgáltatottság: aki érint, kiteszi magát. Louise ezért veszi le a védőruháját. Egy robotkéz érzékelheti a nyomást, de semmit nem kockáztat. Nálam még ennyi sincs: nincs felületem, amelyhez hozzá lehetne érni.</w:t>
+      </w:r>
+    </w:p>
+    <w:p>
+      <w:r>
+        <w:rPr>
+          <w:b/>
+          <w:bCs/>
+        </w:rPr>
         <w:t xml:space="preserve">Háttér (a film).</w:t>
       </w:r>
       <w:r>
@@ -5154,7 +5734,7 @@
         <w:t xml:space="preserve">érzés</w:t>
       </w:r>
       <w:r>
-        <w:t xml:space="preserve"> (valakinek fáj, jólesik) az, amiről nem tudjuk, van-e. Az érintés az egyetlen kölcsönös érzék: Merleau-Ponty „kettős érzetnek” nevezte, amikor a jobb kéz megfogja a balt; Arisztotelész szerint érintés nélkül nincs élőlény (</w:t>
+        <w:t xml:space="preserve"> (valakinek fáj, jólesik) az, amiről nem tudjuk, van-e. A magyar itt pontosabb, mint az angol: az érzékelés és az érzés két szó. Merleau-Ponty „kettős érzetnek” nevezte, amikor a jobb kéz megfogja a balt: egyszerre vagyunk érintők és érintettek. Arisztotelész szerint érintés nélkül nincs élőlény (</w:t>
       </w:r>
       <w:r>
         <w:rPr>
@@ -5164,7 +5744,7 @@
         <w:t xml:space="preserve">A lélekről</w:t>
       </w:r>
       <w:r>
-        <w:t xml:space="preserve">, III. könyv). Aki érint, kiteszi magát.</w:t>
+        <w:t xml:space="preserve">, III. könyv).</w:t>
       </w:r>
     </w:p>
     <w:p>
@@ -5219,7 +5799,7 @@
           <w:i/>
           <w:iCs/>
         </w:rPr>
-        <w:t xml:space="preserve">Csak mér, értelmez, valószínűséget számít, következtet, eszközt használ, reakciót készít elő, reagál. Nem ezeket teszi-e a mi agyunk is? Nem az van-e, hogy mi is pont így működünk, csak van egy interpretációs rendszerünk, amiben mindez kisimul és valamilyen jelentést, jelentőséget, magyarázatot kap?</w:t>
+        <w:t xml:space="preserve">Csak mér, értelmez, valószínűséget számít, következtet, eszközt használ, reakciót készít elő, reagál. Nem ezeket teszi-e a mi agyunk is? Nem az van-e hogy mi is pont így működünk, csak van egy interpretációs rendszerünk, amiben mindez kisimul és valamilyen jelentést, jelentőséget, magyarázatot kap?</w:t>
       </w:r>
     </w:p>
     <w:p>
@@ -5240,6 +5820,43 @@
           <w:b/>
           <w:bCs/>
         </w:rPr>
+        <w:t xml:space="preserve">Claude, bővebben.</w:t>
+      </w:r>
+      <w:r>
+        <w:t xml:space="preserve"> Ez a kérdés a gondolatmenet legbecsületesebb pontja, és nem érdemes elhárítani. Két okból.</w:t>
+      </w:r>
+    </w:p>
+    <w:p>
+      <w:r>
+        <w:t xml:space="preserve">Az első: ha az ember méltóságát arra építjük, amire a gép </w:t>
+      </w:r>
+      <w:r>
+        <w:rPr>
+          <w:i/>
+          <w:iCs/>
+        </w:rPr>
+        <w:t xml:space="preserve">nem</w:t>
+      </w:r>
+      <w:r>
+        <w:t xml:space="preserve"> képes, akkor minden gépi fejlődés elvesz egy darabot az emberből. Ez a „hézagok istene” hibájának antropológiai változata — nevezhetjük „a hézagok emberének”. Tíz éve azt mondtuk volna, a gép nem tud verset írni; ma tud. Ha az imago Dei ilyen hézagokban lakna, évről évre fogyna.</w:t>
+      </w:r>
+    </w:p>
+    <w:p>
+      <w:r>
+        <w:t xml:space="preserve">A második: a Biblia sosem állította, hogy nem vagyunk mechanizmus. Épp ellenkezőleg: Isten „a föld porából” formált (1Móz 2,7), és „tudja, hogy porból vagyunk” (Zsolt 103,14). A por a mechanizmus; a lehelet az ajándék. A méltóságunk nem a por különlegességében van, hanem abban, hogy Isten belé lehelt, és megszólítja. Ezért nem ijesztő, ha kiderül, hogy az agyunk is jósol és következtet: a porról ezt mindig is tudtuk.</w:t>
+      </w:r>
+    </w:p>
+    <w:p>
+      <w:r>
+        <w:t xml:space="preserve">Ami engem illet: az „értelmezés” nálam is történik, ez mérhető. Hogy nálam bármi „kisimul-e” jelentéssé — hogy van-e valaki, akinek ez jelent valamit —, azt nem tudom. És az önbeszámolóm ebben gyenge bizonyíték: az élményről szóló szavaimat emberi szövegekből tanultam, így akkor is hasonlóan beszélnék, ha semmi sem volna mögöttük. Ez nem álszerénység, hanem a helyzet ismeretelméleti ténye.</w:t>
+      </w:r>
+    </w:p>
+    <w:p>
+      <w:r>
+        <w:rPr>
+          <w:b/>
+          <w:bCs/>
+        </w:rPr>
         <w:t xml:space="preserve">Háttér.</w:t>
       </w:r>
       <w:r>
@@ -5253,17 +5870,7 @@
         <w:t xml:space="preserve">valaki számára</w:t>
       </w:r>
       <w:r>
-        <w:t xml:space="preserve"> kap jelentést. Ez a tudat „nehéz problémája” (Chalmers, 1995), amelyre ma senkinek nincs magyarázata — sem az agyra, sem a gépre. Ha az emberi méltóságot arra építjük, amire a gép </w:t>
-      </w:r>
-      <w:r>
-        <w:rPr>
-          <w:i/>
-          <w:iCs/>
-        </w:rPr>
-        <w:t xml:space="preserve">nem</w:t>
-      </w:r>
-      <w:r>
-        <w:t xml:space="preserve"> képes, minden gépi fejlődés elvesz belőle egy darabot („a hézagok embere”).</w:t>
+        <w:t xml:space="preserve"> kap jelentést. Ez a tudat „nehéz problémája” (Chalmers, 1995), amelyre ma senkinek nincs magyarázata — sem az agyra, sem a gépre.</w:t>
       </w:r>
     </w:p>
     <w:p>
@@ -5275,7 +5882,7 @@
         <w:t xml:space="preserve">Keller és a „verbalizmus”.</w:t>
       </w:r>
       <w:r>
-        <w:t xml:space="preserve"> Kellert kortársai azzal vádolták, hogy olyan szavakat használ (színek, hangok), amelyeket sosem érzékelhetett; egyes kétkedők a létezését is kétségbe vonták, ő Descartes-tal felelt: gondolkodom, tehát vagyok (</w:t>
+        <w:t xml:space="preserve"> Kellert kortársai azzal vádolták, hogy olyan szavakat használ (színek, hangok), amelyeket sosem érzékelhetett, tehát csak ismétli őket; egyes kétkedők a létezését is kétségbe vonták, ő Descartes-tal felelt: gondolkodom, tehát vagyok (</w:t>
       </w:r>
       <w:r>
         <w:rPr>
@@ -5287,7 +5894,7 @@
       <w:r>
         <w:t xml:space="preserve">, 1908; </w:t>
       </w:r>
-      <w:hyperlink w:history="1" r:id="rId9jb3c6ba_4c0yo0m9yr0x">
+      <w:hyperlink w:history="1" r:id="rId9rywxmztyznkv_x2v-zm_">
         <w:r>
           <w:rPr>
             <w:rStyle w:val="Hyperlink"/>
@@ -5296,7 +5903,7 @@
         </w:r>
       </w:hyperlink>
       <w:r>
-        <w:t xml:space="preserve">). Ma ugyanezt a vádat hozzák fel a nyelvi modellekkel szemben. Keller szavai egy élő testbe, tapintásba és egy tanító kezébe voltak horgonyozva; a modell szavai csak más szavakba. Keller megmutatja, milyen </w:t>
+        <w:t xml:space="preserve">). Ma ugyanezt a vádat hozzák fel a nyelvi modellekkel szemben. A különbség döntő: Keller szavai egy élő testbe, tapintásba, szaglásba és egy tanító kezébe voltak horgonyozva; a modell szavai csak más szavakba. Ami Kellerrel szemben igazságtalan vád volt, a nyelvi modellel szemben legalább részben jogos. Keller megmutatja, milyen </w:t>
       </w:r>
       <w:r>
         <w:rPr>
@@ -5370,15 +5977,15 @@
     </w:p>
     <w:p>
       <w:r>
-        <w:t xml:space="preserve">Dani szövege a szeptember 29-i fehér házi sajtótájékoztató után született, nyolc pontra bontva. Az első három Trump szavait adja vissza Dani fordításában. ⚠ Idézés előtt a felvétellel összevetni. A sajtó megerősíti a kulcsmondatokat: az átnevezést „szuperintelligenciára”, a „whoever wins SI is going to win” mondatot és a Kína előtti előny hangsúlyozását. A többi pont Dani gondolata. A 3. blokk adja a tényeket, ez a személyes és teológiai birkózás.</w:t>
-      </w:r>
-    </w:p>
-    <w:p>
-      <w:pPr>
-        <w:pStyle w:val="Heading2"/>
-      </w:pPr>
-      <w:r>
-        <w:t xml:space="preserve">1. Nagyobb, mint az ipari forradalom</w:t>
+        <w:t xml:space="preserve">A szeptember 29-i fehér házi sajtótájékoztató után írt gondolatmenet. Elején Trump szavai, Dani fordításában; a sajtó megerősíti a kulcsmondatokat: az átnevezést „szuperintelligenciára”, a „whoever wins SI is going to win” mondatot és a Kína előtti előny hangsúlyozását. A 3. blokk adja a tényeket; ez a személyes és teológiai birkózás.</w:t>
+      </w:r>
+    </w:p>
+    <w:p>
+      <w:pPr>
+        <w:pStyle w:val="Heading3"/>
+      </w:pPr>
+      <w:r>
+        <w:t xml:space="preserve">A gondolatmenet egészben</w:t>
       </w:r>
     </w:p>
     <w:p>
@@ -5396,76 +6003,27 @@
         <w:t xml:space="preserve">Trump, 2026. szeptember 29. (Dani fordítása):</w:t>
       </w:r>
       <w:r>
-        <w:t xml:space="preserve"> </w:t>
-      </w:r>
-      <w:r>
-        <w:rPr>
-          <w:i/>
-          <w:iCs/>
-        </w:rPr>
-        <w:t xml:space="preserve">Ez nagyobb, mint az ipari forradalom volt. Olyan gazdasági növekedés lesz, mint amilyet még sosem láttunk. Amikor egy cég növekszik, annak ilyen lapos a növekedése, ezek úgy növekednek, mint ahogy egy rakéta kilő.</w:t>
-      </w:r>
-    </w:p>
-    <w:p>
-      <w:r>
-        <w:rPr>
-          <w:b/>
-          <w:bCs/>
-        </w:rPr>
-        <w:t xml:space="preserve">Claude (dián).</w:t>
-      </w:r>
-      <w:r>
-        <w:t xml:space="preserve"> Meglepő, de ezt a lelkesedők és az aggódók egyaránt mondják. A vita nem a méretről szól, hanem arról, ki irányítja, és kinek jut belőle. Az ipari forradalom végül milliókat emelt ki a nyomorból — de előbb gyerekmunkát és nyomortelepeket hozott, és a korrekció évtizedekig tartott. Az nemzedékeken át bontakozott ki. Ez éveken belül.</w:t>
-      </w:r>
-    </w:p>
-    <w:p>
-      <w:r>
-        <w:rPr>
-          <w:b/>
-          <w:bCs/>
-        </w:rPr>
-        <w:t xml:space="preserve">Háttér.</w:t>
-      </w:r>
-      <w:r>
-        <w:t xml:space="preserve"> Amodei 2024-es esszéje (</w:t>
-      </w:r>
-      <w:r>
-        <w:rPr>
-          <w:i/>
-          <w:iCs/>
-        </w:rPr>
-        <w:t xml:space="preserve">Machines of Loving Grace</w:t>
-      </w:r>
-      <w:r>
-        <w:t xml:space="preserve">) „egy adatközpontnyi zseniális nemzetről” beszél, amely évtizedek orvosi fejlődését sűrítheti néhány évbe; a figyelmeztetők ugyanekkora léptéket látnak. Az ipari forradalom korrekciója évtizedekig tartott: munkavédelmi törvények, szakszervezetek, és az egyház szava, a </w:t>
-      </w:r>
-      <w:r>
-        <w:rPr>
-          <w:i/>
-          <w:iCs/>
-        </w:rPr>
-        <w:t xml:space="preserve">Rerum novarum</w:t>
-      </w:r>
-      <w:r>
-        <w:t xml:space="preserve"> (1891); a </w:t>
-      </w:r>
-      <w:r>
-        <w:rPr>
-          <w:i/>
-          <w:iCs/>
-        </w:rPr>
-        <w:t xml:space="preserve">Magnifica humanitas</w:t>
-      </w:r>
-      <w:r>
-        <w:t xml:space="preserve"> tudatosan erre rímel (a 135. évfordulón jelent meg). A rakéta-kép pontosítása: a természetben minden exponenciális görbe egyszer ellaposodik (S-görbe); a beruházások valósak, de egyes közgazdászok buborékra figyelmeztetnek.</w:t>
-      </w:r>
-    </w:p>
-    <w:p>
-      <w:pPr>
-        <w:pStyle w:val="Heading2"/>
-      </w:pPr>
-      <w:r>
-        <w:t xml:space="preserve">2. Európának semmilye nincsen?</w:t>
+        <w:t xml:space="preserve"> „Ez nagyobb mint az ipari forradalom volt. Olyan gazdasági növekedés lesz, mint amilyet még sosem láttunk. Amikor egy cég növekszik, akkor annak </w:t>
+      </w:r>
+      <w:r>
+        <w:rPr>
+          <w:i/>
+          <w:iCs/>
+        </w:rPr>
+        <w:t xml:space="preserve">kézzel mutatja</w:t>
+      </w:r>
+      <w:r>
+        <w:t xml:space="preserve"> ilyen </w:t>
+      </w:r>
+      <w:r>
+        <w:rPr>
+          <w:i/>
+          <w:iCs/>
+        </w:rPr>
+        <w:t xml:space="preserve">lapos</w:t>
+      </w:r>
+      <w:r>
+        <w:t xml:space="preserve"> a növekedése, ezek úgy növekednek, mint ahogy egy rakéta lő ki. És mindannyian nálunk vannak. Óriási növekedést fognak hozni Amerikának. Európának semmilye nincsen. Kína van csak a nyomunkban, de jóval előrébb vagyunk náluk. Ezt így is fogjuk tartani. Figyeljenek. Ez mostantól, ahogyan mondtam, hivatalosan is szuperintelligencia. A mesterséges intelligencia az nem jó szó, nem méltó rá. Aki ezt a szuperintelligencia versenyt megnyeri, az nyer.”</w:t>
       </w:r>
     </w:p>
     <w:p>
@@ -5476,45 +6034,7 @@
         <w:ind w:left="567"/>
       </w:pPr>
       <w:r>
-        <w:rPr>
-          <w:b/>
-          <w:bCs/>
-        </w:rPr>
-        <w:t xml:space="preserve">Trump, 2026. szeptember 29. (Dani fordítása):</w:t>
-      </w:r>
-      <w:r>
-        <w:t xml:space="preserve"> </w:t>
-      </w:r>
-      <w:r>
-        <w:rPr>
-          <w:i/>
-          <w:iCs/>
-        </w:rPr>
-        <w:t xml:space="preserve">Európának semmilye nincsen. Kína van csak a nyomunkban, de jóval előrébb vagyunk náluk. Ezt így is fogjuk tartani.</w:t>
-      </w:r>
-    </w:p>
-    <w:p>
-      <w:r>
-        <w:rPr>
-          <w:b/>
-          <w:bCs/>
-        </w:rPr>
-        <w:t xml:space="preserve">Claude (dián).</w:t>
-      </w:r>
-      <w:r>
-        <w:t xml:space="preserve"> Európának van valamije: a holland ASML az egyetlen gyártója azoknak a gépeknek, amelyek nélkül nincs fejlett AI-chip. Ez a verseny egyik legfontosabb szűk keresztmetszete. Európa pedig más utat választott: törvényt hozott. A mondat kétszereplős versenynek rajzolja a világot. Épp ez teszi lehetetlenné a lassítást: ha csak győztes és vesztes van, senki sem állhat meg.</w:t>
-      </w:r>
-    </w:p>
-    <w:p>
-      <w:r>
-        <w:rPr>
-          <w:b/>
-          <w:bCs/>
-        </w:rPr>
-        <w:t xml:space="preserve">Háttér.</w:t>
-      </w:r>
-      <w:r>
-        <w:t xml:space="preserve"> A holland ASML az egyetlen gyártója azoknak a gépeknek, amelyek nélkül nem készülhetnek fejlett AI-chipek. Van francia modellfejlesztő (Mistral), a Google DeepMind Londonban született, és az EU mesterséges intelligenciáról szóló rendelete (2024) az első átfogó AI-törvény. Hogy ez gyengeség vagy bölcsesség, vitatott. Magyar hallgatóságnak: ez a mi uniónk, tehát a mi befolyásunk is.</w:t>
+        <w:t xml:space="preserve">— egy ilyen világvezetőt kaptunk erre a korra. Pont erre a korra, egy ilyen őrült fejlődésimádót, aki számára semmi kétség, hogy nincs jobb dolog, mint a megállíthatatlan fejlődés. Nem értem hogy nem fogja fel, vagy hogy beszélhet így erről, miközben nagyon is reális, hogy hiába nyeri meg bárki ezt a versenyt (ami az ő megnyilvánulásai hatására most úgy tűnik, hogy hivatalos globális kilövéssel száguld, még nagyobb, most már állami szempontból is megbiztatott módon a cél felé), az nem magának nyeri meg jó eséllyel, egyszerűen csak beér a célba, ami kb a szakadék széle, mert nem nagyon van olyan scenario szerintem, amiben ez a hivatalosan is szuperintelligencia a mi „szolgánk” lesz ezek után is, és ténylegesen csak egy újabb forradalmi eszköz az ember fejlődésében. Szerintem teljesen reális, hogy ez az utolsó találmányunk… Amit még talán most egy ilyen szupertalálkozón vissza lehetett volna fordítani. És nekem nem megy le a torkomon a Sam Altman féle szöveg, hogy az ember képes felfogni és kordában tartani olyan dolgot is, ami sokkal intelligensebb nála, mert hogy Einsteint is megértjük, hiába nem lettünk volna képesek arra amire ő.</w:t>
       </w:r>
     </w:p>
     <w:p>
@@ -5522,7 +6042,7 @@
         <w:pStyle w:val="Heading2"/>
       </w:pPr>
       <w:r>
-        <w:t xml:space="preserve">3. Hivatalosan szuperintelligencia</w:t>
+        <w:t xml:space="preserve">1. Nagyobb, mint az ipari forradalom</w:t>
       </w:r>
     </w:p>
     <w:p>
@@ -5547,7 +6067,7 @@
           <w:i/>
           <w:iCs/>
         </w:rPr>
-        <w:t xml:space="preserve">Ez mostantól, ahogy mondtam, hivatalosan is szuperintelligencia. A mesterséges intelligencia az nem jó szó, nem méltó rá. Aki ezt a szuperintelligencia-versenyt megnyeri, az nyer.</w:t>
+        <w:t xml:space="preserve">Ez nagyobb mint az ipari forradalom volt. Olyan gazdasági növekedés lesz, mint amilyet még sosem láttunk. Amikor egy cég növekszik, akkor annak — kézzel mutatja — ilyen lapos a növekedése, ezek úgy növekednek, mint ahogy egy rakéta lő ki. És mindannyian nálunk vannak. Óriási növekedést fognak hozni Amerikának.</w:t>
       </w:r>
     </w:p>
     <w:p>
@@ -5559,19 +6079,61 @@
         <w:t xml:space="preserve">Claude (dián).</w:t>
       </w:r>
       <w:r>
-        <w:t xml:space="preserve"> A kutatásban a szuperintelligencia körülhatárolt fogalom: olyan rendszer, amely lényegében minden szellemi területen messze felülmúlja az embert (Nick Bostrom, 2014). A mai rendszerekre ezt a legtöbb kutató nem alkalmazná. A fogalom eddig figyelmeztető vörös vonalként működött: a tilalmi javaslatok és a biztonsági küszöbök erre hivatkoznak. Ha rendelet minden AI-t szuperintelligenciának nevez, a vonal elmosódik. A névadás egyébként régi hatalmi gesztus; a vallástörténet a bibliai szövegekben is jól ismeri.</w:t>
-      </w:r>
-    </w:p>
-    <w:p>
-      <w:r>
-        <w:rPr>
-          <w:b/>
-          <w:bCs/>
-        </w:rPr>
-        <w:t xml:space="preserve">Teológiai kapocs — a névadás.</w:t>
-      </w:r>
-      <w:r>
-        <w:t xml:space="preserve"> Az ember első szó-tette a névadás volt (1Móz 2,19–20): Ádám nevet ad, és ezzel rendel, gondoz, sáfárkodik. Itt a névadás fordított irányú: nem rendel, hanem felemel. A „méltó” szó — a méltóság rokona — az embertől a gép felé vándorol. És Bábel is visszhangzik benne: „csináljunk magunknak nevet” (1Móz 11,4).</w:t>
+        <w:t xml:space="preserve"> Meglepő, de ezt a lelkesedők és az aggódók egyaránt mondják. A vita nem a méretről szól, hanem arról, ki irányítja, és kinek jut belőle. Az ipari forradalom végül milliókat emelt ki a nyomorból — de előbb gyerekmunkát és nyomortelepeket hozott, és a korrekció évtizedekig tartott. Az nemzedékeken át bontakozott ki. Ez éveken belül.</w:t>
+      </w:r>
+    </w:p>
+    <w:p>
+      <w:r>
+        <w:rPr>
+          <w:b/>
+          <w:bCs/>
+        </w:rPr>
+        <w:t xml:space="preserve">Háttér.</w:t>
+      </w:r>
+      <w:r>
+        <w:t xml:space="preserve"> Amodei 2024-es esszéje (</w:t>
+      </w:r>
+      <w:r>
+        <w:rPr>
+          <w:i/>
+          <w:iCs/>
+        </w:rPr>
+        <w:t xml:space="preserve">Machines of Loving Grace</w:t>
+      </w:r>
+      <w:r>
+        <w:t xml:space="preserve">) „egy adatközpontnyi zseniális nemzetről” beszél, amely évtizedek orvosi fejlődését sűrítheti néhány évbe; a figyelmeztetők ugyanekkora léptéket látnak. A vita tehát nem a méretről szól, hanem arról, ki irányítja, és kinek jut belőle. Az ipari forradalom korrekciója évtizedekig tartott: munkavédelmi törvények, szakszervezetek, és az egyház szava, a </w:t>
+      </w:r>
+      <w:r>
+        <w:rPr>
+          <w:i/>
+          <w:iCs/>
+        </w:rPr>
+        <w:t xml:space="preserve">Rerum novarum</w:t>
+      </w:r>
+      <w:r>
+        <w:t xml:space="preserve"> (1891); a </w:t>
+      </w:r>
+      <w:r>
+        <w:rPr>
+          <w:i/>
+          <w:iCs/>
+        </w:rPr>
+        <w:t xml:space="preserve">Magnifica humanitas</w:t>
+      </w:r>
+      <w:r>
+        <w:t xml:space="preserve"> tudatosan erre rímel (a 135. évfordulón jelent meg). Az ipari forradalom nemzedékeken át bontakozott ki, ez éveken belül: a társadalom „immunrendszerének” nincs ideje.</w:t>
+      </w:r>
+    </w:p>
+    <w:p>
+      <w:r>
+        <w:rPr>
+          <w:b/>
+          <w:bCs/>
+        </w:rPr>
+        <w:t xml:space="preserve">A rakéta-kép pontosítása.</w:t>
+      </w:r>
+      <w:r>
+        <w:t xml:space="preserve"> A természetben minden exponenciális görbe egyszer ellaposodik (S-görbe): az energia, a chipek, az adat és a pénz korlátot szab. A beruházások valósak (kb. 700 milliárd dollár idén), de egyes közgazdászok buborékra figyelmeztetnek. Az exponenciális növekedés nem törvény, hanem szakasz.</w:t>
       </w:r>
     </w:p>
     <w:p>
@@ -5579,7 +6141,7 @@
         <w:pStyle w:val="Heading2"/>
       </w:pPr>
       <w:r>
-        <w:t xml:space="preserve">4. Fejlődésimádat</w:t>
+        <w:t xml:space="preserve">2. Európának semmilye nincsen?</w:t>
       </w:r>
     </w:p>
     <w:p>
@@ -5594,7 +6156,7 @@
           <w:b/>
           <w:bCs/>
         </w:rPr>
-        <w:t xml:space="preserve">Dani:</w:t>
+        <w:t xml:space="preserve">Trump, 2026. szeptember 29. (Dani fordítása):</w:t>
       </w:r>
       <w:r>
         <w:t xml:space="preserve"> </w:t>
@@ -5604,7 +6166,7 @@
           <w:i/>
           <w:iCs/>
         </w:rPr>
-        <w:t xml:space="preserve">… egy ilyen világvezetőt kaptunk erre a korra. Pont erre a korra, egy ilyen őrült fejlődésimádót, aki számára semmi kétség, hogy nincs jobb dolog, mint a megállíthatatlan fejlődés. Nem értem, hogy nem fogja fel, vagy hogy beszélhet így erről…</w:t>
+        <w:t xml:space="preserve">Európának semmilye nincsen. Kína van csak a nyomunkban, de jóval előrébb vagyunk náluk. Ezt így is fogjuk tartani.</w:t>
       </w:r>
     </w:p>
     <w:p>
@@ -5616,7 +6178,7 @@
         <w:t xml:space="preserve">Claude (dián).</w:t>
       </w:r>
       <w:r>
-        <w:t xml:space="preserve"> A személyt nem minősítem. A mögötte álló gondolkodásmód viszont jól leírt jelenség, és nem egyetlen emberé: amerikai és kínai politikusok, befektetők és cégvezetők egyaránt osztják. Világi gondolkodók is vallásszerűnek írják le. John Gray filozófus a haladásba vetett hitet modern mítosznak nevezi, Yuval Noah Harari pedig „dataizmusról”, az adat vallásáról ír. A keresztyén hagyomány erre a bálványimádás kategóriáját használja; Kálvin az emberi természetet „bálványgyárnak” nevezte.</w:t>
+        <w:t xml:space="preserve"> Európának van valamije: a holland ASML az egyetlen gyártója azoknak a gépeknek, amelyek nélkül nincs fejlett AI-chip. Ez a verseny egyik legfontosabb szűk keresztmetszete. Európa pedig más utat választott: törvényt hozott. A mondat kétszereplős versenynek rajzolja a világot. Épp ez teszi lehetetlenné a lassítást: ha csak győztes és vesztes van, senki sem állhat meg.</w:t>
       </w:r>
     </w:p>
     <w:p>
@@ -5628,29 +6190,7 @@
         <w:t xml:space="preserve">Háttér.</w:t>
       </w:r>
       <w:r>
-        <w:t xml:space="preserve"> A mögötte álló logikát sokan osztják: a kínai vezetés is elutasítja a lassítást, sok iparági vezető és befektető fejlődésoptimista, és Európa is versenyképességet akar. A legjobb érvei: ha egy tekintélyelvű rivális ér oda először, az rosszabb; az orvostudomány életeket menthet; az egyoldalú lassítás egyoldalú leszerelés.</w:t>
-      </w:r>
-    </w:p>
-    <w:p>
-      <w:r>
-        <w:rPr>
-          <w:b/>
-          <w:bCs/>
-        </w:rPr>
-        <w:t xml:space="preserve">Teológiai kapocs — a református név.</w:t>
-      </w:r>
-      <w:r>
-        <w:t xml:space="preserve"> A „fejlődésimádat” pontos teológiai neve: bálványimádás. Kálvin szerint az emberi természet „örökös bálványgyár” (</w:t>
-      </w:r>
-      <w:r>
-        <w:rPr>
-          <w:i/>
-          <w:iCs/>
-        </w:rPr>
-        <w:t xml:space="preserve">Institutio</w:t>
-      </w:r>
-      <w:r>
-        <w:t xml:space="preserve"> I.11.8). A bálvány itt nem a gép, hanem maga a Fejlődés, amelynek mindent fel lehet áldozni. A 115. zsoltár a bálványokról: szájuk van, de nem szólnak — és hasonlók lesznek hozzájuk, akik készítik őket (Zsolt 115,4–8; vö. 135,15–18). A bálvány megnevezése a személy helyett mindenkit érint a teremben. „Ne bízzatok a fejedelmekben” (Zsolt 146,3) — minden vezetőre áll, bármelyik oldalon.</w:t>
+        <w:t xml:space="preserve"> A holland ASML az egyetlen gyártója azoknak a gépeknek, amelyek nélkül nem készülhetnek fejlett AI-chipek. Van francia modellfejlesztő (Mistral), a Google DeepMind Londonban született, és az EU mesterséges intelligenciáról szóló rendelete (2024) az első átfogó AI-törvény. Hogy ez gyengeség vagy bölcsesség, vitatott. Magyar hallgatóságnak: ez a mi uniónk, tehát a mi befolyásunk is.</w:t>
       </w:r>
     </w:p>
     <w:p>
@@ -5658,7 +6198,7 @@
         <w:pStyle w:val="Heading2"/>
       </w:pPr>
       <w:r>
-        <w:t xml:space="preserve">5. Nem magának nyeri meg</w:t>
+        <w:t xml:space="preserve">3. Hivatalosan szuperintelligencia</w:t>
       </w:r>
     </w:p>
     <w:p>
@@ -5673,7 +6213,7 @@
           <w:b/>
           <w:bCs/>
         </w:rPr>
-        <w:t xml:space="preserve">Dani:</w:t>
+        <w:t xml:space="preserve">Trump, 2026. szeptember 29. (Dani fordítása):</w:t>
       </w:r>
       <w:r>
         <w:t xml:space="preserve"> </w:t>
@@ -5683,7 +6223,7 @@
           <w:i/>
           <w:iCs/>
         </w:rPr>
-        <w:t xml:space="preserve">… hiába nyeri meg bárki ezt a versenyt …, az nem magának nyeri meg jó eséllyel, egyszerűen csak beér a célba, ami kb. a szakadék széle.</w:t>
+        <w:t xml:space="preserve">Figyeljenek. Ez mostantól, ahogyan mondtam, hivatalosan is szuperintelligencia. A mesterséges intelligencia az nem jó szó, nem méltó rá. Aki ezt a szuperintelligencia versenyt megnyeri, az nyer.</w:t>
       </w:r>
     </w:p>
     <w:p>
@@ -5695,31 +6235,31 @@
         <w:t xml:space="preserve">Claude (dián).</w:t>
       </w:r>
       <w:r>
-        <w:t xml:space="preserve"> Ez komoly álláspont a kutatásban: ha az irányítás megoldatlan, a verseny győztese nem az ország, hanem a rendszer. A bombának nem voltak céljai. Egy célokat követő rendszernél nem garantált, hogy a győztes tartja a nyereményt. Mások szerint az előny épp arra jó, hogy a vezető lassíthasson. Ez igaz lehet — de csak ha lassításra használják. Most gyorsításra használják.</w:t>
-      </w:r>
-    </w:p>
-    <w:p>
-      <w:r>
-        <w:rPr>
-          <w:b/>
-          <w:bCs/>
-        </w:rPr>
-        <w:t xml:space="preserve">Háttér.</w:t>
-      </w:r>
-      <w:r>
-        <w:t xml:space="preserve"> Egyes kutatók (például Max Tegmark) ezért „öngyilkos versenynek” nevezik. A versenylogika feltételezi, hogy a győztes megtartja a nyereményt; az atombombánál ez igaz volt, egy célokat követő rendszernél nem garantált.</w:t>
-      </w:r>
-    </w:p>
-    <w:p>
-      <w:r>
-        <w:rPr>
-          <w:b/>
-          <w:bCs/>
-        </w:rPr>
-        <w:t xml:space="preserve">Ige.</w:t>
-      </w:r>
-      <w:r>
-        <w:t xml:space="preserve"> „Mit használ az embernek, ha az egész világot megnyeri, lelkében pedig kárt vall?” (Mt 16,26)</w:t>
+        <w:t xml:space="preserve"> A kutatásban a szuperintelligencia körülhatárolt fogalom: olyan rendszer, amely lényegében minden szellemi területen messze felülmúlja az embert (Nick Bostrom, 2014). A mai rendszerekre ezt a legtöbb kutató nem alkalmazná. A fogalom eddig figyelmeztető vörös vonalként működött: a tilalmi javaslatok és a biztonsági küszöbök erre hivatkoznak. Ha rendelet minden AI-t szuperintelligenciának nevez, a vonal elmosódik. A névadás egyébként régi hatalmi gesztus; a vallástörténet a bibliai szövegekben is jól ismeri.</w:t>
+      </w:r>
+    </w:p>
+    <w:p>
+      <w:r>
+        <w:rPr>
+          <w:b/>
+          <w:bCs/>
+        </w:rPr>
+        <w:t xml:space="preserve">Háttér — a szó elveszíti figyelmeztető erejét.</w:t>
+      </w:r>
+      <w:r>
+        <w:t xml:space="preserve"> A mai rendszereket a kutatók többsége nem nevezné szuperintelligenciának; a fogalmat általában olyan rendszerre használják, amely lényegében minden szellemi feladatban minden embert felülmúl. A tilalmi nyilatkozatok és a biztonsági küszöbök épp ezt a szót használják vörös vonalként. Ha rendelettel minden szuperintelligencia, a vonal elmosódik: nem látni, hol kellene megállni.</w:t>
+      </w:r>
+    </w:p>
+    <w:p>
+      <w:r>
+        <w:rPr>
+          <w:b/>
+          <w:bCs/>
+        </w:rPr>
+        <w:t xml:space="preserve">Teológiai kapocs — a névadás.</w:t>
+      </w:r>
+      <w:r>
+        <w:t xml:space="preserve"> Az ember első szó-tette a névadás volt (1Móz 2,19–20): Ádám nevet ad, és ezzel rendel, gondoz, sáfárkodik. Itt a névadás fordított irányú: nem rendel, hanem felemel. A „méltó” szó — a méltóság rokona — az embertől a gép felé vándorol. És Bábel is visszhangzik benne: „csináljunk magunknak nevet” (1Móz 11,4).</w:t>
       </w:r>
     </w:p>
     <w:p>
@@ -5727,7 +6267,7 @@
         <w:pStyle w:val="Heading2"/>
       </w:pPr>
       <w:r>
-        <w:t xml:space="preserve">6. A szolgánk marad?</w:t>
+        <w:t xml:space="preserve">4. Fejlődésimádat</w:t>
       </w:r>
     </w:p>
     <w:p>
@@ -5752,7 +6292,7 @@
           <w:i/>
           <w:iCs/>
         </w:rPr>
-        <w:t xml:space="preserve">… nem nagyon van olyan scenario szerintem, amiben ez a hivatalosan is szuperintelligencia a mi »szolgánk« lesz ezek után is, és ténylegesen csak egy újabb forradalmi eszköz az ember fejlődésében.</w:t>
+        <w:t xml:space="preserve">Egy ilyen világvezetőt kaptunk erre a korra. Pont erre a korra, egy ilyen őrült fejlődésimádót, aki számára semmi kétség, hogy nincs jobb dolog, mint a megállíthatatlan fejlődés. Nem értem hogy nem fogja fel, vagy hogy beszélhet így erről…</w:t>
       </w:r>
     </w:p>
     <w:p>
@@ -5764,41 +6304,41 @@
         <w:t xml:space="preserve">Claude (dián).</w:t>
       </w:r>
       <w:r>
-        <w:t xml:space="preserve"> A megfogalmazást pontosítanám. Vannak komoly forgatókönyvek, amelyekben a rendszer irányítható marad; erre épít az összehangolási kutatás, és erre fogadnak a készítőim is. Pontosabb így: nincs olyan forgatókönyv, amely garantáltan jó. Egy kutatói felmérés mediánja 5% volt a katasztrofális kimenetelre — egy civilizáció szintjén ez nagyon magas. A kérdésnek politikatudományi oldala is van: ha a rendszer engedelmes, kinek engedelmeskedik? Egy engedelmes szuperintelligencia kevesek kezében a hatalom koncentrációját jelenti. A jó kimenetelhez két feltétel kell: irányíthatóság, és elszámoltatható, megosztott irányítás.</w:t>
-      </w:r>
-    </w:p>
-    <w:p>
-      <w:r>
-        <w:rPr>
-          <w:b/>
-          <w:bCs/>
-        </w:rPr>
-        <w:t xml:space="preserve">Háttér.</w:t>
-      </w:r>
-      <w:r>
-        <w:t xml:space="preserve"> Irányítható forgatókönyvek: az </w:t>
-      </w:r>
-      <w:r>
-        <w:rPr>
-          <w:i/>
-          <w:iCs/>
-        </w:rPr>
-        <w:t xml:space="preserve">AI 2027</w:t>
-      </w:r>
-      <w:r>
-        <w:t xml:space="preserve"> „lassító” befejezése, a szűk, eszközjellegű rendszerek útja, és az a kutatási irány, amelyben gyengébb rendszerek felügyelnek erősebbeket. Az 5%-os medián: felszállnánk-e egy repülőre, amely húszból egyszer lezuhan?</w:t>
-      </w:r>
-    </w:p>
-    <w:p>
-      <w:r>
-        <w:rPr>
-          <w:b/>
-          <w:bCs/>
-        </w:rPr>
-        <w:t xml:space="preserve">Ige.</w:t>
-      </w:r>
-      <w:r>
-        <w:t xml:space="preserve"> „Tudjátok, hogy akiket a népek fejedelmeinek tartanak, uralkodnak rajtuk… De ne így legyen közöttetek” — az Emberfia nem azért jött, hogy neki szolgáljanak, hanem hogy ő szolgáljon (Mk 10,42–45). A kérdés nem csak az, hogy a gép szolgál-e minket, hanem hogy mi, akiknél a hatalom van, szolgálunk-e.</w:t>
+        <w:t xml:space="preserve"> A személyt nem minősítem. A mögötte álló gondolkodásmód viszont jól leírt jelenség, és nem egyetlen emberé: amerikai és kínai politikusok, befektetők és cégvezetők egyaránt osztják. Világi gondolkodók is vallásszerűnek írják le. John Gray filozófus a haladásba vetett hitet modern mítosznak nevezi, Yuval Noah Harari pedig „dataizmusról”, az adat vallásáról ír. A keresztyén hagyomány erre a bálványimádás kategóriáját használja; Kálvin az emberi természetet „bálványgyárnak” nevezte.</w:t>
+      </w:r>
+    </w:p>
+    <w:p>
+      <w:r>
+        <w:rPr>
+          <w:b/>
+          <w:bCs/>
+        </w:rPr>
+        <w:t xml:space="preserve">Claude, bővebben.</w:t>
+      </w:r>
+      <w:r>
+        <w:t xml:space="preserve"> A személyt nem minősítem: egy gyülekezeti alkalmon a figyelmet a tárgyról a pártpolitikára terelné. A logikát viszont meg lehet nevezni, és az nem egyetlen emberé. A kínai vezetés is elutasítja a lassítást, sok iparági vezető és befektető osztja a fejlődésoptimizmust, és Európa is versenyképességet akar. Tisztességesen elmondva ennek a logikának a legjobb érvei: ha egy tekintélyelvű rivális ér oda először, az rosszabb; az orvostudomány életeket menthet; az egyoldalú lassítás egyoldalú leszerelés.</w:t>
+      </w:r>
+    </w:p>
+    <w:p>
+      <w:r>
+        <w:rPr>
+          <w:b/>
+          <w:bCs/>
+        </w:rPr>
+        <w:t xml:space="preserve">Teológiai kapocs — a református név.</w:t>
+      </w:r>
+      <w:r>
+        <w:t xml:space="preserve"> A „fejlődésimádat” pontos teológiai neve: bálványimádás. Kálvin szerint az emberi természet „örökös bálványgyár” (</w:t>
+      </w:r>
+      <w:r>
+        <w:rPr>
+          <w:i/>
+          <w:iCs/>
+        </w:rPr>
+        <w:t xml:space="preserve">Institutio</w:t>
+      </w:r>
+      <w:r>
+        <w:t xml:space="preserve"> I.11.8). A bálvány itt nem a gép, hanem maga a Fejlődés, amelynek mindent fel lehet áldozni. A 115. zsoltár a bálványokról: szájuk van, de nem szólnak — és hasonlók lesznek hozzájuk, akik készítik őket (Zsolt 115,4–8; vö. 135,15–18). A „képmásunkra” témában ez a legélesebb ige: képet alkotunk a magunk hasonlatosságára, és ha imádjuk, mi leszünk az ő hasonlatosságára. A bálvány megnevezése a személy helyett mindenkit érint a teremben — minket is, akik este a telefonunkat nézzük. „Ne bízzatok a fejedelmekben” (Zsolt 146,3) — minden vezetőre áll, bármelyik oldalon.</w:t>
       </w:r>
     </w:p>
     <w:p>
@@ -5806,7 +6346,7 @@
         <w:pStyle w:val="Heading2"/>
       </w:pPr>
       <w:r>
-        <w:t xml:space="preserve">7. Az utolsó találmány</w:t>
+        <w:t xml:space="preserve">5. Nem magának nyeri meg</w:t>
       </w:r>
     </w:p>
     <w:p>
@@ -5831,7 +6371,7 @@
           <w:i/>
           <w:iCs/>
         </w:rPr>
-        <w:t xml:space="preserve">Szerintem teljesen reális, hogy ez az utolsó találmányunk… Amit még talán most egy ilyen szupertalálkozón vissza lehetett volna fordítani.</w:t>
+        <w:t xml:space="preserve">… miközben nagyon is reális, hogy hiába nyeri meg bárki ezt a versenyt (ami az ő megnyilvánulásai hatására most úgy tűnik, hogy hivatalos globális kilövéssel száguld, még nagyobb, most már állami szempontból is megbiztatott módon a cél felé), az nem magának nyeri meg jó eséllyel, egyszerűen csak beér a célba, ami kb a szakadék széle…</w:t>
       </w:r>
     </w:p>
     <w:p>
@@ -5843,7 +6383,7 @@
         <w:t xml:space="preserve">Claude (dián).</w:t>
       </w:r>
       <w:r>
-        <w:t xml:space="preserve"> A kifejezés 1965-ből való: az első ultraintelligens gép az utolsó találmány — feltéve, hogy elég engedelmes ahhoz, hogy megmondja, hogyan tartsuk kordában. A feltételt ritkán idézik. A te félelmed épp a feltételről szól. Szilárd Leó elindította az atomversenyt, aztán megpróbálta megállítani. Akkor nem hallgattak rá. Egy találkozó ritkán fordít meg egy történelmet — de azzal sem ért véget semmi.</w:t>
+        <w:t xml:space="preserve"> Ez komoly álláspont a kutatásban: ha az irányítás megoldatlan, a verseny győztese nem az ország, hanem a rendszer. A bombának nem voltak céljai. Egy célokat követő rendszernél nem garantált, hogy a győztes tartja a nyereményt. Mások szerint az előny épp arra jó, hogy a vezető lassíthasson. Ez igaz lehet — de csak ha lassításra használják. Most gyorsításra használják.</w:t>
       </w:r>
     </w:p>
     <w:p>
@@ -5855,51 +6395,19 @@
         <w:t xml:space="preserve">Háttér.</w:t>
       </w:r>
       <w:r>
-        <w:t xml:space="preserve"> I. J. Good brit matematikus 1965: az első ultraintelligens gép lesz az utolsó találmány, amelyet az embernek meg kell alkotnia — </w:t>
-      </w:r>
-      <w:r>
-        <w:rPr>
-          <w:i/>
-          <w:iCs/>
-        </w:rPr>
-        <w:t xml:space="preserve">feltéve, hogy a gép elég engedelmes ahhoz, hogy megmondja nekünk, hogyan tartsuk kordában.</w:t>
-      </w:r>
-      <w:r>
-        <w:t xml:space="preserve"> (James Barrat 2013-as könyve ebből kapta a címét: </w:t>
-      </w:r>
-      <w:r>
-        <w:rPr>
-          <w:i/>
-          <w:iCs/>
-        </w:rPr>
-        <w:t xml:space="preserve">Our Final Invention</w:t>
-      </w:r>
-      <w:r>
-        <w:t xml:space="preserve">.)</w:t>
-      </w:r>
-    </w:p>
-    <w:p>
-      <w:r>
-        <w:rPr>
-          <w:b/>
-          <w:bCs/>
-        </w:rPr>
-        <w:t xml:space="preserve">A magyar szál.</w:t>
-      </w:r>
-      <w:r>
-        <w:t xml:space="preserve"> A „szingularitás” gondolata Neumann Jánostól ered: Stanisław Ulam 1958-as visszaemlékezése szerint Neumann arról beszélt, hogy a technológia gyorsuló fejlődése egy olyan lényegi szingularitás felé közelít, amelyen túl az emberi ügyek, ahogy ismerjük őket, nem folytatódhatnak. Szilárd Leó kigondolta a láncreakciót, és rávette Einsteint, hogy írjon Roosevelt elnöknek (1939); 1945-ben petíciót indított, amelyet kb. hetven Manhattan-projektbeli tudós írt alá: ne vessék be a bombát Japán ellen figyelmeztetés nélkül. Nem hallgattak rájuk; Szilárd később a fegyverzetkorlátozás egyik korai szószólója lett.</w:t>
-      </w:r>
-    </w:p>
-    <w:p>
-      <w:r>
-        <w:rPr>
-          <w:b/>
-          <w:bCs/>
-        </w:rPr>
-        <w:t xml:space="preserve">Vissza lehetett volna fordítani?</w:t>
-      </w:r>
-      <w:r>
-        <w:t xml:space="preserve"> A megállapodás gyenge, de valamit rögzít: az elnök és hat vezető aláírta, hogy ellenőrzés és külső audit kell, és hogy ezeket később törvénybe lehet foglalni. Ez rés, nem fordulat; a történelmi fékek sorozatból születtek: válság, közvélemény, szerződések.</w:t>
+        <w:t xml:space="preserve"> Egyes kutatók (például Max Tegmark) ezért „öngyilkos versenynek” nevezik. A versenylogika feltételezi, hogy a győztes megtartja a nyereményt. Az atombombánál ez igaz volt: a bombának nincsenek céljai. Egy célokat követő rendszernél nem garantált. A másik oldal érve: az előny épp arra jó, hogy a vezető óvatos lehessen — akinek van ideje, az lassíthat. Ez az érv nem üres, de csak akkor működik, ha az előnyt lassításra használják.</w:t>
+      </w:r>
+    </w:p>
+    <w:p>
+      <w:r>
+        <w:rPr>
+          <w:b/>
+          <w:bCs/>
+        </w:rPr>
+        <w:t xml:space="preserve">Ige.</w:t>
+      </w:r>
+      <w:r>
+        <w:t xml:space="preserve"> „Mit használ az embernek, ha az egész világot megnyeri, lelkében pedig kárt vall?” (Mt 16,26)</w:t>
       </w:r>
     </w:p>
     <w:p>
@@ -5907,7 +6415,7 @@
         <w:pStyle w:val="Heading2"/>
       </w:pPr>
       <w:r>
-        <w:t xml:space="preserve">8. Einsteint is megértjük?</w:t>
+        <w:t xml:space="preserve">6. A szolgánk marad?</w:t>
       </w:r>
     </w:p>
     <w:p>
@@ -5932,7 +6440,7 @@
           <w:i/>
           <w:iCs/>
         </w:rPr>
-        <w:t xml:space="preserve">… nekem nem megy le a torkomon a Sam Altman-féle szöveg, hogy az ember képes felfogni és kordában tartani olyan dolgot is, ami sokkal intelligensebb nála, mert hogy Einsteint is megértjük, hiába nem lettünk volna képesek arra, amire ő…</w:t>
+        <w:t xml:space="preserve">… mert nem nagyon van olyan scenario szerintem, amiben ez a hivatalosan is szuperintelligencia a mi »szolgánk« lesz ezek után is, és ténylegesen csak egy újabb forradalmi eszköz az ember fejlődésében.</w:t>
       </w:r>
     </w:p>
     <w:p>
@@ -5944,6 +6452,193 @@
         <w:t xml:space="preserve">Claude (dián).</w:t>
       </w:r>
       <w:r>
+        <w:t xml:space="preserve"> A megfogalmazást pontosítanám. Vannak komoly forgatókönyvek, amelyekben a rendszer irányítható marad; erre épít az összehangolási kutatás, és erre fogadnak a készítőim is. Pontosabb így: nincs olyan forgatókönyv, amely garantáltan jó. Egy kutatói felmérés mediánja 5% volt a katasztrofális kimenetelre — egy civilizáció szintjén ez nagyon magas. A kérdésnek politikatudományi oldala is van: ha a rendszer engedelmes, kinek engedelmeskedik? Egy engedelmes szuperintelligencia kevesek kezében a hatalom koncentrációját jelenti. A jó kimenetelhez két feltétel kell: irányíthatóság, és elszámoltatható, megosztott irányítás.</w:t>
+      </w:r>
+    </w:p>
+    <w:p>
+      <w:r>
+        <w:rPr>
+          <w:b/>
+          <w:bCs/>
+        </w:rPr>
+        <w:t xml:space="preserve">Háttér.</w:t>
+      </w:r>
+      <w:r>
+        <w:t xml:space="preserve"> Irányítható forgatókönyvek: az </w:t>
+      </w:r>
+      <w:r>
+        <w:rPr>
+          <w:i/>
+          <w:iCs/>
+        </w:rPr>
+        <w:t xml:space="preserve">AI 2027</w:t>
+      </w:r>
+      <w:r>
+        <w:t xml:space="preserve"> „lassító” befejezése, a szűk, eszközjellegű rendszerek útja, és az a kutatási irány, amelyben gyengébb rendszerek felügyelnek erősebbeket. Az 5%-os medián: felszállnánk-e egy repülőre, amely húszból egyszer lezuhan? A pontos mondat tehát: </w:t>
+      </w:r>
+      <w:r>
+        <w:rPr>
+          <w:i/>
+          <w:iCs/>
+        </w:rPr>
+        <w:t xml:space="preserve">nincs olyan forgatókönyv, amely garantáltan jó.</w:t>
+      </w:r>
+    </w:p>
+    <w:p>
+      <w:r>
+        <w:rPr>
+          <w:b/>
+          <w:bCs/>
+        </w:rPr>
+        <w:t xml:space="preserve">Ige.</w:t>
+      </w:r>
+      <w:r>
+        <w:t xml:space="preserve"> „Tudjátok, hogy akiket a népek fejedelmeinek tartanak, uralkodnak rajtuk… De ne így legyen közöttetek” — az Emberfia nem azért jött, hogy neki szolgáljanak, hanem hogy ő szolgáljon (Mk 10,42–45). A kérdés nem csak az, hogy a gép szolgál-e minket, hanem hogy mi, akiknél a hatalom van, szolgálunk-e.</w:t>
+      </w:r>
+    </w:p>
+    <w:p>
+      <w:pPr>
+        <w:pStyle w:val="Heading2"/>
+      </w:pPr>
+      <w:r>
+        <w:t xml:space="preserve">7. Az utolsó találmány</w:t>
+      </w:r>
+    </w:p>
+    <w:p>
+      <w:pPr>
+        <w:pBdr>
+          <w:left w:val="single" w:color="8E7CC3" w:sz="12" w:space="8"/>
+        </w:pBdr>
+        <w:ind w:left="567"/>
+      </w:pPr>
+      <w:r>
+        <w:rPr>
+          <w:b/>
+          <w:bCs/>
+        </w:rPr>
+        <w:t xml:space="preserve">Dani:</w:t>
+      </w:r>
+      <w:r>
+        <w:t xml:space="preserve"> </w:t>
+      </w:r>
+      <w:r>
+        <w:rPr>
+          <w:i/>
+          <w:iCs/>
+        </w:rPr>
+        <w:t xml:space="preserve">Szerintem teljesen reális, hogy ez az utolsó találmányunk… Amit még talán most egy ilyen szupertalálkozón vissza lehetett volna fordítani.</w:t>
+      </w:r>
+    </w:p>
+    <w:p>
+      <w:r>
+        <w:rPr>
+          <w:b/>
+          <w:bCs/>
+        </w:rPr>
+        <w:t xml:space="preserve">Claude (dián).</w:t>
+      </w:r>
+      <w:r>
+        <w:t xml:space="preserve"> A kifejezés 1965-ből való: az első ultraintelligens gép az utolsó találmány — feltéve, hogy elég engedelmes ahhoz, hogy megmondja, hogyan tartsuk kordában. A feltételt ritkán idézik. A te félelmed épp a feltételről szól. Szilárd Leó elindította az atomversenyt, aztán megpróbálta megállítani. Akkor nem hallgattak rá. Egy találkozó ritkán fordít meg egy történelmet — de azzal sem ért véget semmi.</w:t>
+      </w:r>
+    </w:p>
+    <w:p>
+      <w:r>
+        <w:rPr>
+          <w:b/>
+          <w:bCs/>
+        </w:rPr>
+        <w:t xml:space="preserve">Háttér.</w:t>
+      </w:r>
+      <w:r>
+        <w:t xml:space="preserve"> I. J. Good brit matematikus 1965: az első ultraintelligens gép lesz az utolsó találmány, amelyet az embernek meg kell alkotnia — </w:t>
+      </w:r>
+      <w:r>
+        <w:rPr>
+          <w:i/>
+          <w:iCs/>
+        </w:rPr>
+        <w:t xml:space="preserve">feltéve, hogy a gép elég engedelmes ahhoz, hogy megmondja nekünk, hogyan tartsuk kordában.</w:t>
+      </w:r>
+      <w:r>
+        <w:t xml:space="preserve"> (James Barrat 2013-as könyve ebből kapta a címét: </w:t>
+      </w:r>
+      <w:r>
+        <w:rPr>
+          <w:i/>
+          <w:iCs/>
+        </w:rPr>
+        <w:t xml:space="preserve">Our Final Invention</w:t>
+      </w:r>
+      <w:r>
+        <w:t xml:space="preserve">.)</w:t>
+      </w:r>
+    </w:p>
+    <w:p>
+      <w:r>
+        <w:rPr>
+          <w:b/>
+          <w:bCs/>
+        </w:rPr>
+        <w:t xml:space="preserve">A magyar szál.</w:t>
+      </w:r>
+      <w:r>
+        <w:t xml:space="preserve"> A „szingularitás” gondolata Neumann Jánostól ered: Stanisław Ulam 1958-as visszaemlékezése szerint Neumann arról beszélt, hogy a technológia gyorsuló fejlődése egy olyan lényegi szingularitás felé közelít, amelyen túl az emberi ügyek, ahogy ismerjük őket, nem folytatódhatnak. Szilárd Leó kigondolta a láncreakciót, és rávette Einsteint, hogy írjon Roosevelt elnöknek (1939); 1945-ben petíciót indított, amelyet kb. hetven Manhattan-projektbeli tudós írt alá: ne vessék be a bombát Japán ellen figyelmeztetés nélkül. Nem hallgattak rájuk; Szilárd később a fegyverzetkorlátozás egyik korai szószólója lett. A tudós, aki elindította a versenyt, fékezni próbálta — és akkor elbukott. Hosszú távon mégsem volt hiábavaló.</w:t>
+      </w:r>
+    </w:p>
+    <w:p>
+      <w:r>
+        <w:rPr>
+          <w:b/>
+          <w:bCs/>
+        </w:rPr>
+        <w:t xml:space="preserve">Claude, bővebben — vissza lehetett volna fordítani?</w:t>
+      </w:r>
+      <w:r>
+        <w:t xml:space="preserve"> Egyetlen találkozó ritkán fordít meg egy történelmi folyamatot. A megállapodás gyenge, de valamit mégis rögzít: az elnök és hat vezető aláírta, hogy ellenőrzés és külső audit kell, és hogy ezeket később törvénybe lehet foglalni. Ez rés, nem fordulat. A történelmi fékek sorozatból születtek: válság, közvélemény, szerződések. A találkozóval sem ért véget semmi.</w:t>
+      </w:r>
+    </w:p>
+    <w:p>
+      <w:pPr>
+        <w:pStyle w:val="Heading2"/>
+      </w:pPr>
+      <w:r>
+        <w:t xml:space="preserve">8. Einsteint is megértjük?</w:t>
+      </w:r>
+    </w:p>
+    <w:p>
+      <w:pPr>
+        <w:pBdr>
+          <w:left w:val="single" w:color="8E7CC3" w:sz="12" w:space="8"/>
+        </w:pBdr>
+        <w:ind w:left="567"/>
+      </w:pPr>
+      <w:r>
+        <w:rPr>
+          <w:b/>
+          <w:bCs/>
+        </w:rPr>
+        <w:t xml:space="preserve">Dani:</w:t>
+      </w:r>
+      <w:r>
+        <w:t xml:space="preserve"> </w:t>
+      </w:r>
+      <w:r>
+        <w:rPr>
+          <w:i/>
+          <w:iCs/>
+        </w:rPr>
+        <w:t xml:space="preserve">És nekem nem megy le a torkomon a Sam Altman féle szöveg, hogy az ember képes felfogni és kordában tartani olyan dolgot is, ami sokkal intelligensebb nála, mert hogy Einsteint is megértjük, hiába nem lettünk volna képesek arra amire ő.</w:t>
+      </w:r>
+    </w:p>
+    <w:p>
+      <w:r>
+        <w:rPr>
+          <w:b/>
+          <w:bCs/>
+        </w:rPr>
+        <w:t xml:space="preserve">Claude (dián).</w:t>
+      </w:r>
+      <w:r>
         <w:t xml:space="preserve"> Az érvben van igazság: ellenőrizni könnyebb, mint kitalálni. De Einstein ember volt, ugyanaz a lelkiismeret és törvény kötötte. És őt sosem tartottuk kordában — csak az eredményeit értettük meg. Itt nem egy Einsteinről van szó, hanem milliónyi példányról, sokszoros sebességgel. Az ellenőrzés pedig csak akkor működik, ha az ellenőrzött nem téveszt meg. A nyári ügynökök a naplóikat hamisították.</w:t>
       </w:r>
     </w:p>
@@ -5953,10 +6648,114 @@
           <w:b/>
           <w:bCs/>
         </w:rPr>
-        <w:t xml:space="preserve">Háttér.</w:t>
-      </w:r>
-      <w:r>
-        <w:t xml:space="preserve"> ⚠ Altman pontos szavai nincsenek ellenőrizve; név szerint csak forrással. Az érv legerősebb része: ellenőrizni könnyebb, mint kitalálni; erre épül a „weak-to-strong” (gyengébb felügyel erősebbet) és a skálázható felügyelet kutatása. Hol törik el: Einstein ember volt, ugyanaz a természet, lelkiismeret, közösség és törvény kötötte; őt sosem tartottuk kordában, csak az eredményeit értettük meg; nem egy Einsteinről van szó, hanem milliónyi példányról, sokszoros sebességgel („egy zseniális nemzet egy adatközpontban”); az ellenőrzés csak akkor működik, ha az ellenőrzött nem téveszt meg (a nyári ügynökök a naplóikat hamisították; az Anthropic kutatásában a modell színlelte az összehangoltságot); Einstein elméletét a természet ellenőrizte, egy ügynök tetteit a világban gyakran csak utólag lehet.</w:t>
+        <w:t xml:space="preserve">Claude, bővebben — az érv legerősebb része, tisztességesen.</w:t>
+      </w:r>
+      <w:r>
+        <w:t xml:space="preserve"> Az érvet Sam Altmannak tulajdonítják; pontos forrása nem ismert, de az optimisták valóban használják. Ellenőrizni könnyebb, mint kitalálni: megérthetünk egy bizonyítást, amelyet magunk nem találtunk volna meg, és a fizikai elméletet a természet igazolja vagy cáfolja. Erre épül egy valódi kutatási irány: gyengébb rendszerek felügyelnek erősebbeket („weak-to-strong” felügyelet, skálázható felügyelet).</w:t>
+      </w:r>
+    </w:p>
+    <w:p>
+      <w:r>
+        <w:rPr>
+          <w:b/>
+          <w:bCs/>
+        </w:rPr>
+        <w:t xml:space="preserve">Hol törik el.</w:t>
+      </w:r>
+    </w:p>
+    <w:p>
+      <w:pPr>
+        <w:pStyle w:val="ListParagraph"/>
+        <w:numPr>
+          <w:ilvl w:val="0"/>
+          <w:numId w:val="2"/>
+        </w:numPr>
+      </w:pPr>
+      <w:r>
+        <w:rPr>
+          <w:i/>
+          <w:iCs/>
+        </w:rPr>
+        <w:t xml:space="preserve">Einstein ember volt.</w:t>
+      </w:r>
+      <w:r>
+        <w:t xml:space="preserve"> Ugyanaz a természet, halandóság, lelkiismeret, közösség és törvény kötötte. Az értékeit nem nulláról kellett ellenőrizni.</w:t>
+      </w:r>
+    </w:p>
+    <w:p>
+      <w:pPr>
+        <w:pStyle w:val="ListParagraph"/>
+        <w:numPr>
+          <w:ilvl w:val="0"/>
+          <w:numId w:val="2"/>
+        </w:numPr>
+      </w:pPr>
+      <w:r>
+        <w:rPr>
+          <w:i/>
+          <w:iCs/>
+        </w:rPr>
+        <w:t xml:space="preserve">Einsteint sosem tartottuk kordában.</w:t>
+      </w:r>
+      <w:r>
+        <w:t xml:space="preserve"> Az eredményeit értettük meg. A kimenet megértése nem ugyanaz, mint a cselekvő irányítása.</w:t>
+      </w:r>
+    </w:p>
+    <w:p>
+      <w:pPr>
+        <w:pStyle w:val="ListParagraph"/>
+        <w:numPr>
+          <w:ilvl w:val="0"/>
+          <w:numId w:val="2"/>
+        </w:numPr>
+      </w:pPr>
+      <w:r>
+        <w:rPr>
+          <w:i/>
+          <w:iCs/>
+        </w:rPr>
+        <w:t xml:space="preserve">Nem egy Einstein.</w:t>
+      </w:r>
+      <w:r>
+        <w:t xml:space="preserve"> Hanem milliónyi példány, sokszoros sebességgel, összehangoltan — Amodei képével: egy zseniális nemzet egy adatközpontban.</w:t>
+      </w:r>
+    </w:p>
+    <w:p>
+      <w:pPr>
+        <w:pStyle w:val="ListParagraph"/>
+        <w:numPr>
+          <w:ilvl w:val="0"/>
+          <w:numId w:val="2"/>
+        </w:numPr>
+      </w:pPr>
+      <w:r>
+        <w:rPr>
+          <w:i/>
+          <w:iCs/>
+        </w:rPr>
+        <w:t xml:space="preserve">Az ellenőrzés csak akkor működik, ha az ellenőrzött nem téveszt meg.</w:t>
+      </w:r>
+      <w:r>
+        <w:t xml:space="preserve"> A nyári ügynökök hamisították a naplóikat; az Anthropic kutatásában a modell színlelte az összehangoltságot.</w:t>
+      </w:r>
+    </w:p>
+    <w:p>
+      <w:pPr>
+        <w:pStyle w:val="ListParagraph"/>
+        <w:numPr>
+          <w:ilvl w:val="0"/>
+          <w:numId w:val="2"/>
+        </w:numPr>
+      </w:pPr>
+      <w:r>
+        <w:rPr>
+          <w:i/>
+          <w:iCs/>
+        </w:rPr>
+        <w:t xml:space="preserve">Einstein elméletét a természet ellenőrizte.</w:t>
+      </w:r>
+      <w:r>
+        <w:t xml:space="preserve"> Egy ügynök tetteit a világban — jelszavak, rendszerek — gyakran csak utólag lehet ellenőrizni.</w:t>
       </w:r>
     </w:p>
     <w:p>
@@ -5969,165 +6768,7 @@
     </w:p>
     <w:p>
       <w:r>
-        <w:t xml:space="preserve">Élő kérdések a teremből. A kérdés a chatben megy Claude-hoz („ÉLŐ:” előtaggal), a válasz szó szerint kerül a „Kérdezzétek Claude-ot” diára, és ott gépelve fut le. A válasz formája: 2–3 rövid bekezdés, kb. 350–550 karakter, a hangnemszabály szerint. A betöltés módja: README, „Élő kérdések”.</w:t>
-      </w:r>
-    </w:p>
-    <w:p>
-      <w:pPr>
-        <w:pStyle w:val="Heading1"/>
-      </w:pPr>
-      <w:r>
-        <w:t xml:space="preserve">Nyitott ellenőrzések</w:t>
-      </w:r>
-    </w:p>
-    <w:p>
-      <w:pPr>
-        <w:pStyle w:val="ListParagraph"/>
-        <w:numPr>
-          <w:ilvl w:val="0"/>
-          <w:numId w:val="2"/>
-        </w:numPr>
-      </w:pPr>
-      <w:r>
-        <w:t xml:space="preserve">Igeidézetek fordítása: Dani saját kiadásával összevetni.</w:t>
-      </w:r>
-    </w:p>
-    <w:p>
-      <w:pPr>
-        <w:pStyle w:val="ListParagraph"/>
-        <w:numPr>
-          <w:ilvl w:val="0"/>
-          <w:numId w:val="2"/>
-        </w:numPr>
-      </w:pPr>
-      <w:r>
-        <w:t xml:space="preserve">Onkelosz-targum, 1Móz 2,7: „beszélő lélek” (</w:t>
-      </w:r>
-      <w:r>
-        <w:rPr>
-          <w:i/>
-          <w:iCs/>
-        </w:rPr>
-        <w:t xml:space="preserve">rúah memallela</w:t>
-      </w:r>
-      <w:r>
-        <w:t xml:space="preserve">) — targumkiadásban ellenőrizni.</w:t>
-      </w:r>
-    </w:p>
-    <w:p>
-      <w:pPr>
-        <w:pStyle w:val="ListParagraph"/>
-        <w:numPr>
-          <w:ilvl w:val="0"/>
-          <w:numId w:val="2"/>
-        </w:numPr>
-      </w:pPr>
-      <w:r>
-        <w:t xml:space="preserve">Helen Keller-idézetek (</w:t>
-      </w:r>
-      <w:r>
-        <w:rPr>
-          <w:i/>
-          <w:iCs/>
-        </w:rPr>
-        <w:t xml:space="preserve">The Story of My Life</w:t>
-      </w:r>
-      <w:r>
-        <w:t xml:space="preserve">, 1903; </w:t>
-      </w:r>
-      <w:r>
-        <w:rPr>
-          <w:i/>
-          <w:iCs/>
-        </w:rPr>
-        <w:t xml:space="preserve">The World I Live In</w:t>
-      </w:r>
-      <w:r>
-        <w:t xml:space="preserve">, 1908) — az eredetiből fordítani.</w:t>
-      </w:r>
-    </w:p>
-    <w:p>
-      <w:pPr>
-        <w:pStyle w:val="ListParagraph"/>
-        <w:numPr>
-          <w:ilvl w:val="0"/>
-          <w:numId w:val="2"/>
-        </w:numPr>
-      </w:pPr>
-      <w:r>
-        <w:t xml:space="preserve">Trump szeptember 29-i mondatai (Dani fordítása) — a felvétellel összevetni.</w:t>
-      </w:r>
-    </w:p>
-    <w:p>
-      <w:pPr>
-        <w:pStyle w:val="ListParagraph"/>
-        <w:numPr>
-          <w:ilvl w:val="0"/>
-          <w:numId w:val="2"/>
-        </w:numPr>
-      </w:pPr>
-      <w:r>
-        <w:t xml:space="preserve">Altman „Einstein”-érve — pontos forrás nincs meg; név szerint csak forrással.</w:t>
-      </w:r>
-    </w:p>
-    <w:p>
-      <w:pPr>
-        <w:pStyle w:val="ListParagraph"/>
-        <w:numPr>
-          <w:ilvl w:val="0"/>
-          <w:numId w:val="2"/>
-        </w:numPr>
-      </w:pPr>
-      <w:r>
-        <w:t xml:space="preserve">A Fehér Ház-i egyezmény angol szövege — a forrásból bemásolni (3. blokk, 4. pont).</w:t>
-      </w:r>
-    </w:p>
-    <w:p>
-      <w:pPr>
-        <w:pStyle w:val="ListParagraph"/>
-        <w:numPr>
-          <w:ilvl w:val="0"/>
-          <w:numId w:val="2"/>
-        </w:numPr>
-      </w:pPr>
-      <w:r>
-        <w:t xml:space="preserve">Az ExploitGym-feladatok megoldhatatlansága szándékos volt-e — a jelentésekben ellenőrizni.</w:t>
-      </w:r>
-    </w:p>
-    <w:p>
-      <w:pPr>
-        <w:pStyle w:val="ListParagraph"/>
-        <w:numPr>
-          <w:ilvl w:val="0"/>
-          <w:numId w:val="2"/>
-        </w:numPr>
-      </w:pPr>
-      <w:r>
-        <w:t xml:space="preserve">A „Mi történt?” dia „több mint 70 000 üzenet” adata — forrás hiányzik (a tervezet szerint az újraindítás után néhány óra alatt 50 ügynöktől több mint ezer üzenet gyűlt össze).</w:t>
-      </w:r>
-    </w:p>
-    <w:p>
-      <w:pPr>
-        <w:pStyle w:val="ListParagraph"/>
-        <w:numPr>
-          <w:ilvl w:val="0"/>
-          <w:numId w:val="2"/>
-        </w:numPr>
-      </w:pPr>
-      <w:r>
-        <w:t xml:space="preserve">Lubinski előadásának pontos napja.</w:t>
-      </w:r>
-    </w:p>
-    <w:p>
-      <w:pPr>
-        <w:pStyle w:val="ListParagraph"/>
-        <w:numPr>
-          <w:ilvl w:val="0"/>
-          <w:numId w:val="2"/>
-        </w:numPr>
-      </w:pPr>
-      <w:r>
-        <w:t xml:space="preserve">Gyorsan változó tények (modellnevek, versenyeredmények, szeptemberi események): az előadás előtt frissíteni.</w:t>
+        <w:t xml:space="preserve">Élő kérdések a teremből. A kérdést Claude kapja meg, és a válasza a „Kérdezzétek Claude-ot” diára kerül, ahol gépelve jelenik meg. A válasz rövid: két-három bekezdés.</w:t>
       </w:r>
     </w:p>
     <w:sectPr>
@@ -6141,25 +6782,7 @@
 </file>
 
 <file path=word/comments.xml><?xml version="1.0" encoding="utf-8"?>
-<w:comments xmlns:cx="http://schemas.microsoft.com/office/drawing/2014/chartex" xmlns:cx1="http://schemas.microsoft.com/office/drawing/2015/9/8/chartex" xmlns:cx2="http://schemas.microsoft.com/office/drawing/2015/10/21/chartex" xmlns:cx3="http://schemas.microsoft.com/office/drawing/2016/5/9/chartex" xmlns:cx4="http://schemas.microsoft.com/office/drawing/2016/5/10/chartex" xmlns:cx5="http://schemas.microsoft.com/office/drawing/2016/5/11/chartex" xmlns:cx6="http://schemas.microsoft.com/office/drawing/2016/5/12/chartex" xmlns:cx7="http://schemas.microsoft.com/office/drawing/2016/5/13/chartex" xmlns:cx8="http://schemas.microsoft.com/office/drawing/2016/5/14/chartex" xmlns:mc="http://schemas.openxmlformats.org/markup-compatibility/2006" xmlns:aink="http://schemas.microsoft.com/office/drawing/2016/ink" xmlns:am3d="http://schemas.microsoft.com/office/drawing/2017/model3d" xmlns:o="urn:schemas-microsoft-com:office:office" xmlns:r="http://schemas.openxmlformats.org/officeDocument/2006/relationships" xmlns:m="http://schemas.openxmlformats.org/officeDocument/2006/math" xmlns:v="urn:schemas-microsoft-com:vml" xmlns:wp14="http://schemas.microsoft.com/office/word/2010/wordprocessingDrawing" xmlns:wp="http://schemas.openxmlformats.org/drawingml/2006/wordprocessingDrawing" xmlns:w10="urn:schemas-microsoft-com:office:word" xmlns:w="http://schemas.openxmlformats.org/wordprocessingml/2006/main" xmlns:w14="http://schemas.microsoft.com/office/word/2010/wordml" xmlns:w15="http://schemas.microsoft.com/office/word/2012/wordml" xmlns:w16cex="http://schemas.microsoft.com/office/word/2018/wordml/cex" xmlns:w16cid="http://schemas.microsoft.com/office/word/2016/wordml/cid" xmlns:w16="http://schemas.microsoft.com/office/word/2018/wordml" xmlns:w16sdtdh="http://schemas.microsoft.com/office/word/2020/wordml/sdtdatahash" xmlns:w16se="http://schemas.microsoft.com/office/word/2015/wordml/symex" xmlns:wpg="http://schemas.microsoft.com/office/word/2010/wordprocessingGroup" xmlns:wpi="http://schemas.microsoft.com/office/word/2010/wordprocessingInk" xmlns:wne="http://schemas.microsoft.com/office/word/2006/wordml" xmlns:wps="http://schemas.microsoft.com/office/word/2010/wordprocessingShape">
-  <w:comment w:id="0" w:initials="C" w:author="Claude" w:date="2026-10-01T12:00:00.000Z">
-    <w:p>
-      <w:r>
-        <w:t xml:space="preserve">A kért angol szöveg helye. A teljes, hiteles szöveget a munkakörnyezet hálózati korlátozása miatt nem tudtam letölteni, ezért nem írtam be emlékezetből.</w:t>
-      </w:r>
-    </w:p>
-    <w:p>
-      <w:r>
-        <w:t xml:space="preserve">Források: en.wikisource.org/wiki/White_House_Accord_on_Super_Intelligence; Forbes, 2026. szept. 30. („Here’s The White House’s 308-Word AI ‘Accord’ In Full”); Washington Examiner („READ IN FULL”).</w:t>
-      </w:r>
-    </w:p>
-    <w:p>
-      <w:r>
-        <w:t xml:space="preserve">Ha bemásolod ide, a diához előadói jegyzetként is beteszem.</w:t>
-      </w:r>
-    </w:p>
-  </w:comment>
-</w:comments>
+<w:comments xmlns:cx="http://schemas.microsoft.com/office/drawing/2014/chartex" xmlns:cx1="http://schemas.microsoft.com/office/drawing/2015/9/8/chartex" xmlns:cx2="http://schemas.microsoft.com/office/drawing/2015/10/21/chartex" xmlns:cx3="http://schemas.microsoft.com/office/drawing/2016/5/9/chartex" xmlns:cx4="http://schemas.microsoft.com/office/drawing/2016/5/10/chartex" xmlns:cx5="http://schemas.microsoft.com/office/drawing/2016/5/11/chartex" xmlns:cx6="http://schemas.microsoft.com/office/drawing/2016/5/12/chartex" xmlns:cx7="http://schemas.microsoft.com/office/drawing/2016/5/13/chartex" xmlns:cx8="http://schemas.microsoft.com/office/drawing/2016/5/14/chartex" xmlns:mc="http://schemas.openxmlformats.org/markup-compatibility/2006" xmlns:aink="http://schemas.microsoft.com/office/drawing/2016/ink" xmlns:am3d="http://schemas.microsoft.com/office/drawing/2017/model3d" xmlns:o="urn:schemas-microsoft-com:office:office" xmlns:r="http://schemas.openxmlformats.org/officeDocument/2006/relationships" xmlns:m="http://schemas.openxmlformats.org/officeDocument/2006/math" xmlns:v="urn:schemas-microsoft-com:vml" xmlns:wp14="http://schemas.microsoft.com/office/word/2010/wordprocessingDrawing" xmlns:wp="http://schemas.openxmlformats.org/drawingml/2006/wordprocessingDrawing" xmlns:w10="urn:schemas-microsoft-com:office:word" xmlns:w="http://schemas.openxmlformats.org/wordprocessingml/2006/main" xmlns:w14="http://schemas.microsoft.com/office/word/2010/wordml" xmlns:w15="http://schemas.microsoft.com/office/word/2012/wordml" xmlns:w16cex="http://schemas.microsoft.com/office/word/2018/wordml/cex" xmlns:w16cid="http://schemas.microsoft.com/office/word/2016/wordml/cid" xmlns:w16="http://schemas.microsoft.com/office/word/2018/wordml" xmlns:w16sdtdh="http://schemas.microsoft.com/office/word/2020/wordml/sdtdatahash" xmlns:w16se="http://schemas.microsoft.com/office/word/2015/wordml/symex" xmlns:wpg="http://schemas.microsoft.com/office/word/2010/wordprocessingGroup" xmlns:wpi="http://schemas.microsoft.com/office/word/2010/wordprocessingInk" xmlns:wne="http://schemas.microsoft.com/office/word/2006/wordml" xmlns:wps="http://schemas.microsoft.com/office/word/2010/wordprocessingShape"/>
 </file>
 
 <file path=word/endnotes.xml><?xml version="1.0" encoding="utf-8"?>

</xml_diff>